<commit_message>
Complete controlled fallback study and updated illustrated submission
</commit_message>
<xml_diff>
--- a/docs/Emergency_Vehicle_Navigation_Final_Submission.docx
+++ b/docs/Emergency_Vehicle_Navigation_Final_Submission.docx
@@ -21,7 +21,7 @@
         <w:rPr>
           <w:i/>
         </w:rPr>
-        <w:t>A simulation study of Fog, Mist, dynamic routing, and fallback</w:t>
+        <w:t>A simulation study of Fog and Mist routing with dynamic updates and fallback</w:t>
       </w:r>
     </w:p>
     <w:p>
@@ -38,7 +38,7 @@
         <w:br/>
       </w:r>
       <w:r>
-        <w:t>360 simulation runs  |  47 result graphs</w:t>
+        <w:t>360 primary runs + 90 waiting controls  |  48 result graphs</w:t>
         <w:br/>
       </w:r>
       <w:r>
@@ -131,7 +131,7 @@
         <w:pStyle w:val="ListNumber"/>
       </w:pPr>
       <w:r>
-        <w:t>While the EV drives, it requests priority at traffic lights. Dynamic routing changes the route only when a better route passes the improvement and stability rules.</w:t>
+        <w:t>While the EV drives under SUMO car-following and signal safety rules, it requests traffic-light priority within 100 m or eight seconds. The controller preserves a minimum ten-second green for traffic already being served, then clears the junction with yellow and all-red before changing priority.</w:t>
       </w:r>
     </w:p>
     <w:p>
@@ -139,7 +139,7 @@
         <w:pStyle w:val="ListNumber"/>
       </w:pPr>
       <w:r>
-        <w:t>In the Mist with Fog configuration, Mist normally computes the route. The simulated onboard unit spends an assumed 20 ms validating each recently received road message. If Mist has not finished after 800 ms, Fog takes over the route decision.</w:t>
+        <w:t>Mist normally computes the route with no added telemetry validation delay. Eight independently selected seeds receive a controlled 900 ms Mist stall in all three Mist approaches. In Mist with Fog, unfinished work after 500 ms triggers a Fog request. These are labeled fault tests, not naturally occurring failures.</w:t>
       </w:r>
     </w:p>
     <w:p>
@@ -155,7 +155,7 @@
         <w:pStyle w:val="ListNumber"/>
       </w:pPr>
       <w:r>
-        <w:t>Repeat the experiment for four configurations, three traffic levels, and 30 matched seeds: 360 runs. Calculate averages and 95% confidence intervals from the recorded results, then draw the graphs.</w:t>
+        <w:t>Repeat the four primary configurations at three traffic levels and 30 matched seeds: 360 runs. Add 90 no-preemption control runs, displayed only for traffic-light waiting. Calculate averages and 95% confidence intervals, report normal and controlled-stall results separately, and draw the graphs.</w:t>
       </w:r>
     </w:p>
     <w:p>
@@ -173,6 +173,14 @@
         <w:jc w:val="center"/>
         <w:tblLayout w:type="autofit"/>
         <w:tblLook w:firstColumn="1" w:firstRow="1" w:lastColumn="0" w:lastRow="0" w:noHBand="0" w:noVBand="1" w:val="04A0"/>
+        <w:tblBorders>
+          <w:top w:val="single" w:sz="4" w:color="D9D9D9"/>
+          <w:left w:val="single" w:sz="4" w:color="D9D9D9"/>
+          <w:bottom w:val="single" w:sz="4" w:color="D9D9D9"/>
+          <w:right w:val="single" w:sz="4" w:color="D9D9D9"/>
+          <w:insideH w:val="single" w:sz="4" w:color="D9D9D9"/>
+          <w:insideV w:val="single" w:sz="4" w:color="D9D9D9"/>
+        </w:tblBorders>
       </w:tblPr>
       <w:tblGrid>
         <w:gridCol w:w="5184"/>
@@ -358,7 +366,7 @@
               <w:rPr>
                 <w:sz w:val="16"/>
               </w:rPr>
-              <w:t>Dynamic Mist routing runs normally. If the initial Mist decision exceeds the 800 ms watchdog, Fog calculates the route instead.</w:t>
+              <w:t>Dynamic Mist routing runs normally. If the initial Mist decision exceeds the 500 ms watchdog, Fog calculates the route instead.</w:t>
             </w:r>
           </w:p>
         </w:tc>
@@ -385,6 +393,14 @@
         <w:jc w:val="center"/>
         <w:tblLayout w:type="autofit"/>
         <w:tblLook w:firstColumn="1" w:firstRow="1" w:lastColumn="0" w:lastRow="0" w:noHBand="0" w:noVBand="1" w:val="04A0"/>
+        <w:tblBorders>
+          <w:top w:val="single" w:sz="4" w:color="D9D9D9"/>
+          <w:left w:val="single" w:sz="4" w:color="D9D9D9"/>
+          <w:bottom w:val="single" w:sz="4" w:color="D9D9D9"/>
+          <w:right w:val="single" w:sz="4" w:color="D9D9D9"/>
+          <w:insideH w:val="single" w:sz="4" w:color="D9D9D9"/>
+          <w:insideV w:val="single" w:sz="4" w:color="D9D9D9"/>
+        </w:tblBorders>
       </w:tblPr>
       <w:tblGrid>
         <w:gridCol w:w="5184"/>
@@ -702,7 +718,7 @@
     </w:p>
     <w:p>
       <w:r>
-        <w:t>The accident alert reached the emergency vehicle in 332 of the 360 runs. Delivery succeeded in 24 of 30 seeds in low traffic, 29 of 30 in medium traffic, and all 30 in high traffic for each approach. These outcomes reflect this grid and its radio connections; they do not imply that heavier traffic always improves delivery.</w:t>
+        <w:t>The accident alert reached the emergency vehicle in 332 of the 360 primary runs. The delivery and timing outcomes reflect this grid, its radio connections, and its traffic trips. A higher traffic count does not guarantee a particular direction of change in every measure.</w:t>
       </w:r>
     </w:p>
     <w:p>
@@ -725,6 +741,14 @@
         <w:jc w:val="center"/>
         <w:tblLayout w:type="autofit"/>
         <w:tblLook w:firstColumn="1" w:firstRow="1" w:lastColumn="0" w:lastRow="0" w:noHBand="0" w:noVBand="1" w:val="04A0"/>
+        <w:tblBorders>
+          <w:top w:val="single" w:sz="4" w:color="D9D9D9"/>
+          <w:left w:val="single" w:sz="4" w:color="D9D9D9"/>
+          <w:bottom w:val="single" w:sz="4" w:color="D9D9D9"/>
+          <w:right w:val="single" w:sz="4" w:color="D9D9D9"/>
+          <w:insideH w:val="single" w:sz="4" w:color="D9D9D9"/>
+          <w:insideV w:val="single" w:sz="4" w:color="D9D9D9"/>
+        </w:tblBorders>
       </w:tblPr>
       <w:tblGrid>
         <w:gridCol w:w="2074"/>
@@ -958,9 +982,9 @@
               <w:rPr>
                 <w:sz w:val="16"/>
               </w:rPr>
-              <w:t>22,035</w:t>
+              <w:t>22,039</w:t>
               <w:br/>
-              <w:t>[21,706, 22,364]</w:t>
+              <w:t>[21,725, 22,354]</w:t>
               <w:br/>
               <w:t>n=24</w:t>
             </w:r>
@@ -980,9 +1004,9 @@
               <w:rPr>
                 <w:sz w:val="16"/>
               </w:rPr>
-              <w:t>22,025</w:t>
+              <w:t>22,046</w:t>
               <w:br/>
-              <w:t>[21,701, 22,350]</w:t>
+              <w:t>[21,727, 22,364]</w:t>
               <w:br/>
               <w:t>n=24</w:t>
             </w:r>
@@ -1002,9 +1026,9 @@
               <w:rPr>
                 <w:sz w:val="16"/>
               </w:rPr>
-              <w:t>22,051</w:t>
+              <w:t>22,038</w:t>
               <w:br/>
-              <w:t>[21,725, 22,378]</w:t>
+              <w:t>[21,722, 22,353]</w:t>
               <w:br/>
               <w:t>n=24</w:t>
             </w:r>
@@ -1024,9 +1048,9 @@
               <w:rPr>
                 <w:sz w:val="16"/>
               </w:rPr>
-              <w:t>22,051</w:t>
+              <w:t>22,033</w:t>
               <w:br/>
-              <w:t>[21,725, 22,378]</w:t>
+              <w:t>[21,717, 22,349]</w:t>
               <w:br/>
               <w:t>n=24</w:t>
             </w:r>
@@ -1302,9 +1326,9 @@
               <w:rPr>
                 <w:sz w:val="16"/>
               </w:rPr>
-              <w:t>625.2</w:t>
+              <w:t>588.5</w:t>
               <w:br/>
-              <w:t>[579.2, 671.1]</w:t>
+              <w:t>[412.0, 765.0]</w:t>
               <w:br/>
               <w:t>n=24</w:t>
             </w:r>
@@ -1323,9 +1347,9 @@
               <w:rPr>
                 <w:sz w:val="16"/>
               </w:rPr>
-              <w:t>625.2</w:t>
+              <w:t>588.5</w:t>
               <w:br/>
-              <w:t>[579.2, 671.1]</w:t>
+              <w:t>[412.0, 765.0]</w:t>
               <w:br/>
               <w:t>n=24</w:t>
             </w:r>
@@ -1344,9 +1368,9 @@
               <w:rPr>
                 <w:sz w:val="16"/>
               </w:rPr>
-              <w:t>625.2</w:t>
+              <w:t>472.0</w:t>
               <w:br/>
-              <w:t>[579.2, 671.1]</w:t>
+              <w:t>[373.9, 570.1]</w:t>
               <w:br/>
               <w:t>n=24</w:t>
             </w:r>
@@ -1388,9 +1412,9 @@
               <w:rPr>
                 <w:sz w:val="16"/>
               </w:rPr>
-              <w:t>141.7</w:t>
+              <w:t>153.3</w:t>
               <w:br/>
-              <w:t>[141.4, 141.9]</w:t>
+              <w:t>[152.7, 153.9]</w:t>
               <w:br/>
               <w:t>n=24</w:t>
             </w:r>
@@ -1410,9 +1434,9 @@
               <w:rPr>
                 <w:sz w:val="16"/>
               </w:rPr>
-              <w:t>141.6</w:t>
+              <w:t>153.1</w:t>
               <w:br/>
-              <w:t>[141.3, 141.9]</w:t>
+              <w:t>[152.3, 153.8]</w:t>
               <w:br/>
               <w:t>n=24</w:t>
             </w:r>
@@ -1432,9 +1456,9 @@
               <w:rPr>
                 <w:sz w:val="16"/>
               </w:rPr>
-              <w:t>141.7</w:t>
+              <w:t>152.5</w:t>
               <w:br/>
-              <w:t>[141.4, 141.9]</w:t>
+              <w:t>[151.6, 153.5]</w:t>
               <w:br/>
               <w:t>n=24</w:t>
             </w:r>
@@ -1454,9 +1478,9 @@
               <w:rPr>
                 <w:sz w:val="16"/>
               </w:rPr>
-              <w:t>141.7</w:t>
+              <w:t>152.5</w:t>
               <w:br/>
-              <w:t>[141.4, 141.9]</w:t>
+              <w:t>[151.6, 153.5]</w:t>
               <w:br/>
               <w:t>n=24</w:t>
             </w:r>
@@ -1496,9 +1520,9 @@
               <w:rPr>
                 <w:sz w:val="16"/>
               </w:rPr>
-              <w:t>0.0</w:t>
+              <w:t>1.5</w:t>
               <w:br/>
-              <w:t>[0.0, 0.0]</w:t>
+              <w:t>[1.1, 2.0]</w:t>
               <w:br/>
               <w:t>n=24</w:t>
             </w:r>
@@ -1517,9 +1541,9 @@
               <w:rPr>
                 <w:sz w:val="16"/>
               </w:rPr>
-              <w:t>0.0</w:t>
+              <w:t>1.6</w:t>
               <w:br/>
-              <w:t>[0.0, 0.0]</w:t>
+              <w:t>[1.1, 2.1]</w:t>
               <w:br/>
               <w:t>n=24</w:t>
             </w:r>
@@ -1538,9 +1562,9 @@
               <w:rPr>
                 <w:sz w:val="16"/>
               </w:rPr>
-              <w:t>0.0</w:t>
+              <w:t>2.0</w:t>
               <w:br/>
-              <w:t>[0.0, 0.0]</w:t>
+              <w:t>[1.5, 2.4]</w:t>
               <w:br/>
               <w:t>n=24</w:t>
             </w:r>
@@ -1559,9 +1583,9 @@
               <w:rPr>
                 <w:sz w:val="16"/>
               </w:rPr>
-              <w:t>0.0</w:t>
+              <w:t>2.0</w:t>
               <w:br/>
-              <w:t>[0.0, 0.0]</w:t>
+              <w:t>[1.5, 2.5]</w:t>
               <w:br/>
               <w:t>n=24</w:t>
             </w:r>
@@ -1585,6 +1609,14 @@
         <w:jc w:val="center"/>
         <w:tblLayout w:type="autofit"/>
         <w:tblLook w:firstColumn="1" w:firstRow="1" w:lastColumn="0" w:lastRow="0" w:noHBand="0" w:noVBand="1" w:val="04A0"/>
+        <w:tblBorders>
+          <w:top w:val="single" w:sz="4" w:color="D9D9D9"/>
+          <w:left w:val="single" w:sz="4" w:color="D9D9D9"/>
+          <w:bottom w:val="single" w:sz="4" w:color="D9D9D9"/>
+          <w:right w:val="single" w:sz="4" w:color="D9D9D9"/>
+          <w:insideH w:val="single" w:sz="4" w:color="D9D9D9"/>
+          <w:insideV w:val="single" w:sz="4" w:color="D9D9D9"/>
+        </w:tblBorders>
       </w:tblPr>
       <w:tblGrid>
         <w:gridCol w:w="2074"/>
@@ -1818,9 +1850,9 @@
               <w:rPr>
                 <w:sz w:val="16"/>
               </w:rPr>
-              <w:t>39,860</w:t>
+              <w:t>39,771</w:t>
               <w:br/>
-              <w:t>[39,449, 40,270]</w:t>
+              <w:t>[39,368, 40,175]</w:t>
               <w:br/>
               <w:t>n=29</w:t>
             </w:r>
@@ -1840,9 +1872,9 @@
               <w:rPr>
                 <w:sz w:val="16"/>
               </w:rPr>
-              <w:t>39,898</w:t>
+              <w:t>39,739</w:t>
               <w:br/>
-              <w:t>[39,492, 40,303]</w:t>
+              <w:t>[39,340, 40,137]</w:t>
               <w:br/>
               <w:t>n=29</w:t>
             </w:r>
@@ -1862,9 +1894,9 @@
               <w:rPr>
                 <w:sz w:val="16"/>
               </w:rPr>
-              <w:t>39,899</w:t>
+              <w:t>39,766</w:t>
               <w:br/>
-              <w:t>[39,492, 40,305]</w:t>
+              <w:t>[39,377, 40,155]</w:t>
               <w:br/>
               <w:t>n=29</w:t>
             </w:r>
@@ -1884,9 +1916,9 @@
               <w:rPr>
                 <w:sz w:val="16"/>
               </w:rPr>
-              <w:t>39,918</w:t>
+              <w:t>39,738</w:t>
               <w:br/>
-              <w:t>[39,505, 40,332]</w:t>
+              <w:t>[39,354, 40,123]</w:t>
               <w:br/>
               <w:t>n=29</w:t>
             </w:r>
@@ -2162,9 +2194,9 @@
               <w:rPr>
                 <w:sz w:val="16"/>
               </w:rPr>
-              <w:t>844.6</w:t>
+              <w:t>574.3</w:t>
               <w:br/>
-              <w:t>[773.4, 915.8]</w:t>
+              <w:t>[418.6, 730.0]</w:t>
               <w:br/>
               <w:t>n=29</w:t>
             </w:r>
@@ -2183,9 +2215,9 @@
               <w:rPr>
                 <w:sz w:val="16"/>
               </w:rPr>
-              <w:t>844.6</w:t>
+              <w:t>574.3</w:t>
               <w:br/>
-              <w:t>[773.4, 915.8]</w:t>
+              <w:t>[418.6, 730.0]</w:t>
               <w:br/>
               <w:t>n=29</w:t>
             </w:r>
@@ -2204,9 +2236,9 @@
               <w:rPr>
                 <w:sz w:val="16"/>
               </w:rPr>
-              <w:t>946.4</w:t>
+              <w:t>464.1</w:t>
               <w:br/>
-              <w:t>[855.2, 1037.5]</w:t>
+              <w:t>[377.5, 550.7]</w:t>
               <w:br/>
               <w:t>n=29</w:t>
             </w:r>
@@ -2248,9 +2280,9 @@
               <w:rPr>
                 <w:sz w:val="16"/>
               </w:rPr>
-              <w:t>141.5</w:t>
+              <w:t>154.6</w:t>
               <w:br/>
-              <w:t>[141.5, 141.6]</w:t>
+              <w:t>[153.4, 155.8]</w:t>
               <w:br/>
               <w:t>n=29</w:t>
             </w:r>
@@ -2270,9 +2302,9 @@
               <w:rPr>
                 <w:sz w:val="16"/>
               </w:rPr>
-              <w:t>141.7</w:t>
+              <w:t>155.5</w:t>
               <w:br/>
-              <w:t>[141.6, 141.7]</w:t>
+              <w:t>[152.6, 158.3]</w:t>
               <w:br/>
               <w:t>n=29</w:t>
             </w:r>
@@ -2292,9 +2324,9 @@
               <w:rPr>
                 <w:sz w:val="16"/>
               </w:rPr>
-              <w:t>141.7</w:t>
+              <w:t>154.4</w:t>
               <w:br/>
-              <w:t>[141.4, 142.0]</w:t>
+              <w:t>[151.4, 157.4]</w:t>
               <w:br/>
               <w:t>n=29</w:t>
             </w:r>
@@ -2314,9 +2346,9 @@
               <w:rPr>
                 <w:sz w:val="16"/>
               </w:rPr>
-              <w:t>141.9</w:t>
+              <w:t>154.1</w:t>
               <w:br/>
-              <w:t>[141.6, 142.2]</w:t>
+              <w:t>[151.0, 157.2]</w:t>
               <w:br/>
               <w:t>n=29</w:t>
             </w:r>
@@ -2356,9 +2388,9 @@
               <w:rPr>
                 <w:sz w:val="16"/>
               </w:rPr>
-              <w:t>0.0</w:t>
+              <w:t>0.9</w:t>
               <w:br/>
-              <w:t>[0.0, 0.0]</w:t>
+              <w:t>[0.5, 1.4]</w:t>
               <w:br/>
               <w:t>n=29</w:t>
             </w:r>
@@ -2377,9 +2409,9 @@
               <w:rPr>
                 <w:sz w:val="16"/>
               </w:rPr>
-              <w:t>0.0</w:t>
+              <w:t>1.6</w:t>
               <w:br/>
-              <w:t>[0.0, 0.0]</w:t>
+              <w:t>[0.3, 3.8]</w:t>
               <w:br/>
               <w:t>n=29</w:t>
             </w:r>
@@ -2398,9 +2430,9 @@
               <w:rPr>
                 <w:sz w:val="16"/>
               </w:rPr>
-              <w:t>0.0</w:t>
+              <w:t>1.7</w:t>
               <w:br/>
-              <w:t>[0.0, 0.0]</w:t>
+              <w:t>[0.4, 3.9]</w:t>
               <w:br/>
               <w:t>n=29</w:t>
             </w:r>
@@ -2419,9 +2451,9 @@
               <w:rPr>
                 <w:sz w:val="16"/>
               </w:rPr>
-              <w:t>0.0</w:t>
+              <w:t>1.7</w:t>
               <w:br/>
-              <w:t>[0.0, 0.0]</w:t>
+              <w:t>[0.4, 4.0]</w:t>
               <w:br/>
               <w:t>n=29</w:t>
             </w:r>
@@ -2445,6 +2477,14 @@
         <w:jc w:val="center"/>
         <w:tblLayout w:type="autofit"/>
         <w:tblLook w:firstColumn="1" w:firstRow="1" w:lastColumn="0" w:lastRow="0" w:noHBand="0" w:noVBand="1" w:val="04A0"/>
+        <w:tblBorders>
+          <w:top w:val="single" w:sz="4" w:color="D9D9D9"/>
+          <w:left w:val="single" w:sz="4" w:color="D9D9D9"/>
+          <w:bottom w:val="single" w:sz="4" w:color="D9D9D9"/>
+          <w:right w:val="single" w:sz="4" w:color="D9D9D9"/>
+          <w:insideH w:val="single" w:sz="4" w:color="D9D9D9"/>
+          <w:insideV w:val="single" w:sz="4" w:color="D9D9D9"/>
+        </w:tblBorders>
       </w:tblPr>
       <w:tblGrid>
         <w:gridCol w:w="2074"/>
@@ -2678,9 +2718,9 @@
               <w:rPr>
                 <w:sz w:val="16"/>
               </w:rPr>
-              <w:t>54,479</w:t>
+              <w:t>54,379</w:t>
               <w:br/>
-              <w:t>[53,976, 54,982]</w:t>
+              <w:t>[53,910, 54,848]</w:t>
               <w:br/>
               <w:t>n=30</w:t>
             </w:r>
@@ -2700,9 +2740,9 @@
               <w:rPr>
                 <w:sz w:val="16"/>
               </w:rPr>
-              <w:t>54,432</w:t>
+              <w:t>54,257</w:t>
               <w:br/>
-              <w:t>[53,978, 54,887]</w:t>
+              <w:t>[53,783, 54,731]</w:t>
               <w:br/>
               <w:t>n=30</w:t>
             </w:r>
@@ -2722,9 +2762,9 @@
               <w:rPr>
                 <w:sz w:val="16"/>
               </w:rPr>
-              <w:t>54,453</w:t>
+              <w:t>54,211</w:t>
               <w:br/>
-              <w:t>[53,986, 54,921]</w:t>
+              <w:t>[53,730, 54,691]</w:t>
               <w:br/>
               <w:t>n=30</w:t>
             </w:r>
@@ -2744,9 +2784,9 @@
               <w:rPr>
                 <w:sz w:val="16"/>
               </w:rPr>
-              <w:t>54,463</w:t>
+              <w:t>54,257</w:t>
               <w:br/>
-              <w:t>[54,004, 54,921]</w:t>
+              <w:t>[53,754, 54,760]</w:t>
               <w:br/>
               <w:t>n=30</w:t>
             </w:r>
@@ -3022,9 +3062,9 @@
               <w:rPr>
                 <w:sz w:val="16"/>
               </w:rPr>
-              <w:t>1075.3</w:t>
+              <w:t>566.0</w:t>
               <w:br/>
-              <w:t>[995.2, 1155.5]</w:t>
+              <w:t>[414.8, 717.2]</w:t>
               <w:br/>
               <w:t>n=30</w:t>
             </w:r>
@@ -3043,9 +3083,9 @@
               <w:rPr>
                 <w:sz w:val="16"/>
               </w:rPr>
-              <w:t>1075.3</w:t>
+              <w:t>566.0</w:t>
               <w:br/>
-              <w:t>[995.2, 1155.5]</w:t>
+              <w:t>[414.8, 717.2]</w:t>
               <w:br/>
               <w:t>n=30</w:t>
             </w:r>
@@ -3064,9 +3104,9 @@
               <w:rPr>
                 <w:sz w:val="16"/>
               </w:rPr>
-              <w:t>1087.2</w:t>
+              <w:t>459.5</w:t>
               <w:br/>
-              <w:t>[1042.0, 1132.5]</w:t>
+              <w:t>[375.4, 543.6]</w:t>
               <w:br/>
               <w:t>n=30</w:t>
             </w:r>
@@ -3108,9 +3148,9 @@
               <w:rPr>
                 <w:sz w:val="16"/>
               </w:rPr>
-              <w:t>142.5</w:t>
+              <w:t>156.3</w:t>
               <w:br/>
-              <w:t>[141.6, 143.5]</w:t>
+              <w:t>[154.4, 158.2]</w:t>
               <w:br/>
               <w:t>n=30</w:t>
             </w:r>
@@ -3130,9 +3170,9 @@
               <w:rPr>
                 <w:sz w:val="16"/>
               </w:rPr>
-              <w:t>142.7</w:t>
+              <w:t>157.0</w:t>
               <w:br/>
-              <w:t>[141.8, 143.6]</w:t>
+              <w:t>[154.8, 159.2]</w:t>
               <w:br/>
               <w:t>n=30</w:t>
             </w:r>
@@ -3152,9 +3192,9 @@
               <w:rPr>
                 <w:sz w:val="16"/>
               </w:rPr>
-              <w:t>142.7</w:t>
+              <w:t>154.4</w:t>
               <w:br/>
-              <w:t>[141.8, 143.6]</w:t>
+              <w:t>[152.1, 156.7]</w:t>
               <w:br/>
               <w:t>n=30</w:t>
             </w:r>
@@ -3174,9 +3214,9 @@
               <w:rPr>
                 <w:sz w:val="16"/>
               </w:rPr>
-              <w:t>142.8</w:t>
+              <w:t>154.3</w:t>
               <w:br/>
-              <w:t>[141.9, 143.7]</w:t>
+              <w:t>[152.1, 156.6]</w:t>
               <w:br/>
               <w:t>n=30</w:t>
             </w:r>
@@ -3216,9 +3256,9 @@
               <w:rPr>
                 <w:sz w:val="16"/>
               </w:rPr>
-              <w:t>0.0</w:t>
+              <w:t>0.7</w:t>
               <w:br/>
-              <w:t>[0.0, 0.0]</w:t>
+              <w:t>[0.3, 1.0]</w:t>
               <w:br/>
               <w:t>n=30</w:t>
             </w:r>
@@ -3237,9 +3277,9 @@
               <w:rPr>
                 <w:sz w:val="16"/>
               </w:rPr>
-              <w:t>0.0</w:t>
+              <w:t>0.6</w:t>
               <w:br/>
-              <w:t>[0.0, 0.0]</w:t>
+              <w:t>[0.3, 1.0]</w:t>
               <w:br/>
               <w:t>n=30</w:t>
             </w:r>
@@ -3258,9 +3298,9 @@
               <w:rPr>
                 <w:sz w:val="16"/>
               </w:rPr>
-              <w:t>0.1</w:t>
+              <w:t>0.7</w:t>
               <w:br/>
-              <w:t>[0.0, 0.4]</w:t>
+              <w:t>[0.3, 1.0]</w:t>
               <w:br/>
               <w:t>n=30</w:t>
             </w:r>
@@ -3279,9 +3319,9 @@
               <w:rPr>
                 <w:sz w:val="16"/>
               </w:rPr>
-              <w:t>0.1</w:t>
+              <w:t>0.6</w:t>
               <w:br/>
-              <w:t>[0.0, 0.4]</w:t>
+              <w:t>[0.3, 0.9]</w:t>
               <w:br/>
               <w:t>n=30</w:t>
             </w:r>
@@ -3300,19 +3340,2302 @@
     </w:p>
     <w:p>
       <w:r>
-        <w:t>Message delivery and end-to-end delay are the same across the four approaches at each traffic level because the alert travels through the same network before the route calculation starts. Average end-to-end delay is 44.36 ms in low traffic, 37.12 ms in medium traffic, and 32.17 ms in high traffic for delivered alerts.</w:t>
+        <w:t>The alert is delivered before the EV calculates its route. PDR and EM end-to-end delay therefore measure the same radio event in every routing approach. EM throughput is calculated from those same deliveries and a fixed payload, so it also can match across approaches. These values should change with density when the number of successful deliveries changes; they do not have to change just because the route calculator is different.</w:t>
+      </w:r>
+    </w:p>
+    <w:p>
+      <w:pPr>
+        <w:pStyle w:val="Heading2"/>
+      </w:pPr>
+      <w:r>
+        <w:t>How the measured results change with traffic density</w:t>
+      </w:r>
+    </w:p>
+    <w:tbl>
+      <w:tblPr>
+        <w:tblStyle w:val="TableGrid"/>
+        <w:tblW w:type="auto" w:w="0"/>
+        <w:jc w:val="center"/>
+        <w:tblLayout w:type="autofit"/>
+        <w:tblLook w:firstColumn="1" w:firstRow="1" w:lastColumn="0" w:lastRow="0" w:noHBand="0" w:noVBand="1" w:val="04A0"/>
+        <w:tblBorders>
+          <w:top w:val="single" w:sz="4" w:color="D9D9D9"/>
+          <w:left w:val="single" w:sz="4" w:color="D9D9D9"/>
+          <w:bottom w:val="single" w:sz="4" w:color="D9D9D9"/>
+          <w:right w:val="single" w:sz="4" w:color="D9D9D9"/>
+          <w:insideH w:val="single" w:sz="4" w:color="D9D9D9"/>
+          <w:insideV w:val="single" w:sz="4" w:color="D9D9D9"/>
+        </w:tblBorders>
+      </w:tblPr>
+      <w:tblGrid>
+        <w:gridCol w:w="1481"/>
+        <w:gridCol w:w="1481"/>
+        <w:gridCol w:w="1481"/>
+        <w:gridCol w:w="1481"/>
+        <w:gridCol w:w="1481"/>
+        <w:gridCol w:w="1481"/>
+        <w:gridCol w:w="1481"/>
+      </w:tblGrid>
+      <w:tr>
+        <w:trPr>
+          <w:tblHeader w:val="true"/>
+        </w:trPr>
+        <w:tc>
+          <w:tcPr>
+            <w:tcW w:type="dxa" w:w="1481"/>
+            <w:shd w:fill="1F3957"/>
+          </w:tcPr>
+          <w:p>
+            <w:r>
+              <w:rPr>
+                <w:b/>
+                <w:color w:val="FFFFFF"/>
+                <w:sz w:val="16"/>
+              </w:rPr>
+              <w:t>Traffic</w:t>
+            </w:r>
+          </w:p>
+        </w:tc>
+        <w:tc>
+          <w:tcPr>
+            <w:tcW w:type="dxa" w:w="1481"/>
+            <w:shd w:fill="1F3957"/>
+          </w:tcPr>
+          <w:p>
+            <w:r>
+              <w:rPr>
+                <w:b/>
+                <w:color w:val="FFFFFF"/>
+                <w:sz w:val="16"/>
+              </w:rPr>
+              <w:t>Trips</w:t>
+            </w:r>
+          </w:p>
+        </w:tc>
+        <w:tc>
+          <w:tcPr>
+            <w:tcW w:type="dxa" w:w="1481"/>
+            <w:shd w:fill="1F3957"/>
+          </w:tcPr>
+          <w:p>
+            <w:r>
+              <w:rPr>
+                <w:b/>
+                <w:color w:val="FFFFFF"/>
+                <w:sz w:val="16"/>
+              </w:rPr>
+              <w:t>Mean peak vehicles</w:t>
+            </w:r>
+          </w:p>
+        </w:tc>
+        <w:tc>
+          <w:tcPr>
+            <w:tcW w:type="dxa" w:w="1481"/>
+            <w:shd w:fill="1F3957"/>
+          </w:tcPr>
+          <w:p>
+            <w:r>
+              <w:rPr>
+                <w:b/>
+                <w:color w:val="FFFFFF"/>
+                <w:sz w:val="16"/>
+              </w:rPr>
+              <w:t>PDR</w:t>
+            </w:r>
+          </w:p>
+        </w:tc>
+        <w:tc>
+          <w:tcPr>
+            <w:tcW w:type="dxa" w:w="1481"/>
+            <w:shd w:fill="1F3957"/>
+          </w:tcPr>
+          <w:p>
+            <w:r>
+              <w:rPr>
+                <w:b/>
+                <w:color w:val="FFFFFF"/>
+                <w:sz w:val="16"/>
+              </w:rPr>
+              <w:t>EM throughput (bit/s)</w:t>
+            </w:r>
+          </w:p>
+        </w:tc>
+        <w:tc>
+          <w:tcPr>
+            <w:tcW w:type="dxa" w:w="1481"/>
+            <w:shd w:fill="1F3957"/>
+          </w:tcPr>
+          <w:p>
+            <w:r>
+              <w:rPr>
+                <w:b/>
+                <w:color w:val="FFFFFF"/>
+                <w:sz w:val="16"/>
+              </w:rPr>
+              <w:t>Mean NRL</w:t>
+            </w:r>
+          </w:p>
+        </w:tc>
+        <w:tc>
+          <w:tcPr>
+            <w:tcW w:type="dxa" w:w="1481"/>
+            <w:shd w:fill="1F3957"/>
+          </w:tcPr>
+          <w:p>
+            <w:r>
+              <w:rPr>
+                <w:b/>
+                <w:color w:val="FFFFFF"/>
+                <w:sz w:val="16"/>
+              </w:rPr>
+              <w:t>Dynamic Mist response (s)</w:t>
+            </w:r>
+          </w:p>
+        </w:tc>
+      </w:tr>
+      <w:tr>
+        <w:tc>
+          <w:tcPr>
+            <w:tcW w:type="dxa" w:w="1481"/>
+            <w:vAlign w:val="center"/>
+          </w:tcPr>
+          <w:p>
+            <w:pPr>
+              <w:spacing w:after="0"/>
+            </w:pPr>
+            <w:r>
+              <w:rPr>
+                <w:sz w:val="16"/>
+              </w:rPr>
+              <w:t>Low</w:t>
+            </w:r>
+          </w:p>
+        </w:tc>
+        <w:tc>
+          <w:tcPr>
+            <w:tcW w:type="dxa" w:w="1481"/>
+            <w:vAlign w:val="center"/>
+          </w:tcPr>
+          <w:p>
+            <w:pPr>
+              <w:spacing w:after="0"/>
+            </w:pPr>
+            <w:r>
+              <w:rPr>
+                <w:sz w:val="16"/>
+              </w:rPr>
+              <w:t>72</w:t>
+            </w:r>
+          </w:p>
+        </w:tc>
+        <w:tc>
+          <w:tcPr>
+            <w:tcW w:type="dxa" w:w="1481"/>
+            <w:vAlign w:val="center"/>
+          </w:tcPr>
+          <w:p>
+            <w:pPr>
+              <w:spacing w:after="0"/>
+            </w:pPr>
+            <w:r>
+              <w:rPr>
+                <w:sz w:val="16"/>
+              </w:rPr>
+              <w:t>33.2</w:t>
+            </w:r>
+          </w:p>
+        </w:tc>
+        <w:tc>
+          <w:tcPr>
+            <w:tcW w:type="dxa" w:w="1481"/>
+            <w:vAlign w:val="center"/>
+          </w:tcPr>
+          <w:p>
+            <w:pPr>
+              <w:spacing w:after="0"/>
+            </w:pPr>
+            <w:r>
+              <w:rPr>
+                <w:sz w:val="16"/>
+              </w:rPr>
+              <w:t>0.800</w:t>
+            </w:r>
+          </w:p>
+        </w:tc>
+        <w:tc>
+          <w:tcPr>
+            <w:tcW w:type="dxa" w:w="1481"/>
+            <w:vAlign w:val="center"/>
+          </w:tcPr>
+          <w:p>
+            <w:pPr>
+              <w:spacing w:after="0"/>
+            </w:pPr>
+            <w:r>
+              <w:rPr>
+                <w:sz w:val="16"/>
+              </w:rPr>
+              <w:t>1.820</w:t>
+            </w:r>
+          </w:p>
+        </w:tc>
+        <w:tc>
+          <w:tcPr>
+            <w:tcW w:type="dxa" w:w="1481"/>
+            <w:vAlign w:val="center"/>
+          </w:tcPr>
+          <w:p>
+            <w:pPr>
+              <w:spacing w:after="0"/>
+            </w:pPr>
+            <w:r>
+              <w:rPr>
+                <w:sz w:val="16"/>
+              </w:rPr>
+              <w:t>22,039</w:t>
+            </w:r>
+          </w:p>
+        </w:tc>
+        <w:tc>
+          <w:tcPr>
+            <w:tcW w:type="dxa" w:w="1481"/>
+            <w:vAlign w:val="center"/>
+          </w:tcPr>
+          <w:p>
+            <w:pPr>
+              <w:spacing w:after="0"/>
+            </w:pPr>
+            <w:r>
+              <w:rPr>
+                <w:sz w:val="16"/>
+              </w:rPr>
+              <w:t>152.52</w:t>
+            </w:r>
+          </w:p>
+        </w:tc>
+      </w:tr>
+      <w:tr>
+        <w:tc>
+          <w:tcPr>
+            <w:tcW w:type="dxa" w:w="1481"/>
+            <w:vAlign w:val="center"/>
+            <w:shd w:fill="F2F6FA"/>
+          </w:tcPr>
+          <w:p>
+            <w:pPr>
+              <w:spacing w:after="0"/>
+            </w:pPr>
+            <w:r>
+              <w:rPr>
+                <w:sz w:val="16"/>
+              </w:rPr>
+              <w:t>Medium</w:t>
+            </w:r>
+          </w:p>
+        </w:tc>
+        <w:tc>
+          <w:tcPr>
+            <w:tcW w:type="dxa" w:w="1481"/>
+            <w:vAlign w:val="center"/>
+            <w:shd w:fill="F2F6FA"/>
+          </w:tcPr>
+          <w:p>
+            <w:pPr>
+              <w:spacing w:after="0"/>
+            </w:pPr>
+            <w:r>
+              <w:rPr>
+                <w:sz w:val="16"/>
+              </w:rPr>
+              <w:t>144</w:t>
+            </w:r>
+          </w:p>
+        </w:tc>
+        <w:tc>
+          <w:tcPr>
+            <w:tcW w:type="dxa" w:w="1481"/>
+            <w:vAlign w:val="center"/>
+            <w:shd w:fill="F2F6FA"/>
+          </w:tcPr>
+          <w:p>
+            <w:pPr>
+              <w:spacing w:after="0"/>
+            </w:pPr>
+            <w:r>
+              <w:rPr>
+                <w:sz w:val="16"/>
+              </w:rPr>
+              <w:t>66.4</w:t>
+            </w:r>
+          </w:p>
+        </w:tc>
+        <w:tc>
+          <w:tcPr>
+            <w:tcW w:type="dxa" w:w="1481"/>
+            <w:vAlign w:val="center"/>
+            <w:shd w:fill="F2F6FA"/>
+          </w:tcPr>
+          <w:p>
+            <w:pPr>
+              <w:spacing w:after="0"/>
+            </w:pPr>
+            <w:r>
+              <w:rPr>
+                <w:sz w:val="16"/>
+              </w:rPr>
+              <w:t>0.967</w:t>
+            </w:r>
+          </w:p>
+        </w:tc>
+        <w:tc>
+          <w:tcPr>
+            <w:tcW w:type="dxa" w:w="1481"/>
+            <w:vAlign w:val="center"/>
+            <w:shd w:fill="F2F6FA"/>
+          </w:tcPr>
+          <w:p>
+            <w:pPr>
+              <w:spacing w:after="0"/>
+            </w:pPr>
+            <w:r>
+              <w:rPr>
+                <w:sz w:val="16"/>
+              </w:rPr>
+              <w:t>2.200</w:t>
+            </w:r>
+          </w:p>
+        </w:tc>
+        <w:tc>
+          <w:tcPr>
+            <w:tcW w:type="dxa" w:w="1481"/>
+            <w:vAlign w:val="center"/>
+            <w:shd w:fill="F2F6FA"/>
+          </w:tcPr>
+          <w:p>
+            <w:pPr>
+              <w:spacing w:after="0"/>
+            </w:pPr>
+            <w:r>
+              <w:rPr>
+                <w:sz w:val="16"/>
+              </w:rPr>
+              <w:t>39,754</w:t>
+            </w:r>
+          </w:p>
+        </w:tc>
+        <w:tc>
+          <w:tcPr>
+            <w:tcW w:type="dxa" w:w="1481"/>
+            <w:vAlign w:val="center"/>
+            <w:shd w:fill="F2F6FA"/>
+          </w:tcPr>
+          <w:p>
+            <w:pPr>
+              <w:spacing w:after="0"/>
+            </w:pPr>
+            <w:r>
+              <w:rPr>
+                <w:sz w:val="16"/>
+              </w:rPr>
+              <w:t>154.40</w:t>
+            </w:r>
+          </w:p>
+        </w:tc>
+      </w:tr>
+      <w:tr>
+        <w:tc>
+          <w:tcPr>
+            <w:tcW w:type="dxa" w:w="1481"/>
+            <w:vAlign w:val="center"/>
+          </w:tcPr>
+          <w:p>
+            <w:pPr>
+              <w:spacing w:after="0"/>
+            </w:pPr>
+            <w:r>
+              <w:rPr>
+                <w:sz w:val="16"/>
+              </w:rPr>
+              <w:t>High</w:t>
+            </w:r>
+          </w:p>
+        </w:tc>
+        <w:tc>
+          <w:tcPr>
+            <w:tcW w:type="dxa" w:w="1481"/>
+            <w:vAlign w:val="center"/>
+          </w:tcPr>
+          <w:p>
+            <w:pPr>
+              <w:spacing w:after="0"/>
+            </w:pPr>
+            <w:r>
+              <w:rPr>
+                <w:sz w:val="16"/>
+              </w:rPr>
+              <w:t>200</w:t>
+            </w:r>
+          </w:p>
+        </w:tc>
+        <w:tc>
+          <w:tcPr>
+            <w:tcW w:type="dxa" w:w="1481"/>
+            <w:vAlign w:val="center"/>
+          </w:tcPr>
+          <w:p>
+            <w:pPr>
+              <w:spacing w:after="0"/>
+            </w:pPr>
+            <w:r>
+              <w:rPr>
+                <w:sz w:val="16"/>
+              </w:rPr>
+              <w:t>93.1</w:t>
+            </w:r>
+          </w:p>
+        </w:tc>
+        <w:tc>
+          <w:tcPr>
+            <w:tcW w:type="dxa" w:w="1481"/>
+            <w:vAlign w:val="center"/>
+          </w:tcPr>
+          <w:p>
+            <w:pPr>
+              <w:spacing w:after="0"/>
+            </w:pPr>
+            <w:r>
+              <w:rPr>
+                <w:sz w:val="16"/>
+              </w:rPr>
+              <w:t>1.000</w:t>
+            </w:r>
+          </w:p>
+        </w:tc>
+        <w:tc>
+          <w:tcPr>
+            <w:tcW w:type="dxa" w:w="1481"/>
+            <w:vAlign w:val="center"/>
+          </w:tcPr>
+          <w:p>
+            <w:pPr>
+              <w:spacing w:after="0"/>
+            </w:pPr>
+            <w:r>
+              <w:rPr>
+                <w:sz w:val="16"/>
+              </w:rPr>
+              <w:t>2.276</w:t>
+            </w:r>
+          </w:p>
+        </w:tc>
+        <w:tc>
+          <w:tcPr>
+            <w:tcW w:type="dxa" w:w="1481"/>
+            <w:vAlign w:val="center"/>
+          </w:tcPr>
+          <w:p>
+            <w:pPr>
+              <w:spacing w:after="0"/>
+            </w:pPr>
+            <w:r>
+              <w:rPr>
+                <w:sz w:val="16"/>
+              </w:rPr>
+              <w:t>54,276</w:t>
+            </w:r>
+          </w:p>
+        </w:tc>
+        <w:tc>
+          <w:tcPr>
+            <w:tcW w:type="dxa" w:w="1481"/>
+            <w:vAlign w:val="center"/>
+          </w:tcPr>
+          <w:p>
+            <w:pPr>
+              <w:spacing w:after="0"/>
+            </w:pPr>
+            <w:r>
+              <w:rPr>
+                <w:sz w:val="16"/>
+              </w:rPr>
+              <w:t>154.38</w:t>
+            </w:r>
+          </w:p>
+        </w:tc>
+      </w:tr>
+    </w:tbl>
+    <w:p/>
+    <w:p>
+      <w:r>
+        <w:t>This shows real density effects: generated demand rises from 72 to 200 trips, PDR from 0.800 to 1.000, throughput from 1.820 to 2.276 bit/s, and the mean number of active background vehicles rises from about 33 to 93. Throughput is similar across routing approaches within each density because their alert delivery counts match; it is not constant across all three densities.</w:t>
+      </w:r>
+    </w:p>
+    <w:p>
+      <w:pPr>
+        <w:pStyle w:val="Heading2"/>
+      </w:pPr>
+      <w:r>
+        <w:t>What changes between routing approaches</w:t>
+      </w:r>
+    </w:p>
+    <w:tbl>
+      <w:tblPr>
+        <w:tblStyle w:val="TableGrid"/>
+        <w:tblW w:type="auto" w:w="0"/>
+        <w:jc w:val="center"/>
+        <w:tblLayout w:type="autofit"/>
+        <w:tblLook w:firstColumn="1" w:firstRow="1" w:lastColumn="0" w:lastRow="0" w:noHBand="0" w:noVBand="1" w:val="04A0"/>
+        <w:tblBorders>
+          <w:top w:val="single" w:sz="4" w:color="D9D9D9"/>
+          <w:left w:val="single" w:sz="4" w:color="D9D9D9"/>
+          <w:bottom w:val="single" w:sz="4" w:color="D9D9D9"/>
+          <w:right w:val="single" w:sz="4" w:color="D9D9D9"/>
+          <w:insideH w:val="single" w:sz="4" w:color="D9D9D9"/>
+          <w:insideV w:val="single" w:sz="4" w:color="D9D9D9"/>
+        </w:tblBorders>
+      </w:tblPr>
+      <w:tblGrid>
+        <w:gridCol w:w="2074"/>
+        <w:gridCol w:w="2074"/>
+        <w:gridCol w:w="2074"/>
+        <w:gridCol w:w="2074"/>
+        <w:gridCol w:w="2074"/>
+      </w:tblGrid>
+      <w:tr>
+        <w:trPr>
+          <w:tblHeader w:val="true"/>
+        </w:trPr>
+        <w:tc>
+          <w:tcPr>
+            <w:tcW w:type="dxa" w:w="2074"/>
+            <w:shd w:fill="1F3957"/>
+          </w:tcPr>
+          <w:p>
+            <w:r>
+              <w:rPr>
+                <w:b/>
+                <w:color w:val="FFFFFF"/>
+                <w:sz w:val="16"/>
+              </w:rPr>
+              <w:t>Traffic</w:t>
+            </w:r>
+          </w:p>
+        </w:tc>
+        <w:tc>
+          <w:tcPr>
+            <w:tcW w:type="dxa" w:w="2074"/>
+            <w:shd w:fill="1F3957"/>
+          </w:tcPr>
+          <w:p>
+            <w:r>
+              <w:rPr>
+                <w:b/>
+                <w:color w:val="FFFFFF"/>
+                <w:sz w:val="16"/>
+              </w:rPr>
+              <w:t>Mist A* response (s)</w:t>
+            </w:r>
+          </w:p>
+        </w:tc>
+        <w:tc>
+          <w:tcPr>
+            <w:tcW w:type="dxa" w:w="2074"/>
+            <w:shd w:fill="1F3957"/>
+          </w:tcPr>
+          <w:p>
+            <w:r>
+              <w:rPr>
+                <w:b/>
+                <w:color w:val="FFFFFF"/>
+                <w:sz w:val="16"/>
+              </w:rPr>
+              <w:t>Dynamic Mist response (s)</w:t>
+            </w:r>
+          </w:p>
+        </w:tc>
+        <w:tc>
+          <w:tcPr>
+            <w:tcW w:type="dxa" w:w="2074"/>
+            <w:shd w:fill="1F3957"/>
+          </w:tcPr>
+          <w:p>
+            <w:r>
+              <w:rPr>
+                <w:b/>
+                <w:color w:val="FFFFFF"/>
+                <w:sz w:val="16"/>
+              </w:rPr>
+              <w:t>Dynamic Mist + Fog response (s)</w:t>
+            </w:r>
+          </w:p>
+        </w:tc>
+        <w:tc>
+          <w:tcPr>
+            <w:tcW w:type="dxa" w:w="2074"/>
+            <w:shd w:fill="1F3957"/>
+          </w:tcPr>
+          <w:p>
+            <w:r>
+              <w:rPr>
+                <w:b/>
+                <w:color w:val="FFFFFF"/>
+                <w:sz w:val="16"/>
+              </w:rPr>
+              <w:t>Dynamic Mist route changes</w:t>
+            </w:r>
+          </w:p>
+        </w:tc>
+      </w:tr>
+      <w:tr>
+        <w:tc>
+          <w:tcPr>
+            <w:tcW w:type="dxa" w:w="2074"/>
+            <w:vAlign w:val="center"/>
+          </w:tcPr>
+          <w:p>
+            <w:pPr>
+              <w:spacing w:after="0"/>
+            </w:pPr>
+            <w:r>
+              <w:rPr>
+                <w:sz w:val="16"/>
+              </w:rPr>
+              <w:t>Low</w:t>
+            </w:r>
+          </w:p>
+        </w:tc>
+        <w:tc>
+          <w:tcPr>
+            <w:tcW w:type="dxa" w:w="2074"/>
+            <w:vAlign w:val="center"/>
+          </w:tcPr>
+          <w:p>
+            <w:pPr>
+              <w:spacing w:after="0"/>
+            </w:pPr>
+            <w:r>
+              <w:rPr>
+                <w:sz w:val="16"/>
+              </w:rPr>
+              <w:t>153.06</w:t>
+            </w:r>
+          </w:p>
+        </w:tc>
+        <w:tc>
+          <w:tcPr>
+            <w:tcW w:type="dxa" w:w="2074"/>
+            <w:vAlign w:val="center"/>
+          </w:tcPr>
+          <w:p>
+            <w:pPr>
+              <w:spacing w:after="0"/>
+            </w:pPr>
+            <w:r>
+              <w:rPr>
+                <w:sz w:val="16"/>
+              </w:rPr>
+              <w:t>152.52</w:t>
+            </w:r>
+          </w:p>
+        </w:tc>
+        <w:tc>
+          <w:tcPr>
+            <w:tcW w:type="dxa" w:w="2074"/>
+            <w:vAlign w:val="center"/>
+          </w:tcPr>
+          <w:p>
+            <w:pPr>
+              <w:spacing w:after="0"/>
+            </w:pPr>
+            <w:r>
+              <w:rPr>
+                <w:sz w:val="16"/>
+              </w:rPr>
+              <w:t>152.54</w:t>
+            </w:r>
+          </w:p>
+        </w:tc>
+        <w:tc>
+          <w:tcPr>
+            <w:tcW w:type="dxa" w:w="2074"/>
+            <w:vAlign w:val="center"/>
+          </w:tcPr>
+          <w:p>
+            <w:pPr>
+              <w:spacing w:after="0"/>
+            </w:pPr>
+            <w:r>
+              <w:rPr>
+                <w:sz w:val="16"/>
+              </w:rPr>
+              <w:t>4</w:t>
+            </w:r>
+          </w:p>
+        </w:tc>
+      </w:tr>
+      <w:tr>
+        <w:tc>
+          <w:tcPr>
+            <w:tcW w:type="dxa" w:w="2074"/>
+            <w:vAlign w:val="center"/>
+            <w:shd w:fill="F2F6FA"/>
+          </w:tcPr>
+          <w:p>
+            <w:pPr>
+              <w:spacing w:after="0"/>
+            </w:pPr>
+            <w:r>
+              <w:rPr>
+                <w:sz w:val="16"/>
+              </w:rPr>
+              <w:t>Medium</w:t>
+            </w:r>
+          </w:p>
+        </w:tc>
+        <w:tc>
+          <w:tcPr>
+            <w:tcW w:type="dxa" w:w="2074"/>
+            <w:vAlign w:val="center"/>
+            <w:shd w:fill="F2F6FA"/>
+          </w:tcPr>
+          <w:p>
+            <w:pPr>
+              <w:spacing w:after="0"/>
+            </w:pPr>
+            <w:r>
+              <w:rPr>
+                <w:sz w:val="16"/>
+              </w:rPr>
+              <w:t>155.48</w:t>
+            </w:r>
+          </w:p>
+        </w:tc>
+        <w:tc>
+          <w:tcPr>
+            <w:tcW w:type="dxa" w:w="2074"/>
+            <w:vAlign w:val="center"/>
+            <w:shd w:fill="F2F6FA"/>
+          </w:tcPr>
+          <w:p>
+            <w:pPr>
+              <w:spacing w:after="0"/>
+            </w:pPr>
+            <w:r>
+              <w:rPr>
+                <w:sz w:val="16"/>
+              </w:rPr>
+              <w:t>154.40</w:t>
+            </w:r>
+          </w:p>
+        </w:tc>
+        <w:tc>
+          <w:tcPr>
+            <w:tcW w:type="dxa" w:w="2074"/>
+            <w:vAlign w:val="center"/>
+            <w:shd w:fill="F2F6FA"/>
+          </w:tcPr>
+          <w:p>
+            <w:pPr>
+              <w:spacing w:after="0"/>
+            </w:pPr>
+            <w:r>
+              <w:rPr>
+                <w:sz w:val="16"/>
+              </w:rPr>
+              <w:t>154.14</w:t>
+            </w:r>
+          </w:p>
+        </w:tc>
+        <w:tc>
+          <w:tcPr>
+            <w:tcW w:type="dxa" w:w="2074"/>
+            <w:vAlign w:val="center"/>
+            <w:shd w:fill="F2F6FA"/>
+          </w:tcPr>
+          <w:p>
+            <w:pPr>
+              <w:spacing w:after="0"/>
+            </w:pPr>
+            <w:r>
+              <w:rPr>
+                <w:sz w:val="16"/>
+              </w:rPr>
+              <w:t>7</w:t>
+            </w:r>
+          </w:p>
+        </w:tc>
+      </w:tr>
+      <w:tr>
+        <w:tc>
+          <w:tcPr>
+            <w:tcW w:type="dxa" w:w="2074"/>
+            <w:vAlign w:val="center"/>
+          </w:tcPr>
+          <w:p>
+            <w:pPr>
+              <w:spacing w:after="0"/>
+            </w:pPr>
+            <w:r>
+              <w:rPr>
+                <w:sz w:val="16"/>
+              </w:rPr>
+              <w:t>High</w:t>
+            </w:r>
+          </w:p>
+        </w:tc>
+        <w:tc>
+          <w:tcPr>
+            <w:tcW w:type="dxa" w:w="2074"/>
+            <w:vAlign w:val="center"/>
+          </w:tcPr>
+          <w:p>
+            <w:pPr>
+              <w:spacing w:after="0"/>
+            </w:pPr>
+            <w:r>
+              <w:rPr>
+                <w:sz w:val="16"/>
+              </w:rPr>
+              <w:t>156.98</w:t>
+            </w:r>
+          </w:p>
+        </w:tc>
+        <w:tc>
+          <w:tcPr>
+            <w:tcW w:type="dxa" w:w="2074"/>
+            <w:vAlign w:val="center"/>
+          </w:tcPr>
+          <w:p>
+            <w:pPr>
+              <w:spacing w:after="0"/>
+            </w:pPr>
+            <w:r>
+              <w:rPr>
+                <w:sz w:val="16"/>
+              </w:rPr>
+              <w:t>154.38</w:t>
+            </w:r>
+          </w:p>
+        </w:tc>
+        <w:tc>
+          <w:tcPr>
+            <w:tcW w:type="dxa" w:w="2074"/>
+            <w:vAlign w:val="center"/>
+          </w:tcPr>
+          <w:p>
+            <w:pPr>
+              <w:spacing w:after="0"/>
+            </w:pPr>
+            <w:r>
+              <w:rPr>
+                <w:sz w:val="16"/>
+              </w:rPr>
+              <w:t>154.35</w:t>
+            </w:r>
+          </w:p>
+        </w:tc>
+        <w:tc>
+          <w:tcPr>
+            <w:tcW w:type="dxa" w:w="2074"/>
+            <w:vAlign w:val="center"/>
+          </w:tcPr>
+          <w:p>
+            <w:pPr>
+              <w:spacing w:after="0"/>
+            </w:pPr>
+            <w:r>
+              <w:rPr>
+                <w:sz w:val="16"/>
+              </w:rPr>
+              <w:t>10</w:t>
+            </w:r>
+          </w:p>
+        </w:tc>
+      </w:tr>
+    </w:tbl>
+    <w:p/>
+    <w:p>
+      <w:r>
+        <w:t>Mist A* and Dynamic Mist can have the same initial decision latency because both use the same Mist A* calculation. Dynamic Mist then reviews live road costs every five seconds; the logs show applied route changes in the table. The response-time means differ, but their confidence intervals overlap in several comparisons, so small mean differences alone do not establish that one approach is generally faster.</w:t>
       </w:r>
     </w:p>
     <w:p>
       <w:r>
-        <w:t>The clearest difference between approaches is the first route decision. Fog/Cloud averages about 626.54 ms at every traffic level. Mist averages 625.17 ms in low traffic, 844.62 ms in medium traffic, and 1075.33 ms in high traffic. Mist with Fog fallback averages 946.38 ms in medium traffic and 1087.24 ms in high traffic because the Fog takeover adds time in runs that exceed the watchdog.</w:t>
+        <w:t>In low traffic, the four average EV response times range from 152.52 to 153.29 seconds. Read the intervals alongside these averages; a small difference alone does not prove a general advantage.</w:t>
       </w:r>
     </w:p>
     <w:p>
       <w:r>
-        <w:t>The emergency vehicle's average response time stays near 142 seconds in this network. Measured traffic-light waiting is zero in low and medium traffic. In high traffic, the two dynamic approaches average 0.13 seconds of waiting. These small differences should be read alongside the confidence intervals.</w:t>
+        <w:t>In medium traffic, the four average EV response times range from 154.14 to 155.48 seconds. Read the intervals alongside these averages; a small difference alone does not prove a general advantage.</w:t>
       </w:r>
     </w:p>
+    <w:p>
+      <w:r>
+        <w:t>In high traffic, the four average EV response times range from 154.35 to 156.98 seconds. Read the intervals alongside these averages; a small difference alone does not prove a general advantage.</w:t>
+      </w:r>
+    </w:p>
+    <w:p>
+      <w:pPr>
+        <w:pStyle w:val="Heading1"/>
+      </w:pPr>
+      <w:r>
+        <w:t>Normal operation and controlled stalls</w:t>
+      </w:r>
+    </w:p>
+    <w:p>
+      <w:r>
+        <w:t>The main averages include 22 normal seeds and eight independently selected fault-test seeds. To show how the routing approaches behave in each condition, the next tables separate their initial decision times. All Mist approaches face the same injected stall in the selected seeds. The experiment does not estimate how often such a fault occurs on real hardware.</w:t>
+      </w:r>
+    </w:p>
+    <w:p>
+      <w:pPr>
+        <w:pStyle w:val="Heading2"/>
+      </w:pPr>
+      <w:r>
+        <w:t>Low traffic decision time</w:t>
+      </w:r>
+    </w:p>
+    <w:tbl>
+      <w:tblPr>
+        <w:tblStyle w:val="TableGrid"/>
+        <w:tblW w:type="auto" w:w="0"/>
+        <w:jc w:val="center"/>
+        <w:tblLayout w:type="autofit"/>
+        <w:tblLook w:firstColumn="1" w:firstRow="1" w:lastColumn="0" w:lastRow="0" w:noHBand="0" w:noVBand="1" w:val="04A0"/>
+        <w:tblBorders>
+          <w:top w:val="single" w:sz="4" w:color="D9D9D9"/>
+          <w:left w:val="single" w:sz="4" w:color="D9D9D9"/>
+          <w:bottom w:val="single" w:sz="4" w:color="D9D9D9"/>
+          <w:right w:val="single" w:sz="4" w:color="D9D9D9"/>
+          <w:insideH w:val="single" w:sz="4" w:color="D9D9D9"/>
+          <w:insideV w:val="single" w:sz="4" w:color="D9D9D9"/>
+        </w:tblBorders>
+      </w:tblPr>
+      <w:tblGrid>
+        <w:gridCol w:w="2074"/>
+        <w:gridCol w:w="2074"/>
+        <w:gridCol w:w="2074"/>
+        <w:gridCol w:w="2074"/>
+        <w:gridCol w:w="2074"/>
+      </w:tblGrid>
+      <w:tr>
+        <w:trPr>
+          <w:tblHeader w:val="true"/>
+        </w:trPr>
+        <w:tc>
+          <w:tcPr>
+            <w:tcW w:type="dxa" w:w="2074"/>
+            <w:shd w:fill="1F3957"/>
+          </w:tcPr>
+          <w:p>
+            <w:r>
+              <w:rPr>
+                <w:b/>
+                <w:color w:val="FFFFFF"/>
+                <w:sz w:val="16"/>
+              </w:rPr>
+              <w:t>Condition</w:t>
+            </w:r>
+          </w:p>
+        </w:tc>
+        <w:tc>
+          <w:tcPr>
+            <w:tcW w:type="dxa" w:w="2074"/>
+            <w:shd w:fill="1F3957"/>
+          </w:tcPr>
+          <w:p>
+            <w:r>
+              <w:rPr>
+                <w:b/>
+                <w:color w:val="FFFFFF"/>
+                <w:sz w:val="16"/>
+              </w:rPr>
+              <w:t>Fog/Cloud</w:t>
+            </w:r>
+          </w:p>
+        </w:tc>
+        <w:tc>
+          <w:tcPr>
+            <w:tcW w:type="dxa" w:w="2074"/>
+            <w:shd w:fill="1F3957"/>
+          </w:tcPr>
+          <w:p>
+            <w:r>
+              <w:rPr>
+                <w:b/>
+                <w:color w:val="FFFFFF"/>
+                <w:sz w:val="16"/>
+              </w:rPr>
+              <w:t>Mist</w:t>
+            </w:r>
+          </w:p>
+        </w:tc>
+        <w:tc>
+          <w:tcPr>
+            <w:tcW w:type="dxa" w:w="2074"/>
+            <w:shd w:fill="1F3957"/>
+          </w:tcPr>
+          <w:p>
+            <w:r>
+              <w:rPr>
+                <w:b/>
+                <w:color w:val="FFFFFF"/>
+                <w:sz w:val="16"/>
+              </w:rPr>
+              <w:t>Mist Dynamic</w:t>
+            </w:r>
+          </w:p>
+        </w:tc>
+        <w:tc>
+          <w:tcPr>
+            <w:tcW w:type="dxa" w:w="2074"/>
+            <w:shd w:fill="1F3957"/>
+          </w:tcPr>
+          <w:p>
+            <w:r>
+              <w:rPr>
+                <w:b/>
+                <w:color w:val="FFFFFF"/>
+                <w:sz w:val="16"/>
+              </w:rPr>
+              <w:t>Mist + Fog</w:t>
+            </w:r>
+          </w:p>
+        </w:tc>
+      </w:tr>
+      <w:tr>
+        <w:tc>
+          <w:tcPr>
+            <w:tcW w:type="dxa" w:w="2074"/>
+            <w:vAlign w:val="center"/>
+          </w:tcPr>
+          <w:p>
+            <w:pPr>
+              <w:spacing w:after="0"/>
+            </w:pPr>
+            <w:r>
+              <w:rPr>
+                <w:sz w:val="16"/>
+              </w:rPr>
+              <w:t>Normal seeds</w:t>
+            </w:r>
+          </w:p>
+        </w:tc>
+        <w:tc>
+          <w:tcPr>
+            <w:tcW w:type="dxa" w:w="2074"/>
+            <w:vAlign w:val="center"/>
+          </w:tcPr>
+          <w:p>
+            <w:pPr>
+              <w:spacing w:after="0"/>
+            </w:pPr>
+            <w:r>
+              <w:rPr>
+                <w:sz w:val="16"/>
+              </w:rPr>
+              <w:t>626.54 ms</w:t>
+            </w:r>
+          </w:p>
+        </w:tc>
+        <w:tc>
+          <w:tcPr>
+            <w:tcW w:type="dxa" w:w="2074"/>
+            <w:vAlign w:val="center"/>
+          </w:tcPr>
+          <w:p>
+            <w:pPr>
+              <w:spacing w:after="0"/>
+            </w:pPr>
+            <w:r>
+              <w:rPr>
+                <w:sz w:val="16"/>
+              </w:rPr>
+              <w:t>326.00 ms</w:t>
+            </w:r>
+          </w:p>
+        </w:tc>
+        <w:tc>
+          <w:tcPr>
+            <w:tcW w:type="dxa" w:w="2074"/>
+            <w:vAlign w:val="center"/>
+          </w:tcPr>
+          <w:p>
+            <w:pPr>
+              <w:spacing w:after="0"/>
+            </w:pPr>
+            <w:r>
+              <w:rPr>
+                <w:sz w:val="16"/>
+              </w:rPr>
+              <w:t>326.00 ms</w:t>
+            </w:r>
+          </w:p>
+        </w:tc>
+        <w:tc>
+          <w:tcPr>
+            <w:tcW w:type="dxa" w:w="2074"/>
+            <w:vAlign w:val="center"/>
+          </w:tcPr>
+          <w:p>
+            <w:pPr>
+              <w:spacing w:after="0"/>
+            </w:pPr>
+            <w:r>
+              <w:rPr>
+                <w:sz w:val="16"/>
+              </w:rPr>
+              <w:t>326.00 ms</w:t>
+            </w:r>
+          </w:p>
+        </w:tc>
+      </w:tr>
+      <w:tr>
+        <w:tc>
+          <w:tcPr>
+            <w:tcW w:type="dxa" w:w="2074"/>
+            <w:vAlign w:val="center"/>
+            <w:shd w:fill="F2F6FA"/>
+          </w:tcPr>
+          <w:p>
+            <w:pPr>
+              <w:spacing w:after="0"/>
+            </w:pPr>
+            <w:r>
+              <w:rPr>
+                <w:sz w:val="16"/>
+              </w:rPr>
+              <w:t>Controlled stall seeds</w:t>
+            </w:r>
+          </w:p>
+        </w:tc>
+        <w:tc>
+          <w:tcPr>
+            <w:tcW w:type="dxa" w:w="2074"/>
+            <w:vAlign w:val="center"/>
+            <w:shd w:fill="F2F6FA"/>
+          </w:tcPr>
+          <w:p>
+            <w:pPr>
+              <w:spacing w:after="0"/>
+            </w:pPr>
+            <w:r>
+              <w:rPr>
+                <w:sz w:val="16"/>
+              </w:rPr>
+              <w:t>626.54 ms</w:t>
+            </w:r>
+          </w:p>
+        </w:tc>
+        <w:tc>
+          <w:tcPr>
+            <w:tcW w:type="dxa" w:w="2074"/>
+            <w:vAlign w:val="center"/>
+            <w:shd w:fill="F2F6FA"/>
+          </w:tcPr>
+          <w:p>
+            <w:pPr>
+              <w:spacing w:after="0"/>
+            </w:pPr>
+            <w:r>
+              <w:rPr>
+                <w:sz w:val="16"/>
+              </w:rPr>
+              <w:t>1226.00 ms</w:t>
+            </w:r>
+          </w:p>
+        </w:tc>
+        <w:tc>
+          <w:tcPr>
+            <w:tcW w:type="dxa" w:w="2074"/>
+            <w:vAlign w:val="center"/>
+            <w:shd w:fill="F2F6FA"/>
+          </w:tcPr>
+          <w:p>
+            <w:pPr>
+              <w:spacing w:after="0"/>
+            </w:pPr>
+            <w:r>
+              <w:rPr>
+                <w:sz w:val="16"/>
+              </w:rPr>
+              <w:t>1226.00 ms</w:t>
+            </w:r>
+          </w:p>
+        </w:tc>
+        <w:tc>
+          <w:tcPr>
+            <w:tcW w:type="dxa" w:w="2074"/>
+            <w:vAlign w:val="center"/>
+            <w:shd w:fill="F2F6FA"/>
+          </w:tcPr>
+          <w:p>
+            <w:pPr>
+              <w:spacing w:after="0"/>
+            </w:pPr>
+            <w:r>
+              <w:rPr>
+                <w:sz w:val="16"/>
+              </w:rPr>
+              <w:t>826.54 ms</w:t>
+            </w:r>
+          </w:p>
+        </w:tc>
+      </w:tr>
+    </w:tbl>
+    <w:p/>
+    <w:p>
+      <w:pPr>
+        <w:pStyle w:val="Heading2"/>
+      </w:pPr>
+      <w:r>
+        <w:t>Medium traffic decision time</w:t>
+      </w:r>
+    </w:p>
+    <w:tbl>
+      <w:tblPr>
+        <w:tblStyle w:val="TableGrid"/>
+        <w:tblW w:type="auto" w:w="0"/>
+        <w:jc w:val="center"/>
+        <w:tblLayout w:type="autofit"/>
+        <w:tblLook w:firstColumn="1" w:firstRow="1" w:lastColumn="0" w:lastRow="0" w:noHBand="0" w:noVBand="1" w:val="04A0"/>
+        <w:tblBorders>
+          <w:top w:val="single" w:sz="4" w:color="D9D9D9"/>
+          <w:left w:val="single" w:sz="4" w:color="D9D9D9"/>
+          <w:bottom w:val="single" w:sz="4" w:color="D9D9D9"/>
+          <w:right w:val="single" w:sz="4" w:color="D9D9D9"/>
+          <w:insideH w:val="single" w:sz="4" w:color="D9D9D9"/>
+          <w:insideV w:val="single" w:sz="4" w:color="D9D9D9"/>
+        </w:tblBorders>
+      </w:tblPr>
+      <w:tblGrid>
+        <w:gridCol w:w="2074"/>
+        <w:gridCol w:w="2074"/>
+        <w:gridCol w:w="2074"/>
+        <w:gridCol w:w="2074"/>
+        <w:gridCol w:w="2074"/>
+      </w:tblGrid>
+      <w:tr>
+        <w:trPr>
+          <w:tblHeader w:val="true"/>
+        </w:trPr>
+        <w:tc>
+          <w:tcPr>
+            <w:tcW w:type="dxa" w:w="2074"/>
+            <w:shd w:fill="1F3957"/>
+          </w:tcPr>
+          <w:p>
+            <w:r>
+              <w:rPr>
+                <w:b/>
+                <w:color w:val="FFFFFF"/>
+                <w:sz w:val="16"/>
+              </w:rPr>
+              <w:t>Condition</w:t>
+            </w:r>
+          </w:p>
+        </w:tc>
+        <w:tc>
+          <w:tcPr>
+            <w:tcW w:type="dxa" w:w="2074"/>
+            <w:shd w:fill="1F3957"/>
+          </w:tcPr>
+          <w:p>
+            <w:r>
+              <w:rPr>
+                <w:b/>
+                <w:color w:val="FFFFFF"/>
+                <w:sz w:val="16"/>
+              </w:rPr>
+              <w:t>Fog/Cloud</w:t>
+            </w:r>
+          </w:p>
+        </w:tc>
+        <w:tc>
+          <w:tcPr>
+            <w:tcW w:type="dxa" w:w="2074"/>
+            <w:shd w:fill="1F3957"/>
+          </w:tcPr>
+          <w:p>
+            <w:r>
+              <w:rPr>
+                <w:b/>
+                <w:color w:val="FFFFFF"/>
+                <w:sz w:val="16"/>
+              </w:rPr>
+              <w:t>Mist</w:t>
+            </w:r>
+          </w:p>
+        </w:tc>
+        <w:tc>
+          <w:tcPr>
+            <w:tcW w:type="dxa" w:w="2074"/>
+            <w:shd w:fill="1F3957"/>
+          </w:tcPr>
+          <w:p>
+            <w:r>
+              <w:rPr>
+                <w:b/>
+                <w:color w:val="FFFFFF"/>
+                <w:sz w:val="16"/>
+              </w:rPr>
+              <w:t>Mist Dynamic</w:t>
+            </w:r>
+          </w:p>
+        </w:tc>
+        <w:tc>
+          <w:tcPr>
+            <w:tcW w:type="dxa" w:w="2074"/>
+            <w:shd w:fill="1F3957"/>
+          </w:tcPr>
+          <w:p>
+            <w:r>
+              <w:rPr>
+                <w:b/>
+                <w:color w:val="FFFFFF"/>
+                <w:sz w:val="16"/>
+              </w:rPr>
+              <w:t>Mist + Fog</w:t>
+            </w:r>
+          </w:p>
+        </w:tc>
+      </w:tr>
+      <w:tr>
+        <w:tc>
+          <w:tcPr>
+            <w:tcW w:type="dxa" w:w="2074"/>
+            <w:vAlign w:val="center"/>
+          </w:tcPr>
+          <w:p>
+            <w:pPr>
+              <w:spacing w:after="0"/>
+            </w:pPr>
+            <w:r>
+              <w:rPr>
+                <w:sz w:val="16"/>
+              </w:rPr>
+              <w:t>Normal seeds</w:t>
+            </w:r>
+          </w:p>
+        </w:tc>
+        <w:tc>
+          <w:tcPr>
+            <w:tcW w:type="dxa" w:w="2074"/>
+            <w:vAlign w:val="center"/>
+          </w:tcPr>
+          <w:p>
+            <w:pPr>
+              <w:spacing w:after="0"/>
+            </w:pPr>
+            <w:r>
+              <w:rPr>
+                <w:sz w:val="16"/>
+              </w:rPr>
+              <w:t>626.54 ms</w:t>
+            </w:r>
+          </w:p>
+        </w:tc>
+        <w:tc>
+          <w:tcPr>
+            <w:tcW w:type="dxa" w:w="2074"/>
+            <w:vAlign w:val="center"/>
+          </w:tcPr>
+          <w:p>
+            <w:pPr>
+              <w:spacing w:after="0"/>
+            </w:pPr>
+            <w:r>
+              <w:rPr>
+                <w:sz w:val="16"/>
+              </w:rPr>
+              <w:t>326.00 ms</w:t>
+            </w:r>
+          </w:p>
+        </w:tc>
+        <w:tc>
+          <w:tcPr>
+            <w:tcW w:type="dxa" w:w="2074"/>
+            <w:vAlign w:val="center"/>
+          </w:tcPr>
+          <w:p>
+            <w:pPr>
+              <w:spacing w:after="0"/>
+            </w:pPr>
+            <w:r>
+              <w:rPr>
+                <w:sz w:val="16"/>
+              </w:rPr>
+              <w:t>326.00 ms</w:t>
+            </w:r>
+          </w:p>
+        </w:tc>
+        <w:tc>
+          <w:tcPr>
+            <w:tcW w:type="dxa" w:w="2074"/>
+            <w:vAlign w:val="center"/>
+          </w:tcPr>
+          <w:p>
+            <w:pPr>
+              <w:spacing w:after="0"/>
+            </w:pPr>
+            <w:r>
+              <w:rPr>
+                <w:sz w:val="16"/>
+              </w:rPr>
+              <w:t>326.00 ms</w:t>
+            </w:r>
+          </w:p>
+        </w:tc>
+      </w:tr>
+      <w:tr>
+        <w:tc>
+          <w:tcPr>
+            <w:tcW w:type="dxa" w:w="2074"/>
+            <w:vAlign w:val="center"/>
+            <w:shd w:fill="F2F6FA"/>
+          </w:tcPr>
+          <w:p>
+            <w:pPr>
+              <w:spacing w:after="0"/>
+            </w:pPr>
+            <w:r>
+              <w:rPr>
+                <w:sz w:val="16"/>
+              </w:rPr>
+              <w:t>Controlled stall seeds</w:t>
+            </w:r>
+          </w:p>
+        </w:tc>
+        <w:tc>
+          <w:tcPr>
+            <w:tcW w:type="dxa" w:w="2074"/>
+            <w:vAlign w:val="center"/>
+            <w:shd w:fill="F2F6FA"/>
+          </w:tcPr>
+          <w:p>
+            <w:pPr>
+              <w:spacing w:after="0"/>
+            </w:pPr>
+            <w:r>
+              <w:rPr>
+                <w:sz w:val="16"/>
+              </w:rPr>
+              <w:t>626.54 ms</w:t>
+            </w:r>
+          </w:p>
+        </w:tc>
+        <w:tc>
+          <w:tcPr>
+            <w:tcW w:type="dxa" w:w="2074"/>
+            <w:vAlign w:val="center"/>
+            <w:shd w:fill="F2F6FA"/>
+          </w:tcPr>
+          <w:p>
+            <w:pPr>
+              <w:spacing w:after="0"/>
+            </w:pPr>
+            <w:r>
+              <w:rPr>
+                <w:sz w:val="16"/>
+              </w:rPr>
+              <w:t>1226.00 ms</w:t>
+            </w:r>
+          </w:p>
+        </w:tc>
+        <w:tc>
+          <w:tcPr>
+            <w:tcW w:type="dxa" w:w="2074"/>
+            <w:vAlign w:val="center"/>
+            <w:shd w:fill="F2F6FA"/>
+          </w:tcPr>
+          <w:p>
+            <w:pPr>
+              <w:spacing w:after="0"/>
+            </w:pPr>
+            <w:r>
+              <w:rPr>
+                <w:sz w:val="16"/>
+              </w:rPr>
+              <w:t>1226.00 ms</w:t>
+            </w:r>
+          </w:p>
+        </w:tc>
+        <w:tc>
+          <w:tcPr>
+            <w:tcW w:type="dxa" w:w="2074"/>
+            <w:vAlign w:val="center"/>
+            <w:shd w:fill="F2F6FA"/>
+          </w:tcPr>
+          <w:p>
+            <w:pPr>
+              <w:spacing w:after="0"/>
+            </w:pPr>
+            <w:r>
+              <w:rPr>
+                <w:sz w:val="16"/>
+              </w:rPr>
+              <w:t>826.60 ms</w:t>
+            </w:r>
+          </w:p>
+        </w:tc>
+      </w:tr>
+    </w:tbl>
+    <w:p/>
+    <w:p>
+      <w:pPr>
+        <w:pStyle w:val="Heading2"/>
+      </w:pPr>
+      <w:r>
+        <w:t>High traffic decision time</w:t>
+      </w:r>
+    </w:p>
+    <w:tbl>
+      <w:tblPr>
+        <w:tblStyle w:val="TableGrid"/>
+        <w:tblW w:type="auto" w:w="0"/>
+        <w:jc w:val="center"/>
+        <w:tblLayout w:type="autofit"/>
+        <w:tblLook w:firstColumn="1" w:firstRow="1" w:lastColumn="0" w:lastRow="0" w:noHBand="0" w:noVBand="1" w:val="04A0"/>
+        <w:tblBorders>
+          <w:top w:val="single" w:sz="4" w:color="D9D9D9"/>
+          <w:left w:val="single" w:sz="4" w:color="D9D9D9"/>
+          <w:bottom w:val="single" w:sz="4" w:color="D9D9D9"/>
+          <w:right w:val="single" w:sz="4" w:color="D9D9D9"/>
+          <w:insideH w:val="single" w:sz="4" w:color="D9D9D9"/>
+          <w:insideV w:val="single" w:sz="4" w:color="D9D9D9"/>
+        </w:tblBorders>
+      </w:tblPr>
+      <w:tblGrid>
+        <w:gridCol w:w="2074"/>
+        <w:gridCol w:w="2074"/>
+        <w:gridCol w:w="2074"/>
+        <w:gridCol w:w="2074"/>
+        <w:gridCol w:w="2074"/>
+      </w:tblGrid>
+      <w:tr>
+        <w:trPr>
+          <w:tblHeader w:val="true"/>
+        </w:trPr>
+        <w:tc>
+          <w:tcPr>
+            <w:tcW w:type="dxa" w:w="2074"/>
+            <w:shd w:fill="1F3957"/>
+          </w:tcPr>
+          <w:p>
+            <w:r>
+              <w:rPr>
+                <w:b/>
+                <w:color w:val="FFFFFF"/>
+                <w:sz w:val="16"/>
+              </w:rPr>
+              <w:t>Condition</w:t>
+            </w:r>
+          </w:p>
+        </w:tc>
+        <w:tc>
+          <w:tcPr>
+            <w:tcW w:type="dxa" w:w="2074"/>
+            <w:shd w:fill="1F3957"/>
+          </w:tcPr>
+          <w:p>
+            <w:r>
+              <w:rPr>
+                <w:b/>
+                <w:color w:val="FFFFFF"/>
+                <w:sz w:val="16"/>
+              </w:rPr>
+              <w:t>Fog/Cloud</w:t>
+            </w:r>
+          </w:p>
+        </w:tc>
+        <w:tc>
+          <w:tcPr>
+            <w:tcW w:type="dxa" w:w="2074"/>
+            <w:shd w:fill="1F3957"/>
+          </w:tcPr>
+          <w:p>
+            <w:r>
+              <w:rPr>
+                <w:b/>
+                <w:color w:val="FFFFFF"/>
+                <w:sz w:val="16"/>
+              </w:rPr>
+              <w:t>Mist</w:t>
+            </w:r>
+          </w:p>
+        </w:tc>
+        <w:tc>
+          <w:tcPr>
+            <w:tcW w:type="dxa" w:w="2074"/>
+            <w:shd w:fill="1F3957"/>
+          </w:tcPr>
+          <w:p>
+            <w:r>
+              <w:rPr>
+                <w:b/>
+                <w:color w:val="FFFFFF"/>
+                <w:sz w:val="16"/>
+              </w:rPr>
+              <w:t>Mist Dynamic</w:t>
+            </w:r>
+          </w:p>
+        </w:tc>
+        <w:tc>
+          <w:tcPr>
+            <w:tcW w:type="dxa" w:w="2074"/>
+            <w:shd w:fill="1F3957"/>
+          </w:tcPr>
+          <w:p>
+            <w:r>
+              <w:rPr>
+                <w:b/>
+                <w:color w:val="FFFFFF"/>
+                <w:sz w:val="16"/>
+              </w:rPr>
+              <w:t>Mist + Fog</w:t>
+            </w:r>
+          </w:p>
+        </w:tc>
+      </w:tr>
+      <w:tr>
+        <w:tc>
+          <w:tcPr>
+            <w:tcW w:type="dxa" w:w="2074"/>
+            <w:vAlign w:val="center"/>
+          </w:tcPr>
+          <w:p>
+            <w:pPr>
+              <w:spacing w:after="0"/>
+            </w:pPr>
+            <w:r>
+              <w:rPr>
+                <w:sz w:val="16"/>
+              </w:rPr>
+              <w:t>Normal seeds</w:t>
+            </w:r>
+          </w:p>
+        </w:tc>
+        <w:tc>
+          <w:tcPr>
+            <w:tcW w:type="dxa" w:w="2074"/>
+            <w:vAlign w:val="center"/>
+          </w:tcPr>
+          <w:p>
+            <w:pPr>
+              <w:spacing w:after="0"/>
+            </w:pPr>
+            <w:r>
+              <w:rPr>
+                <w:sz w:val="16"/>
+              </w:rPr>
+              <w:t>626.54 ms</w:t>
+            </w:r>
+          </w:p>
+        </w:tc>
+        <w:tc>
+          <w:tcPr>
+            <w:tcW w:type="dxa" w:w="2074"/>
+            <w:vAlign w:val="center"/>
+          </w:tcPr>
+          <w:p>
+            <w:pPr>
+              <w:spacing w:after="0"/>
+            </w:pPr>
+            <w:r>
+              <w:rPr>
+                <w:sz w:val="16"/>
+              </w:rPr>
+              <w:t>326.00 ms</w:t>
+            </w:r>
+          </w:p>
+        </w:tc>
+        <w:tc>
+          <w:tcPr>
+            <w:tcW w:type="dxa" w:w="2074"/>
+            <w:vAlign w:val="center"/>
+          </w:tcPr>
+          <w:p>
+            <w:pPr>
+              <w:spacing w:after="0"/>
+            </w:pPr>
+            <w:r>
+              <w:rPr>
+                <w:sz w:val="16"/>
+              </w:rPr>
+              <w:t>326.00 ms</w:t>
+            </w:r>
+          </w:p>
+        </w:tc>
+        <w:tc>
+          <w:tcPr>
+            <w:tcW w:type="dxa" w:w="2074"/>
+            <w:vAlign w:val="center"/>
+          </w:tcPr>
+          <w:p>
+            <w:pPr>
+              <w:spacing w:after="0"/>
+            </w:pPr>
+            <w:r>
+              <w:rPr>
+                <w:sz w:val="16"/>
+              </w:rPr>
+              <w:t>326.00 ms</w:t>
+            </w:r>
+          </w:p>
+        </w:tc>
+      </w:tr>
+      <w:tr>
+        <w:tc>
+          <w:tcPr>
+            <w:tcW w:type="dxa" w:w="2074"/>
+            <w:vAlign w:val="center"/>
+            <w:shd w:fill="F2F6FA"/>
+          </w:tcPr>
+          <w:p>
+            <w:pPr>
+              <w:spacing w:after="0"/>
+            </w:pPr>
+            <w:r>
+              <w:rPr>
+                <w:sz w:val="16"/>
+              </w:rPr>
+              <w:t>Controlled stall seeds</w:t>
+            </w:r>
+          </w:p>
+        </w:tc>
+        <w:tc>
+          <w:tcPr>
+            <w:tcW w:type="dxa" w:w="2074"/>
+            <w:vAlign w:val="center"/>
+            <w:shd w:fill="F2F6FA"/>
+          </w:tcPr>
+          <w:p>
+            <w:pPr>
+              <w:spacing w:after="0"/>
+            </w:pPr>
+            <w:r>
+              <w:rPr>
+                <w:sz w:val="16"/>
+              </w:rPr>
+              <w:t>626.54 ms</w:t>
+            </w:r>
+          </w:p>
+        </w:tc>
+        <w:tc>
+          <w:tcPr>
+            <w:tcW w:type="dxa" w:w="2074"/>
+            <w:vAlign w:val="center"/>
+            <w:shd w:fill="F2F6FA"/>
+          </w:tcPr>
+          <w:p>
+            <w:pPr>
+              <w:spacing w:after="0"/>
+            </w:pPr>
+            <w:r>
+              <w:rPr>
+                <w:sz w:val="16"/>
+              </w:rPr>
+              <w:t>1226.00 ms</w:t>
+            </w:r>
+          </w:p>
+        </w:tc>
+        <w:tc>
+          <w:tcPr>
+            <w:tcW w:type="dxa" w:w="2074"/>
+            <w:vAlign w:val="center"/>
+            <w:shd w:fill="F2F6FA"/>
+          </w:tcPr>
+          <w:p>
+            <w:pPr>
+              <w:spacing w:after="0"/>
+            </w:pPr>
+            <w:r>
+              <w:rPr>
+                <w:sz w:val="16"/>
+              </w:rPr>
+              <w:t>1226.00 ms</w:t>
+            </w:r>
+          </w:p>
+        </w:tc>
+        <w:tc>
+          <w:tcPr>
+            <w:tcW w:type="dxa" w:w="2074"/>
+            <w:vAlign w:val="center"/>
+            <w:shd w:fill="F2F6FA"/>
+          </w:tcPr>
+          <w:p>
+            <w:pPr>
+              <w:spacing w:after="0"/>
+            </w:pPr>
+            <w:r>
+              <w:rPr>
+                <w:sz w:val="16"/>
+              </w:rPr>
+              <w:t>826.63 ms</w:t>
+            </w:r>
+          </w:p>
+        </w:tc>
+      </w:tr>
+    </w:tbl>
+    <w:p/>
+    <w:p>
+      <w:pPr>
+        <w:pStyle w:val="Heading1"/>
+      </w:pPr>
+      <w:r>
+        <w:t>Traffic-light waiting with and without priority</w:t>
+      </w:r>
+    </w:p>
+    <w:p>
+      <w:r>
+        <w:t>The no-preemption control uses Fog/Cloud routing with priority disabled. It appears only in this waiting comparison and the three waiting graphs. The priority controller preserves a minimum current green and safe clearance before serving the EV. Some requests can finish before arrival; others require the EV to wait. Waiting is measured from movement rather than added artificially.</w:t>
+      </w:r>
+    </w:p>
+    <w:tbl>
+      <w:tblPr>
+        <w:tblStyle w:val="TableGrid"/>
+        <w:tblW w:type="auto" w:w="0"/>
+        <w:jc w:val="center"/>
+        <w:tblLayout w:type="autofit"/>
+        <w:tblLook w:firstColumn="1" w:firstRow="1" w:lastColumn="0" w:lastRow="0" w:noHBand="0" w:noVBand="1" w:val="04A0"/>
+        <w:tblBorders>
+          <w:top w:val="single" w:sz="4" w:color="D9D9D9"/>
+          <w:left w:val="single" w:sz="4" w:color="D9D9D9"/>
+          <w:bottom w:val="single" w:sz="4" w:color="D9D9D9"/>
+          <w:right w:val="single" w:sz="4" w:color="D9D9D9"/>
+          <w:insideH w:val="single" w:sz="4" w:color="D9D9D9"/>
+          <w:insideV w:val="single" w:sz="4" w:color="D9D9D9"/>
+        </w:tblBorders>
+      </w:tblPr>
+      <w:tblGrid>
+        <w:gridCol w:w="1728"/>
+        <w:gridCol w:w="1728"/>
+        <w:gridCol w:w="1728"/>
+        <w:gridCol w:w="1728"/>
+        <w:gridCol w:w="1728"/>
+        <w:gridCol w:w="1728"/>
+      </w:tblGrid>
+      <w:tr>
+        <w:trPr>
+          <w:tblHeader w:val="true"/>
+        </w:trPr>
+        <w:tc>
+          <w:tcPr>
+            <w:tcW w:type="dxa" w:w="1728"/>
+            <w:shd w:fill="1F3957"/>
+          </w:tcPr>
+          <w:p>
+            <w:r>
+              <w:rPr>
+                <w:b/>
+                <w:color w:val="FFFFFF"/>
+                <w:sz w:val="16"/>
+              </w:rPr>
+              <w:t>Traffic</w:t>
+            </w:r>
+          </w:p>
+        </w:tc>
+        <w:tc>
+          <w:tcPr>
+            <w:tcW w:type="dxa" w:w="1728"/>
+            <w:shd w:fill="1F3957"/>
+          </w:tcPr>
+          <w:p>
+            <w:r>
+              <w:rPr>
+                <w:b/>
+                <w:color w:val="FFFFFF"/>
+                <w:sz w:val="16"/>
+              </w:rPr>
+              <w:t>Fog/Cloud</w:t>
+            </w:r>
+          </w:p>
+        </w:tc>
+        <w:tc>
+          <w:tcPr>
+            <w:tcW w:type="dxa" w:w="1728"/>
+            <w:shd w:fill="1F3957"/>
+          </w:tcPr>
+          <w:p>
+            <w:r>
+              <w:rPr>
+                <w:b/>
+                <w:color w:val="FFFFFF"/>
+                <w:sz w:val="16"/>
+              </w:rPr>
+              <w:t>Mist</w:t>
+            </w:r>
+          </w:p>
+        </w:tc>
+        <w:tc>
+          <w:tcPr>
+            <w:tcW w:type="dxa" w:w="1728"/>
+            <w:shd w:fill="1F3957"/>
+          </w:tcPr>
+          <w:p>
+            <w:r>
+              <w:rPr>
+                <w:b/>
+                <w:color w:val="FFFFFF"/>
+                <w:sz w:val="16"/>
+              </w:rPr>
+              <w:t>Mist Dynamic</w:t>
+            </w:r>
+          </w:p>
+        </w:tc>
+        <w:tc>
+          <w:tcPr>
+            <w:tcW w:type="dxa" w:w="1728"/>
+            <w:shd w:fill="1F3957"/>
+          </w:tcPr>
+          <w:p>
+            <w:r>
+              <w:rPr>
+                <w:b/>
+                <w:color w:val="FFFFFF"/>
+                <w:sz w:val="16"/>
+              </w:rPr>
+              <w:t>Mist + Fog</w:t>
+            </w:r>
+          </w:p>
+        </w:tc>
+        <w:tc>
+          <w:tcPr>
+            <w:tcW w:type="dxa" w:w="1728"/>
+            <w:shd w:fill="1F3957"/>
+          </w:tcPr>
+          <w:p>
+            <w:r>
+              <w:rPr>
+                <w:b/>
+                <w:color w:val="FFFFFF"/>
+                <w:sz w:val="16"/>
+              </w:rPr>
+              <w:t>No preemption</w:t>
+            </w:r>
+          </w:p>
+        </w:tc>
+      </w:tr>
+      <w:tr>
+        <w:tc>
+          <w:tcPr>
+            <w:tcW w:type="dxa" w:w="1728"/>
+            <w:vAlign w:val="center"/>
+          </w:tcPr>
+          <w:p>
+            <w:pPr>
+              <w:spacing w:after="0"/>
+            </w:pPr>
+            <w:r>
+              <w:rPr>
+                <w:sz w:val="16"/>
+              </w:rPr>
+              <w:t>Low</w:t>
+            </w:r>
+          </w:p>
+        </w:tc>
+        <w:tc>
+          <w:tcPr>
+            <w:tcW w:type="dxa" w:w="1728"/>
+            <w:vAlign w:val="center"/>
+          </w:tcPr>
+          <w:p>
+            <w:pPr>
+              <w:spacing w:after="0"/>
+            </w:pPr>
+            <w:r>
+              <w:rPr>
+                <w:sz w:val="16"/>
+              </w:rPr>
+              <w:t>1.54 s</w:t>
+            </w:r>
+          </w:p>
+        </w:tc>
+        <w:tc>
+          <w:tcPr>
+            <w:tcW w:type="dxa" w:w="1728"/>
+            <w:vAlign w:val="center"/>
+          </w:tcPr>
+          <w:p>
+            <w:pPr>
+              <w:spacing w:after="0"/>
+            </w:pPr>
+            <w:r>
+              <w:rPr>
+                <w:sz w:val="16"/>
+              </w:rPr>
+              <w:t>1.58 s</w:t>
+            </w:r>
+          </w:p>
+        </w:tc>
+        <w:tc>
+          <w:tcPr>
+            <w:tcW w:type="dxa" w:w="1728"/>
+            <w:vAlign w:val="center"/>
+          </w:tcPr>
+          <w:p>
+            <w:pPr>
+              <w:spacing w:after="0"/>
+            </w:pPr>
+            <w:r>
+              <w:rPr>
+                <w:sz w:val="16"/>
+              </w:rPr>
+              <w:t>1.96 s</w:t>
+            </w:r>
+          </w:p>
+        </w:tc>
+        <w:tc>
+          <w:tcPr>
+            <w:tcW w:type="dxa" w:w="1728"/>
+            <w:vAlign w:val="center"/>
+          </w:tcPr>
+          <w:p>
+            <w:pPr>
+              <w:spacing w:after="0"/>
+            </w:pPr>
+            <w:r>
+              <w:rPr>
+                <w:sz w:val="16"/>
+              </w:rPr>
+              <w:t>2.02 s</w:t>
+            </w:r>
+          </w:p>
+        </w:tc>
+        <w:tc>
+          <w:tcPr>
+            <w:tcW w:type="dxa" w:w="1728"/>
+            <w:vAlign w:val="center"/>
+          </w:tcPr>
+          <w:p>
+            <w:pPr>
+              <w:spacing w:after="0"/>
+            </w:pPr>
+            <w:r>
+              <w:rPr>
+                <w:sz w:val="16"/>
+              </w:rPr>
+              <w:t>26.29 s</w:t>
+            </w:r>
+          </w:p>
+        </w:tc>
+      </w:tr>
+      <w:tr>
+        <w:tc>
+          <w:tcPr>
+            <w:tcW w:type="dxa" w:w="1728"/>
+            <w:vAlign w:val="center"/>
+            <w:shd w:fill="F2F6FA"/>
+          </w:tcPr>
+          <w:p>
+            <w:pPr>
+              <w:spacing w:after="0"/>
+            </w:pPr>
+            <w:r>
+              <w:rPr>
+                <w:sz w:val="16"/>
+              </w:rPr>
+              <w:t>Medium</w:t>
+            </w:r>
+          </w:p>
+        </w:tc>
+        <w:tc>
+          <w:tcPr>
+            <w:tcW w:type="dxa" w:w="1728"/>
+            <w:vAlign w:val="center"/>
+            <w:shd w:fill="F2F6FA"/>
+          </w:tcPr>
+          <w:p>
+            <w:pPr>
+              <w:spacing w:after="0"/>
+            </w:pPr>
+            <w:r>
+              <w:rPr>
+                <w:sz w:val="16"/>
+              </w:rPr>
+              <w:t>0.95 s</w:t>
+            </w:r>
+          </w:p>
+        </w:tc>
+        <w:tc>
+          <w:tcPr>
+            <w:tcW w:type="dxa" w:w="1728"/>
+            <w:vAlign w:val="center"/>
+            <w:shd w:fill="F2F6FA"/>
+          </w:tcPr>
+          <w:p>
+            <w:pPr>
+              <w:spacing w:after="0"/>
+            </w:pPr>
+            <w:r>
+              <w:rPr>
+                <w:sz w:val="16"/>
+              </w:rPr>
+              <w:t>1.62 s</w:t>
+            </w:r>
+          </w:p>
+        </w:tc>
+        <w:tc>
+          <w:tcPr>
+            <w:tcW w:type="dxa" w:w="1728"/>
+            <w:vAlign w:val="center"/>
+            <w:shd w:fill="F2F6FA"/>
+          </w:tcPr>
+          <w:p>
+            <w:pPr>
+              <w:spacing w:after="0"/>
+            </w:pPr>
+            <w:r>
+              <w:rPr>
+                <w:sz w:val="16"/>
+              </w:rPr>
+              <w:t>1.71 s</w:t>
+            </w:r>
+          </w:p>
+        </w:tc>
+        <w:tc>
+          <w:tcPr>
+            <w:tcW w:type="dxa" w:w="1728"/>
+            <w:vAlign w:val="center"/>
+            <w:shd w:fill="F2F6FA"/>
+          </w:tcPr>
+          <w:p>
+            <w:pPr>
+              <w:spacing w:after="0"/>
+            </w:pPr>
+            <w:r>
+              <w:rPr>
+                <w:sz w:val="16"/>
+              </w:rPr>
+              <w:t>1.74 s</w:t>
+            </w:r>
+          </w:p>
+        </w:tc>
+        <w:tc>
+          <w:tcPr>
+            <w:tcW w:type="dxa" w:w="1728"/>
+            <w:vAlign w:val="center"/>
+            <w:shd w:fill="F2F6FA"/>
+          </w:tcPr>
+          <w:p>
+            <w:pPr>
+              <w:spacing w:after="0"/>
+            </w:pPr>
+            <w:r>
+              <w:rPr>
+                <w:sz w:val="16"/>
+              </w:rPr>
+              <w:t>27.34 s</w:t>
+            </w:r>
+          </w:p>
+        </w:tc>
+      </w:tr>
+      <w:tr>
+        <w:tc>
+          <w:tcPr>
+            <w:tcW w:type="dxa" w:w="1728"/>
+            <w:vAlign w:val="center"/>
+          </w:tcPr>
+          <w:p>
+            <w:pPr>
+              <w:spacing w:after="0"/>
+            </w:pPr>
+            <w:r>
+              <w:rPr>
+                <w:sz w:val="16"/>
+              </w:rPr>
+              <w:t>High</w:t>
+            </w:r>
+          </w:p>
+        </w:tc>
+        <w:tc>
+          <w:tcPr>
+            <w:tcW w:type="dxa" w:w="1728"/>
+            <w:vAlign w:val="center"/>
+          </w:tcPr>
+          <w:p>
+            <w:pPr>
+              <w:spacing w:after="0"/>
+            </w:pPr>
+            <w:r>
+              <w:rPr>
+                <w:sz w:val="16"/>
+              </w:rPr>
+              <w:t>0.67 s</w:t>
+            </w:r>
+          </w:p>
+        </w:tc>
+        <w:tc>
+          <w:tcPr>
+            <w:tcW w:type="dxa" w:w="1728"/>
+            <w:vAlign w:val="center"/>
+          </w:tcPr>
+          <w:p>
+            <w:pPr>
+              <w:spacing w:after="0"/>
+            </w:pPr>
+            <w:r>
+              <w:rPr>
+                <w:sz w:val="16"/>
+              </w:rPr>
+              <w:t>0.62 s</w:t>
+            </w:r>
+          </w:p>
+        </w:tc>
+        <w:tc>
+          <w:tcPr>
+            <w:tcW w:type="dxa" w:w="1728"/>
+            <w:vAlign w:val="center"/>
+          </w:tcPr>
+          <w:p>
+            <w:pPr>
+              <w:spacing w:after="0"/>
+            </w:pPr>
+            <w:r>
+              <w:rPr>
+                <w:sz w:val="16"/>
+              </w:rPr>
+              <w:t>0.65 s</w:t>
+            </w:r>
+          </w:p>
+        </w:tc>
+        <w:tc>
+          <w:tcPr>
+            <w:tcW w:type="dxa" w:w="1728"/>
+            <w:vAlign w:val="center"/>
+          </w:tcPr>
+          <w:p>
+            <w:pPr>
+              <w:spacing w:after="0"/>
+            </w:pPr>
+            <w:r>
+              <w:rPr>
+                <w:sz w:val="16"/>
+              </w:rPr>
+              <w:t>0.60 s</w:t>
+            </w:r>
+          </w:p>
+        </w:tc>
+        <w:tc>
+          <w:tcPr>
+            <w:tcW w:type="dxa" w:w="1728"/>
+            <w:vAlign w:val="center"/>
+          </w:tcPr>
+          <w:p>
+            <w:pPr>
+              <w:spacing w:after="0"/>
+            </w:pPr>
+            <w:r>
+              <w:rPr>
+                <w:sz w:val="16"/>
+              </w:rPr>
+              <w:t>22.72 s</w:t>
+            </w:r>
+          </w:p>
+        </w:tc>
+      </w:tr>
+    </w:tbl>
+    <w:p/>
     <w:p>
       <w:pPr>
         <w:pStyle w:val="Heading1"/>
@@ -3328,6 +5651,14 @@
         <w:jc w:val="center"/>
         <w:tblLayout w:type="autofit"/>
         <w:tblLook w:firstColumn="1" w:firstRow="1" w:lastColumn="0" w:lastRow="0" w:noHBand="0" w:noVBand="1" w:val="04A0"/>
+        <w:tblBorders>
+          <w:top w:val="single" w:sz="4" w:color="D9D9D9"/>
+          <w:left w:val="single" w:sz="4" w:color="D9D9D9"/>
+          <w:bottom w:val="single" w:sz="4" w:color="D9D9D9"/>
+          <w:right w:val="single" w:sz="4" w:color="D9D9D9"/>
+          <w:insideH w:val="single" w:sz="4" w:color="D9D9D9"/>
+          <w:insideV w:val="single" w:sz="4" w:color="D9D9D9"/>
+        </w:tblBorders>
       </w:tblPr>
       <w:tblGrid>
         <w:gridCol w:w="1728"/>
@@ -3469,7 +5800,7 @@
               <w:rPr>
                 <w:sz w:val="16"/>
               </w:rPr>
-              <w:t>0/30 (0.0%)</w:t>
+              <w:t>7/30 (23.3%)</w:t>
             </w:r>
           </w:p>
         </w:tc>
@@ -3486,7 +5817,7 @@
               <w:rPr>
                 <w:sz w:val="16"/>
               </w:rPr>
-              <w:t>3</w:t>
+              <w:t>4</w:t>
             </w:r>
           </w:p>
         </w:tc>
@@ -3503,7 +5834,7 @@
               <w:rPr>
                 <w:sz w:val="16"/>
               </w:rPr>
-              <w:t>625</w:t>
+              <w:t>657</w:t>
             </w:r>
           </w:p>
         </w:tc>
@@ -3520,7 +5851,7 @@
               <w:rPr>
                 <w:sz w:val="16"/>
               </w:rPr>
-              <w:t>3</w:t>
+              <w:t>4</w:t>
             </w:r>
           </w:p>
         </w:tc>
@@ -3537,7 +5868,7 @@
               <w:rPr>
                 <w:sz w:val="16"/>
               </w:rPr>
-              <w:t>625</w:t>
+              <w:t>660</w:t>
             </w:r>
           </w:p>
         </w:tc>
@@ -3575,7 +5906,7 @@
               <w:rPr>
                 <w:sz w:val="16"/>
               </w:rPr>
-              <w:t>18/30 (60.0%)</w:t>
+              <w:t>8/30 (26.7%)</w:t>
             </w:r>
           </w:p>
         </w:tc>
@@ -3593,7 +5924,7 @@
               <w:rPr>
                 <w:sz w:val="16"/>
               </w:rPr>
-              <w:t>6</w:t>
+              <w:t>7</w:t>
             </w:r>
           </w:p>
         </w:tc>
@@ -3611,7 +5942,7 @@
               <w:rPr>
                 <w:sz w:val="16"/>
               </w:rPr>
-              <w:t>758</w:t>
+              <w:t>820</w:t>
             </w:r>
           </w:p>
         </w:tc>
@@ -3629,7 +5960,7 @@
               <w:rPr>
                 <w:sz w:val="16"/>
               </w:rPr>
-              <w:t>5</w:t>
+              <w:t>8</w:t>
             </w:r>
           </w:p>
         </w:tc>
@@ -3647,7 +5978,7 @@
               <w:rPr>
                 <w:sz w:val="16"/>
               </w:rPr>
-              <w:t>758</w:t>
+              <w:t>815</w:t>
             </w:r>
           </w:p>
         </w:tc>
@@ -3683,7 +6014,7 @@
               <w:rPr>
                 <w:sz w:val="16"/>
               </w:rPr>
-              <w:t>27/30 (90.0%)</w:t>
+              <w:t>8/30 (26.7%)</w:t>
             </w:r>
           </w:p>
         </w:tc>
@@ -3700,7 +6031,7 @@
               <w:rPr>
                 <w:sz w:val="16"/>
               </w:rPr>
-              <w:t>6</w:t>
+              <w:t>10</w:t>
             </w:r>
           </w:p>
         </w:tc>
@@ -3717,7 +6048,7 @@
               <w:rPr>
                 <w:sz w:val="16"/>
               </w:rPr>
-              <w:t>784</w:t>
+              <w:t>853</w:t>
             </w:r>
           </w:p>
         </w:tc>
@@ -3734,7 +6065,7 @@
               <w:rPr>
                 <w:sz w:val="16"/>
               </w:rPr>
-              <w:t>5</w:t>
+              <w:t>10</w:t>
             </w:r>
           </w:p>
         </w:tc>
@@ -3751,7 +6082,7 @@
               <w:rPr>
                 <w:sz w:val="16"/>
               </w:rPr>
-              <w:t>785</w:t>
+              <w:t>855</w:t>
             </w:r>
           </w:p>
         </w:tc>
@@ -3760,12 +6091,12 @@
     <w:p/>
     <w:p>
       <w:r>
-        <w:t>Fog took over in 45 of the 90 Mist with Fog runs: zero in low traffic, 18 in medium traffic, and 27 in high traffic. The trigger is a modeled queue of recently received vehicle and roadside messages that the onboard unit checks before using its route. Each check adds an assumed 20 ms of service time. This is a simulation assumption, not a measured processor benchmark. For example, in medium traffic seed 1, the Mist decision exceeded 800 ms and Fog applied the route after 1126.65 ms.</w:t>
+        <w:t>Fog took over in 23 of 90 Mist with Fog runs: 7 in low, 8 in medium, and 8 in high traffic. The controlled 900 ms stall delays initial Mist work beyond the 500 ms watchdog. For example, in low traffic seed 4, Fog applied the route after 826.53 ms.</w:t>
       </w:r>
     </w:p>
     <w:p>
       <w:r>
-        <w:t>Dynamic Mist reviewed routes 625, 758, and 784 times across the 30 low, medium, and high traffic runs, but actually changed them only 3, 6, and 6 times. Most reviews therefore kept the current route. Mist with Fog produced 3, 5, and 5 route changes across those traffic levels.</w:t>
+        <w:t>The table counts actual route changes separately from five-second reviews. A review that finds no sufficiently better route keeps the existing route. The routing logs record both the current route cost and the candidate cost, so these decisions can be checked from the evidence.</w:t>
       </w:r>
     </w:p>
     <w:p>
@@ -3773,7 +6104,7 @@
         <w:pStyle w:val="Heading1"/>
       </w:pPr>
       <w:r>
-        <w:t>Why EM throughput appears flat</w:t>
+        <w:t>Why EM throughput is similar across routing approaches</w:t>
       </w:r>
     </w:p>
     <w:p>
@@ -3783,7 +6114,7 @@
     </w:p>
     <w:p>
       <w:r>
-        <w:t>Traffic does change with density: the scenarios contain 72, 144, or 200 normal vehicles; trip starting points differ between random seeds; and the dynamic route logs contain different live road costs and route changes. The similar throughput bars follow from the fixed message size and fixed measurement window.</w:t>
+        <w:t>Traffic does change with density: the scenarios contain 72, 144, or 200 normal vehicles; trip starting points differ between random seeds; and the dynamic route logs contain different live road costs and route changes. The throughput means are 1.820, 2.200, and 2.276 bit/s from low to high density. Within each density, the four routing approaches have similar throughput because they delivered the same number of alerts.</w:t>
       </w:r>
     </w:p>
     <w:p>
@@ -3796,12 +6127,12 @@
     </w:p>
     <w:p>
       <w:r>
-        <w:t>The four approaches delivered alerts at the same rate within each traffic level. Dynamic routing checked current road conditions many times and made a small number of actual route changes. The Fog backup activated under the modeled Mist workload, especially in medium and high traffic. In this grid, its extra decision time did not produce a clear response-time advantage.</w:t>
+        <w:t>The experiment compares alert delivery, route computation, and vehicle movement as separate parts of the response. Dynamic routing uses current road reports and only replaces a route when its stability rules are met. The controlled stall tests show how Fog recovery behaves under a defined fault. The response and waiting tables show the measured journey outcomes rather than assuming every route change saves time.</w:t>
       </w:r>
     </w:p>
     <w:p>
       <w:r>
-        <w:t>These findings apply to the simulated 4 by 4 grid, three RSUs, 400 m radio setting, traffic scenarios, and assumed onboard message-check time. They should be tested on other road layouts and with measured onboard processing times before being generalized to real emergency deployments.</w:t>
+        <w:t>These findings apply to the simulated 4 by 4 grid, three RSUs, 400 m radio setting, traffic scenarios, and controlled stall model. They should be tested on other road layouts and with measured onboard processing times before being generalized to real emergency deployments.</w:t>
       </w:r>
     </w:p>
     <w:p>
@@ -3814,12 +6145,17 @@
     </w:p>
     <w:p>
       <w:r>
-        <w:t>Each bar is a mean for one configuration at one density. Error bars show the 95% confidence interval; the method used for each metric is specified in docs/METHODOLOGY.md. PDR and EM throughput include all 30 scheduled runs. Delivery-dependent measures use only runs with a delivered emergency message. A graph can contain fewer than four bars when a metric applies only to dynamic routing or fallback.</w:t>
+        <w:t>Each bar is a mean for one configuration at one density. Error bars show the 95% confidence interval; the method used for each metric is specified in docs/METHODOLOGY.md. PDR and EM throughput include all 30 scheduled runs. Delivery-dependent measures use only runs with a delivered emergency message. A graph can contain fewer than four bars when a metric applies only to dynamic routing or fallback. Only the waiting graphs add a fifth bar for the no-preemption control.</w:t>
       </w:r>
     </w:p>
     <w:p>
       <w:r>
-        <w:t>There is no low-traffic fallback decision-latency graph because none of the 30 low-traffic Mist with Fog runs needed a takeover. That latency has no value there. The following gallery contains all 47 result graphs.</w:t>
+        <w:t>The following gallery contains all 48 result graphs.</w:t>
+      </w:r>
+    </w:p>
+    <w:p>
+      <w:r>
+        <w:br w:type="page"/>
       </w:r>
     </w:p>
     <w:p>
@@ -3839,6 +6175,9 @@
       </w:r>
     </w:p>
     <w:p>
+      <w:pPr>
+        <w:keepNext/>
+      </w:pPr>
       <w:r>
         <w:t>The share of generated emergency messages that reached the EV. Higher is better.</w:t>
       </w:r>
@@ -3852,7 +6191,7 @@
         <w:drawing>
           <wp:inline xmlns:a="http://schemas.openxmlformats.org/drawingml/2006/main" xmlns:pic="http://schemas.openxmlformats.org/drawingml/2006/picture">
             <wp:extent cx="5577840" cy="3053133"/>
-            <wp:docPr id="1" name="Picture 1"/>
+            <wp:docPr id="1" name="Picture 1" descr="Packet delivery ratio. Low traffic (72 background vehicles): Fog/Cloud 0.800; Mist 0.800; Mist Dynamic 0.800; Mist + Fog 0.800. Bars show means and 95% confidence intervals."/>
             <wp:cNvGraphicFramePr>
               <a:graphicFrameLocks noChangeAspect="1"/>
             </wp:cNvGraphicFramePr>
@@ -3901,7 +6240,7 @@
         <w:drawing>
           <wp:inline xmlns:a="http://schemas.openxmlformats.org/drawingml/2006/main" xmlns:pic="http://schemas.openxmlformats.org/drawingml/2006/picture">
             <wp:extent cx="5577840" cy="3053133"/>
-            <wp:docPr id="2" name="Picture 2"/>
+            <wp:docPr id="2" name="Picture 2" descr="Packet delivery ratio. Medium traffic (144 background vehicles): Fog/Cloud 0.967; Mist 0.967; Mist Dynamic 0.967; Mist + Fog 0.967. Bars show means and 95% confidence intervals."/>
             <wp:cNvGraphicFramePr>
               <a:graphicFrameLocks noChangeAspect="1"/>
             </wp:cNvGraphicFramePr>
@@ -3950,7 +6289,7 @@
         <w:drawing>
           <wp:inline xmlns:a="http://schemas.openxmlformats.org/drawingml/2006/main" xmlns:pic="http://schemas.openxmlformats.org/drawingml/2006/picture">
             <wp:extent cx="5577840" cy="3053133"/>
-            <wp:docPr id="3" name="Picture 3"/>
+            <wp:docPr id="3" name="Picture 3" descr="Packet delivery ratio. High traffic (200 background vehicles): Fog/Cloud 1.000; Mist 1.000; Mist Dynamic 1.000; Mist + Fog 1.000. Bars show means and 95% confidence intervals."/>
             <wp:cNvGraphicFramePr>
               <a:graphicFrameLocks noChangeAspect="1"/>
             </wp:cNvGraphicFramePr>
@@ -3999,6 +6338,9 @@
       </w:r>
     </w:p>
     <w:p>
+      <w:pPr>
+        <w:keepNext/>
+      </w:pPr>
       <w:r>
         <w:t>Control and EM transmissions per delivered emergency message. Lower means less communication overhead.</w:t>
       </w:r>
@@ -4012,7 +6354,7 @@
         <w:drawing>
           <wp:inline xmlns:a="http://schemas.openxmlformats.org/drawingml/2006/main" xmlns:pic="http://schemas.openxmlformats.org/drawingml/2006/picture">
             <wp:extent cx="5577840" cy="3053133"/>
-            <wp:docPr id="4" name="Picture 4"/>
+            <wp:docPr id="4" name="Picture 4" descr="Normalized routing load. Low traffic (72 background vehicles): Fog/Cloud 22,039; Mist 22,046; Mist Dynamic 22,038; Mist + Fog 22,033. Bars show means and 95% confidence intervals."/>
             <wp:cNvGraphicFramePr>
               <a:graphicFrameLocks noChangeAspect="1"/>
             </wp:cNvGraphicFramePr>
@@ -4049,7 +6391,7 @@
         <w:spacing w:after="200"/>
       </w:pPr>
       <w:r>
-        <w:t>Figure 4. Low traffic (72 background vehicles): Fog/Cloud 22,035; Mist 22,025; Mist Dynamic 22,051; Mist + Fog 22,051. Bars show means and 95% confidence intervals.</w:t>
+        <w:t>Figure 4. Low traffic (72 background vehicles): Fog/Cloud 22,039; Mist 22,046; Mist Dynamic 22,038; Mist + Fog 22,033. Bars show means and 95% confidence intervals.</w:t>
       </w:r>
     </w:p>
     <w:p>
@@ -4061,7 +6403,7 @@
         <w:drawing>
           <wp:inline xmlns:a="http://schemas.openxmlformats.org/drawingml/2006/main" xmlns:pic="http://schemas.openxmlformats.org/drawingml/2006/picture">
             <wp:extent cx="5577840" cy="3053133"/>
-            <wp:docPr id="5" name="Picture 5"/>
+            <wp:docPr id="5" name="Picture 5" descr="Normalized routing load. Medium traffic (144 background vehicles): Fog/Cloud 39,771; Mist 39,739; Mist Dynamic 39,766; Mist + Fog 39,738. Bars show means and 95% confidence intervals."/>
             <wp:cNvGraphicFramePr>
               <a:graphicFrameLocks noChangeAspect="1"/>
             </wp:cNvGraphicFramePr>
@@ -4098,7 +6440,7 @@
         <w:spacing w:after="200"/>
       </w:pPr>
       <w:r>
-        <w:t>Figure 5. Medium traffic (144 background vehicles): Fog/Cloud 39,860; Mist 39,898; Mist Dynamic 39,899; Mist + Fog 39,918. Bars show means and 95% confidence intervals.</w:t>
+        <w:t>Figure 5. Medium traffic (144 background vehicles): Fog/Cloud 39,771; Mist 39,739; Mist Dynamic 39,766; Mist + Fog 39,738. Bars show means and 95% confidence intervals.</w:t>
       </w:r>
     </w:p>
     <w:p>
@@ -4110,7 +6452,7 @@
         <w:drawing>
           <wp:inline xmlns:a="http://schemas.openxmlformats.org/drawingml/2006/main" xmlns:pic="http://schemas.openxmlformats.org/drawingml/2006/picture">
             <wp:extent cx="5577840" cy="3053133"/>
-            <wp:docPr id="6" name="Picture 6"/>
+            <wp:docPr id="6" name="Picture 6" descr="Normalized routing load. High traffic (200 background vehicles): Fog/Cloud 54,379; Mist 54,257; Mist Dynamic 54,211; Mist + Fog 54,257. Bars show means and 95% confidence intervals."/>
             <wp:cNvGraphicFramePr>
               <a:graphicFrameLocks noChangeAspect="1"/>
             </wp:cNvGraphicFramePr>
@@ -4147,7 +6489,7 @@
         <w:spacing w:after="200"/>
       </w:pPr>
       <w:r>
-        <w:t>Figure 6. High traffic (200 background vehicles): Fog/Cloud 54,479; Mist 54,432; Mist Dynamic 54,453; Mist + Fog 54,463. Bars show means and 95% confidence intervals.</w:t>
+        <w:t>Figure 6. High traffic (200 background vehicles): Fog/Cloud 54,379; Mist 54,257; Mist Dynamic 54,211; Mist + Fog 54,257. Bars show means and 95% confidence intervals.</w:t>
       </w:r>
     </w:p>
     <w:p>
@@ -4159,6 +6501,9 @@
       </w:r>
     </w:p>
     <w:p>
+      <w:pPr>
+        <w:keepNext/>
+      </w:pPr>
       <w:r>
         <w:t>Delivered EM payload bits divided by the fixed 900 second observation window. One delivery contributes 2.27556 bit/s.</w:t>
       </w:r>
@@ -4172,7 +6517,7 @@
         <w:drawing>
           <wp:inline xmlns:a="http://schemas.openxmlformats.org/drawingml/2006/main" xmlns:pic="http://schemas.openxmlformats.org/drawingml/2006/picture">
             <wp:extent cx="5577840" cy="3053133"/>
-            <wp:docPr id="7" name="Picture 7"/>
+            <wp:docPr id="7" name="Picture 7" descr="EM throughput. Low traffic (72 background vehicles): Fog/Cloud 1.820; Mist 1.820; Mist Dynamic 1.820; Mist + Fog 1.820. Bars show means and 95% confidence intervals."/>
             <wp:cNvGraphicFramePr>
               <a:graphicFrameLocks noChangeAspect="1"/>
             </wp:cNvGraphicFramePr>
@@ -4221,7 +6566,7 @@
         <w:drawing>
           <wp:inline xmlns:a="http://schemas.openxmlformats.org/drawingml/2006/main" xmlns:pic="http://schemas.openxmlformats.org/drawingml/2006/picture">
             <wp:extent cx="5577840" cy="3053133"/>
-            <wp:docPr id="8" name="Picture 8"/>
+            <wp:docPr id="8" name="Picture 8" descr="EM throughput. Medium traffic (144 background vehicles): Fog/Cloud 2.200; Mist 2.200; Mist Dynamic 2.200; Mist + Fog 2.200. Bars show means and 95% confidence intervals."/>
             <wp:cNvGraphicFramePr>
               <a:graphicFrameLocks noChangeAspect="1"/>
             </wp:cNvGraphicFramePr>
@@ -4270,7 +6615,7 @@
         <w:drawing>
           <wp:inline xmlns:a="http://schemas.openxmlformats.org/drawingml/2006/main" xmlns:pic="http://schemas.openxmlformats.org/drawingml/2006/picture">
             <wp:extent cx="5577840" cy="3053133"/>
-            <wp:docPr id="9" name="Picture 9"/>
+            <wp:docPr id="9" name="Picture 9" descr="EM throughput. High traffic (200 background vehicles): Fog/Cloud 2.276; Mist 2.276; Mist Dynamic 2.276; Mist + Fog 2.276. Bars show means and 95% confidence intervals."/>
             <wp:cNvGraphicFramePr>
               <a:graphicFrameLocks noChangeAspect="1"/>
             </wp:cNvGraphicFramePr>
@@ -4319,6 +6664,9 @@
       </w:r>
     </w:p>
     <w:p>
+      <w:pPr>
+        <w:keepNext/>
+      </w:pPr>
       <w:r>
         <w:t>Time from RSU message generation to EV reception, in milliseconds. Lower is faster.</w:t>
       </w:r>
@@ -4332,7 +6680,7 @@
         <w:drawing>
           <wp:inline xmlns:a="http://schemas.openxmlformats.org/drawingml/2006/main" xmlns:pic="http://schemas.openxmlformats.org/drawingml/2006/picture">
             <wp:extent cx="5577840" cy="3053133"/>
-            <wp:docPr id="10" name="Picture 10"/>
+            <wp:docPr id="10" name="Picture 10" descr="EM end-to-end delay. Low traffic (72 background vehicles): Fog/Cloud 44.4; Mist 44.4; Mist Dynamic 44.4; Mist + Fog 44.4. Bars show means and 95% confidence intervals."/>
             <wp:cNvGraphicFramePr>
               <a:graphicFrameLocks noChangeAspect="1"/>
             </wp:cNvGraphicFramePr>
@@ -4381,7 +6729,7 @@
         <w:drawing>
           <wp:inline xmlns:a="http://schemas.openxmlformats.org/drawingml/2006/main" xmlns:pic="http://schemas.openxmlformats.org/drawingml/2006/picture">
             <wp:extent cx="5577840" cy="3053133"/>
-            <wp:docPr id="11" name="Picture 11"/>
+            <wp:docPr id="11" name="Picture 11" descr="EM end-to-end delay. Medium traffic (144 background vehicles): Fog/Cloud 37.1; Mist 37.1; Mist Dynamic 37.1; Mist + Fog 37.1. Bars show means and 95% confidence intervals."/>
             <wp:cNvGraphicFramePr>
               <a:graphicFrameLocks noChangeAspect="1"/>
             </wp:cNvGraphicFramePr>
@@ -4430,7 +6778,7 @@
         <w:drawing>
           <wp:inline xmlns:a="http://schemas.openxmlformats.org/drawingml/2006/main" xmlns:pic="http://schemas.openxmlformats.org/drawingml/2006/picture">
             <wp:extent cx="5577840" cy="3053133"/>
-            <wp:docPr id="12" name="Picture 12"/>
+            <wp:docPr id="12" name="Picture 12" descr="EM end-to-end delay. High traffic (200 background vehicles): Fog/Cloud 32.2; Mist 32.2; Mist Dynamic 32.2; Mist + Fog 32.2. Bars show means and 95% confidence intervals."/>
             <wp:cNvGraphicFramePr>
               <a:graphicFrameLocks noChangeAspect="1"/>
             </wp:cNvGraphicFramePr>
@@ -4479,6 +6827,9 @@
       </w:r>
     </w:p>
     <w:p>
+      <w:pPr>
+        <w:keepNext/>
+      </w:pPr>
       <w:r>
         <w:t>Time from EV message reception to the initial route being applied, in milliseconds.</w:t>
       </w:r>
@@ -4492,7 +6843,7 @@
         <w:drawing>
           <wp:inline xmlns:a="http://schemas.openxmlformats.org/drawingml/2006/main" xmlns:pic="http://schemas.openxmlformats.org/drawingml/2006/picture">
             <wp:extent cx="5577840" cy="3053133"/>
-            <wp:docPr id="13" name="Picture 13"/>
+            <wp:docPr id="13" name="Picture 13" descr="Route decision latency. Low traffic (72 background vehicles): Fog/Cloud 626.5; Mist 588.5; Mist Dynamic 588.5; Mist + Fog 472.0. Bars show means and 95% confidence intervals."/>
             <wp:cNvGraphicFramePr>
               <a:graphicFrameLocks noChangeAspect="1"/>
             </wp:cNvGraphicFramePr>
@@ -4529,7 +6880,7 @@
         <w:spacing w:after="200"/>
       </w:pPr>
       <w:r>
-        <w:t>Figure 13. Low traffic (72 background vehicles): Fog/Cloud 626.5; Mist 625.2; Mist Dynamic 625.2; Mist + Fog 625.2. Bars show means and 95% confidence intervals.</w:t>
+        <w:t>Figure 13. Low traffic (72 background vehicles): Fog/Cloud 626.5; Mist 588.5; Mist Dynamic 588.5; Mist + Fog 472.0. Bars show means and 95% confidence intervals.</w:t>
       </w:r>
     </w:p>
     <w:p>
@@ -4541,7 +6892,7 @@
         <w:drawing>
           <wp:inline xmlns:a="http://schemas.openxmlformats.org/drawingml/2006/main" xmlns:pic="http://schemas.openxmlformats.org/drawingml/2006/picture">
             <wp:extent cx="5577840" cy="3053133"/>
-            <wp:docPr id="14" name="Picture 14"/>
+            <wp:docPr id="14" name="Picture 14" descr="Route decision latency. Medium traffic (144 background vehicles): Fog/Cloud 626.5; Mist 574.3; Mist Dynamic 574.3; Mist + Fog 464.1. Bars show means and 95% confidence intervals."/>
             <wp:cNvGraphicFramePr>
               <a:graphicFrameLocks noChangeAspect="1"/>
             </wp:cNvGraphicFramePr>
@@ -4578,7 +6929,7 @@
         <w:spacing w:after="200"/>
       </w:pPr>
       <w:r>
-        <w:t>Figure 14. Medium traffic (144 background vehicles): Fog/Cloud 626.5; Mist 844.6; Mist Dynamic 844.6; Mist + Fog 946.4. Bars show means and 95% confidence intervals.</w:t>
+        <w:t>Figure 14. Medium traffic (144 background vehicles): Fog/Cloud 626.5; Mist 574.3; Mist Dynamic 574.3; Mist + Fog 464.1. Bars show means and 95% confidence intervals.</w:t>
       </w:r>
     </w:p>
     <w:p>
@@ -4590,7 +6941,7 @@
         <w:drawing>
           <wp:inline xmlns:a="http://schemas.openxmlformats.org/drawingml/2006/main" xmlns:pic="http://schemas.openxmlformats.org/drawingml/2006/picture">
             <wp:extent cx="5577840" cy="3053133"/>
-            <wp:docPr id="15" name="Picture 15"/>
+            <wp:docPr id="15" name="Picture 15" descr="Route decision latency. High traffic (200 background vehicles): Fog/Cloud 626.5; Mist 566.0; Mist Dynamic 566.0; Mist + Fog 459.5. Bars show means and 95% confidence intervals."/>
             <wp:cNvGraphicFramePr>
               <a:graphicFrameLocks noChangeAspect="1"/>
             </wp:cNvGraphicFramePr>
@@ -4627,7 +6978,7 @@
         <w:spacing w:after="200"/>
       </w:pPr>
       <w:r>
-        <w:t>Figure 15. High traffic (200 background vehicles): Fog/Cloud 626.5; Mist 1075.3; Mist Dynamic 1075.3; Mist + Fog 1087.2. Bars show means and 95% confidence intervals.</w:t>
+        <w:t>Figure 15. High traffic (200 background vehicles): Fog/Cloud 626.5; Mist 566.0; Mist Dynamic 566.0; Mist + Fog 459.5. Bars show means and 95% confidence intervals.</w:t>
       </w:r>
     </w:p>
     <w:p>
@@ -4639,6 +6990,9 @@
       </w:r>
     </w:p>
     <w:p>
+      <w:pPr>
+        <w:keepNext/>
+      </w:pPr>
       <w:r>
         <w:t>Time from emergency message generation until the EV reaches the accident, in seconds.</w:t>
       </w:r>
@@ -4652,7 +7006,7 @@
         <w:drawing>
           <wp:inline xmlns:a="http://schemas.openxmlformats.org/drawingml/2006/main" xmlns:pic="http://schemas.openxmlformats.org/drawingml/2006/picture">
             <wp:extent cx="5577840" cy="3053133"/>
-            <wp:docPr id="16" name="Picture 16"/>
+            <wp:docPr id="16" name="Picture 16" descr="EV response time. Low traffic (72 background vehicles): Fog/Cloud 153.3; Mist 153.1; Mist Dynamic 152.5; Mist + Fog 152.5. Bars show means and 95% confidence intervals."/>
             <wp:cNvGraphicFramePr>
               <a:graphicFrameLocks noChangeAspect="1"/>
             </wp:cNvGraphicFramePr>
@@ -4689,7 +7043,7 @@
         <w:spacing w:after="200"/>
       </w:pPr>
       <w:r>
-        <w:t>Figure 16. Low traffic (72 background vehicles): Fog/Cloud 141.7; Mist 141.6; Mist Dynamic 141.7; Mist + Fog 141.7. Bars show means and 95% confidence intervals.</w:t>
+        <w:t>Figure 16. Low traffic (72 background vehicles): Fog/Cloud 153.3; Mist 153.1; Mist Dynamic 152.5; Mist + Fog 152.5. Bars show means and 95% confidence intervals.</w:t>
       </w:r>
     </w:p>
     <w:p>
@@ -4701,7 +7055,7 @@
         <w:drawing>
           <wp:inline xmlns:a="http://schemas.openxmlformats.org/drawingml/2006/main" xmlns:pic="http://schemas.openxmlformats.org/drawingml/2006/picture">
             <wp:extent cx="5577840" cy="3053133"/>
-            <wp:docPr id="17" name="Picture 17"/>
+            <wp:docPr id="17" name="Picture 17" descr="EV response time. Medium traffic (144 background vehicles): Fog/Cloud 154.6; Mist 155.5; Mist Dynamic 154.4; Mist + Fog 154.1. Bars show means and 95% confidence intervals."/>
             <wp:cNvGraphicFramePr>
               <a:graphicFrameLocks noChangeAspect="1"/>
             </wp:cNvGraphicFramePr>
@@ -4738,7 +7092,7 @@
         <w:spacing w:after="200"/>
       </w:pPr>
       <w:r>
-        <w:t>Figure 17. Medium traffic (144 background vehicles): Fog/Cloud 141.5; Mist 141.7; Mist Dynamic 141.7; Mist + Fog 141.9. Bars show means and 95% confidence intervals.</w:t>
+        <w:t>Figure 17. Medium traffic (144 background vehicles): Fog/Cloud 154.6; Mist 155.5; Mist Dynamic 154.4; Mist + Fog 154.1. Bars show means and 95% confidence intervals.</w:t>
       </w:r>
     </w:p>
     <w:p>
@@ -4750,7 +7104,7 @@
         <w:drawing>
           <wp:inline xmlns:a="http://schemas.openxmlformats.org/drawingml/2006/main" xmlns:pic="http://schemas.openxmlformats.org/drawingml/2006/picture">
             <wp:extent cx="5577840" cy="3053133"/>
-            <wp:docPr id="18" name="Picture 18"/>
+            <wp:docPr id="18" name="Picture 18" descr="EV response time. High traffic (200 background vehicles): Fog/Cloud 156.3; Mist 157.0; Mist Dynamic 154.4; Mist + Fog 154.3. Bars show means and 95% confidence intervals."/>
             <wp:cNvGraphicFramePr>
               <a:graphicFrameLocks noChangeAspect="1"/>
             </wp:cNvGraphicFramePr>
@@ -4787,7 +7141,7 @@
         <w:spacing w:after="200"/>
       </w:pPr>
       <w:r>
-        <w:t>Figure 18. High traffic (200 background vehicles): Fog/Cloud 142.5; Mist 142.7; Mist Dynamic 142.7; Mist + Fog 142.8. Bars show means and 95% confidence intervals.</w:t>
+        <w:t>Figure 18. High traffic (200 background vehicles): Fog/Cloud 156.3; Mist 157.0; Mist Dynamic 154.4; Mist + Fog 154.3. Bars show means and 95% confidence intervals.</w:t>
       </w:r>
     </w:p>
     <w:p>
@@ -4799,6 +7153,9 @@
       </w:r>
     </w:p>
     <w:p>
+      <w:pPr>
+        <w:keepNext/>
+      </w:pPr>
       <w:r>
         <w:t>EV standstill near a signal stop line, in seconds. A value of zero means no measured wait.</w:t>
       </w:r>
@@ -4812,7 +7169,7 @@
         <w:drawing>
           <wp:inline xmlns:a="http://schemas.openxmlformats.org/drawingml/2006/main" xmlns:pic="http://schemas.openxmlformats.org/drawingml/2006/picture">
             <wp:extent cx="5577840" cy="3053133"/>
-            <wp:docPr id="19" name="Picture 19"/>
+            <wp:docPr id="19" name="Picture 19" descr="EV traffic-light waiting time. Low traffic (72 background vehicles): Fog/Cloud 1.5; Mist 1.6; Mist Dynamic 2.0; Mist + Fog 2.0; No preemption 26.3. Bars show means and 95% confidence intervals."/>
             <wp:cNvGraphicFramePr>
               <a:graphicFrameLocks noChangeAspect="1"/>
             </wp:cNvGraphicFramePr>
@@ -4849,7 +7206,7 @@
         <w:spacing w:after="200"/>
       </w:pPr>
       <w:r>
-        <w:t>Figure 19. Low traffic (72 background vehicles): Fog/Cloud 0.0; Mist 0.0; Mist Dynamic 0.0; Mist + Fog 0.0. Bars show means and 95% confidence intervals.</w:t>
+        <w:t>Figure 19. Low traffic (72 background vehicles): Fog/Cloud 1.5; Mist 1.6; Mist Dynamic 2.0; Mist + Fog 2.0; No preemption 26.3. Bars show means and 95% confidence intervals.</w:t>
       </w:r>
     </w:p>
     <w:p>
@@ -4861,7 +7218,7 @@
         <w:drawing>
           <wp:inline xmlns:a="http://schemas.openxmlformats.org/drawingml/2006/main" xmlns:pic="http://schemas.openxmlformats.org/drawingml/2006/picture">
             <wp:extent cx="5577840" cy="3053133"/>
-            <wp:docPr id="20" name="Picture 20"/>
+            <wp:docPr id="20" name="Picture 20" descr="EV traffic-light waiting time. Medium traffic (144 background vehicles): Fog/Cloud 0.9; Mist 1.6; Mist Dynamic 1.7; Mist + Fog 1.7; No preemption 27.3. Bars show means and 95% confidence intervals."/>
             <wp:cNvGraphicFramePr>
               <a:graphicFrameLocks noChangeAspect="1"/>
             </wp:cNvGraphicFramePr>
@@ -4898,7 +7255,7 @@
         <w:spacing w:after="200"/>
       </w:pPr>
       <w:r>
-        <w:t>Figure 20. Medium traffic (144 background vehicles): Fog/Cloud 0.0; Mist 0.0; Mist Dynamic 0.0; Mist + Fog 0.0. Bars show means and 95% confidence intervals.</w:t>
+        <w:t>Figure 20. Medium traffic (144 background vehicles): Fog/Cloud 0.9; Mist 1.6; Mist Dynamic 1.7; Mist + Fog 1.7; No preemption 27.3. Bars show means and 95% confidence intervals.</w:t>
       </w:r>
     </w:p>
     <w:p>
@@ -4910,7 +7267,7 @@
         <w:drawing>
           <wp:inline xmlns:a="http://schemas.openxmlformats.org/drawingml/2006/main" xmlns:pic="http://schemas.openxmlformats.org/drawingml/2006/picture">
             <wp:extent cx="5577840" cy="3053133"/>
-            <wp:docPr id="21" name="Picture 21"/>
+            <wp:docPr id="21" name="Picture 21" descr="EV traffic-light waiting time. High traffic (200 background vehicles): Fog/Cloud 0.7; Mist 0.6; Mist Dynamic 0.7; Mist + Fog 0.6; No preemption 22.7. Bars show means and 95% confidence intervals."/>
             <wp:cNvGraphicFramePr>
               <a:graphicFrameLocks noChangeAspect="1"/>
             </wp:cNvGraphicFramePr>
@@ -4947,7 +7304,7 @@
         <w:spacing w:after="200"/>
       </w:pPr>
       <w:r>
-        <w:t>Figure 21. High traffic (200 background vehicles): Fog/Cloud 0.0; Mist 0.0; Mist Dynamic 0.1; Mist + Fog 0.1. Bars show means and 95% confidence intervals.</w:t>
+        <w:t>Figure 21. High traffic (200 background vehicles): Fog/Cloud 0.7; Mist 0.6; Mist Dynamic 0.7; Mist + Fog 0.6; No preemption 22.7. Bars show means and 95% confidence intervals.</w:t>
       </w:r>
     </w:p>
     <w:p>
@@ -4959,8 +7316,11 @@
       </w:r>
     </w:p>
     <w:p>
+      <w:pPr>
+        <w:keepNext/>
+      </w:pPr>
       <w:r>
-        <w:t>Share of fallback-configuration runs where the 800 ms Mist watchdog requested Fog.</w:t>
+        <w:t>Share of Mist with Fog runs where the 500 ms watchdog requested Fog. Controlled stalls are explicitly injected in eight of the 30 seeds.</w:t>
       </w:r>
     </w:p>
     <w:p>
@@ -4972,7 +7332,7 @@
         <w:drawing>
           <wp:inline xmlns:a="http://schemas.openxmlformats.org/drawingml/2006/main" xmlns:pic="http://schemas.openxmlformats.org/drawingml/2006/picture">
             <wp:extent cx="5577840" cy="3053133"/>
-            <wp:docPr id="22" name="Picture 22"/>
+            <wp:docPr id="22" name="Picture 22" descr="Fallback activation rate. Low traffic (72 background vehicles): Mist + Fog 0.233. Bars show means and 95% confidence intervals."/>
             <wp:cNvGraphicFramePr>
               <a:graphicFrameLocks noChangeAspect="1"/>
             </wp:cNvGraphicFramePr>
@@ -5009,7 +7369,7 @@
         <w:spacing w:after="200"/>
       </w:pPr>
       <w:r>
-        <w:t>Figure 22. Low traffic (72 background vehicles): Mist + Fog 0.000. Bars show means and 95% confidence intervals.</w:t>
+        <w:t>Figure 22. Low traffic (72 background vehicles): Mist + Fog 0.233. Bars show means and 95% confidence intervals.</w:t>
       </w:r>
     </w:p>
     <w:p>
@@ -5021,7 +7381,7 @@
         <w:drawing>
           <wp:inline xmlns:a="http://schemas.openxmlformats.org/drawingml/2006/main" xmlns:pic="http://schemas.openxmlformats.org/drawingml/2006/picture">
             <wp:extent cx="5577840" cy="3053133"/>
-            <wp:docPr id="23" name="Picture 23"/>
+            <wp:docPr id="23" name="Picture 23" descr="Fallback activation rate. Medium traffic (144 background vehicles): Mist + Fog 0.267. Bars show means and 95% confidence intervals."/>
             <wp:cNvGraphicFramePr>
               <a:graphicFrameLocks noChangeAspect="1"/>
             </wp:cNvGraphicFramePr>
@@ -5058,7 +7418,7 @@
         <w:spacing w:after="200"/>
       </w:pPr>
       <w:r>
-        <w:t>Figure 23. Medium traffic (144 background vehicles): Mist + Fog 0.600. Bars show means and 95% confidence intervals.</w:t>
+        <w:t>Figure 23. Medium traffic (144 background vehicles): Mist + Fog 0.267. Bars show means and 95% confidence intervals.</w:t>
       </w:r>
     </w:p>
     <w:p>
@@ -5070,7 +7430,7 @@
         <w:drawing>
           <wp:inline xmlns:a="http://schemas.openxmlformats.org/drawingml/2006/main" xmlns:pic="http://schemas.openxmlformats.org/drawingml/2006/picture">
             <wp:extent cx="5577840" cy="3053133"/>
-            <wp:docPr id="24" name="Picture 24"/>
+            <wp:docPr id="24" name="Picture 24" descr="Fallback activation rate. High traffic (200 background vehicles): Mist + Fog 0.267. Bars show means and 95% confidence intervals."/>
             <wp:cNvGraphicFramePr>
               <a:graphicFrameLocks noChangeAspect="1"/>
             </wp:cNvGraphicFramePr>
@@ -5107,7 +7467,7 @@
         <w:spacing w:after="200"/>
       </w:pPr>
       <w:r>
-        <w:t>Figure 24. High traffic (200 background vehicles): Mist + Fog 0.900. Bars show means and 95% confidence intervals.</w:t>
+        <w:t>Figure 24. High traffic (200 background vehicles): Mist + Fog 0.267. Bars show means and 95% confidence intervals.</w:t>
       </w:r>
     </w:p>
     <w:p>
@@ -5119,6 +7479,9 @@
       </w:r>
     </w:p>
     <w:p>
+      <w:pPr>
+        <w:keepNext/>
+      </w:pPr>
       <w:r>
         <w:t>Mean number of actual congestion or cost reroutes per run. Reviews without a replacement are excluded.</w:t>
       </w:r>
@@ -5132,7 +7495,7 @@
         <w:drawing>
           <wp:inline xmlns:a="http://schemas.openxmlformats.org/drawingml/2006/main" xmlns:pic="http://schemas.openxmlformats.org/drawingml/2006/picture">
             <wp:extent cx="5577840" cy="3053133"/>
-            <wp:docPr id="25" name="Picture 25"/>
+            <wp:docPr id="25" name="Picture 25" descr="Applied route changes. Low traffic (72 background vehicles): Mist Dynamic 0.13; Mist + Fog 0.13. Bars show means and 95% confidence intervals."/>
             <wp:cNvGraphicFramePr>
               <a:graphicFrameLocks noChangeAspect="1"/>
             </wp:cNvGraphicFramePr>
@@ -5169,7 +7532,7 @@
         <w:spacing w:after="200"/>
       </w:pPr>
       <w:r>
-        <w:t>Figure 25. Low traffic (72 background vehicles): Mist Dynamic 0.10; Mist + Fog 0.10. Bars show means and 95% confidence intervals.</w:t>
+        <w:t>Figure 25. Low traffic (72 background vehicles): Mist Dynamic 0.13; Mist + Fog 0.13. Bars show means and 95% confidence intervals.</w:t>
       </w:r>
     </w:p>
     <w:p>
@@ -5181,7 +7544,7 @@
         <w:drawing>
           <wp:inline xmlns:a="http://schemas.openxmlformats.org/drawingml/2006/main" xmlns:pic="http://schemas.openxmlformats.org/drawingml/2006/picture">
             <wp:extent cx="5577840" cy="3053133"/>
-            <wp:docPr id="26" name="Picture 26"/>
+            <wp:docPr id="26" name="Picture 26" descr="Applied route changes. Medium traffic (144 background vehicles): Mist Dynamic 0.23; Mist + Fog 0.27. Bars show means and 95% confidence intervals."/>
             <wp:cNvGraphicFramePr>
               <a:graphicFrameLocks noChangeAspect="1"/>
             </wp:cNvGraphicFramePr>
@@ -5218,7 +7581,7 @@
         <w:spacing w:after="200"/>
       </w:pPr>
       <w:r>
-        <w:t>Figure 26. Medium traffic (144 background vehicles): Mist Dynamic 0.20; Mist + Fog 0.17. Bars show means and 95% confidence intervals.</w:t>
+        <w:t>Figure 26. Medium traffic (144 background vehicles): Mist Dynamic 0.23; Mist + Fog 0.27. Bars show means and 95% confidence intervals.</w:t>
       </w:r>
     </w:p>
     <w:p>
@@ -5230,7 +7593,7 @@
         <w:drawing>
           <wp:inline xmlns:a="http://schemas.openxmlformats.org/drawingml/2006/main" xmlns:pic="http://schemas.openxmlformats.org/drawingml/2006/picture">
             <wp:extent cx="5577840" cy="3053133"/>
-            <wp:docPr id="27" name="Picture 27"/>
+            <wp:docPr id="27" name="Picture 27" descr="Applied route changes. High traffic (200 background vehicles): Mist Dynamic 0.33; Mist + Fog 0.33. Bars show means and 95% confidence intervals."/>
             <wp:cNvGraphicFramePr>
               <a:graphicFrameLocks noChangeAspect="1"/>
             </wp:cNvGraphicFramePr>
@@ -5267,7 +7630,7 @@
         <w:spacing w:after="200"/>
       </w:pPr>
       <w:r>
-        <w:t>Figure 27. High traffic (200 background vehicles): Mist Dynamic 0.20; Mist + Fog 0.17. Bars show means and 95% confidence intervals.</w:t>
+        <w:t>Figure 27. High traffic (200 background vehicles): Mist Dynamic 0.33; Mist + Fog 0.33. Bars show means and 95% confidence intervals.</w:t>
       </w:r>
     </w:p>
     <w:p>
@@ -5279,6 +7642,9 @@
       </w:r>
     </w:p>
     <w:p>
+      <w:pPr>
+        <w:keepNext/>
+      </w:pPr>
       <w:r>
         <w:t>Mean number of periodic Dynamic A* route evaluations per run, normally scheduled every five seconds.</w:t>
       </w:r>
@@ -5292,7 +7658,7 @@
         <w:drawing>
           <wp:inline xmlns:a="http://schemas.openxmlformats.org/drawingml/2006/main" xmlns:pic="http://schemas.openxmlformats.org/drawingml/2006/picture">
             <wp:extent cx="5577840" cy="3053133"/>
-            <wp:docPr id="28" name="Picture 28"/>
+            <wp:docPr id="28" name="Picture 28" descr="Route computation frequency. Low traffic (72 background vehicles): Mist Dynamic 21.90; Mist + Fog 22.00. Bars show means and 95% confidence intervals."/>
             <wp:cNvGraphicFramePr>
               <a:graphicFrameLocks noChangeAspect="1"/>
             </wp:cNvGraphicFramePr>
@@ -5329,7 +7695,7 @@
         <w:spacing w:after="200"/>
       </w:pPr>
       <w:r>
-        <w:t>Figure 28. Low traffic (72 background vehicles): Mist Dynamic 20.83; Mist + Fog 20.83. Bars show means and 95% confidence intervals.</w:t>
+        <w:t>Figure 28. Low traffic (72 background vehicles): Mist Dynamic 21.90; Mist + Fog 22.00. Bars show means and 95% confidence intervals.</w:t>
       </w:r>
     </w:p>
     <w:p>
@@ -5341,7 +7707,7 @@
         <w:drawing>
           <wp:inline xmlns:a="http://schemas.openxmlformats.org/drawingml/2006/main" xmlns:pic="http://schemas.openxmlformats.org/drawingml/2006/picture">
             <wp:extent cx="5577840" cy="3053133"/>
-            <wp:docPr id="29" name="Picture 29"/>
+            <wp:docPr id="29" name="Picture 29" descr="Route computation frequency. Medium traffic (144 background vehicles): Mist Dynamic 27.33; Mist + Fog 27.17. Bars show means and 95% confidence intervals."/>
             <wp:cNvGraphicFramePr>
               <a:graphicFrameLocks noChangeAspect="1"/>
             </wp:cNvGraphicFramePr>
@@ -5378,7 +7744,7 @@
         <w:spacing w:after="200"/>
       </w:pPr>
       <w:r>
-        <w:t>Figure 29. Medium traffic (144 background vehicles): Mist Dynamic 25.27; Mist + Fog 25.27. Bars show means and 95% confidence intervals.</w:t>
+        <w:t>Figure 29. Medium traffic (144 background vehicles): Mist Dynamic 27.33; Mist + Fog 27.17. Bars show means and 95% confidence intervals.</w:t>
       </w:r>
     </w:p>
     <w:p>
@@ -5390,7 +7756,7 @@
         <w:drawing>
           <wp:inline xmlns:a="http://schemas.openxmlformats.org/drawingml/2006/main" xmlns:pic="http://schemas.openxmlformats.org/drawingml/2006/picture">
             <wp:extent cx="5577840" cy="3053133"/>
-            <wp:docPr id="30" name="Picture 30"/>
+            <wp:docPr id="30" name="Picture 30" descr="Route computation frequency. High traffic (200 background vehicles): Mist Dynamic 28.43; Mist + Fog 28.50. Bars show means and 95% confidence intervals."/>
             <wp:cNvGraphicFramePr>
               <a:graphicFrameLocks noChangeAspect="1"/>
             </wp:cNvGraphicFramePr>
@@ -5427,7 +7793,7 @@
         <w:spacing w:after="200"/>
       </w:pPr>
       <w:r>
-        <w:t>Figure 30. High traffic (200 background vehicles): Mist Dynamic 26.13; Mist + Fog 26.17. Bars show means and 95% confidence intervals.</w:t>
+        <w:t>Figure 30. High traffic (200 background vehicles): Mist Dynamic 28.43; Mist + Fog 28.50. Bars show means and 95% confidence intervals.</w:t>
       </w:r>
     </w:p>
     <w:p>
@@ -5439,6 +7805,9 @@
       </w:r>
     </w:p>
     <w:p>
+      <w:pPr>
+        <w:keepNext/>
+      </w:pPr>
       <w:r>
         <w:t>Time to apply the Fog route in runs where the watchdog actually triggered, in milliseconds.</w:t>
       </w:r>
@@ -5452,7 +7821,7 @@
         <w:drawing>
           <wp:inline xmlns:a="http://schemas.openxmlformats.org/drawingml/2006/main" xmlns:pic="http://schemas.openxmlformats.org/drawingml/2006/picture">
             <wp:extent cx="5577840" cy="3053133"/>
-            <wp:docPr id="31" name="Picture 31"/>
+            <wp:docPr id="31" name="Picture 31" descr="Fallback decision latency. Low traffic (72 background vehicles): Mist + Fog 826.5. Bars show means and 95% confidence intervals."/>
             <wp:cNvGraphicFramePr>
               <a:graphicFrameLocks noChangeAspect="1"/>
             </wp:cNvGraphicFramePr>
@@ -5460,7 +7829,7 @@
               <a:graphicData uri="http://schemas.openxmlformats.org/drawingml/2006/picture">
                 <pic:pic>
                   <pic:nvPicPr>
-                    <pic:cNvPr id="0" name="fallback_decision_ms-medium.png"/>
+                    <pic:cNvPr id="0" name="fallback_decision_ms-low.png"/>
                     <pic:cNvPicPr/>
                   </pic:nvPicPr>
                   <pic:blipFill>
@@ -5489,7 +7858,7 @@
         <w:spacing w:after="200"/>
       </w:pPr>
       <w:r>
-        <w:t>Figure 31. Medium traffic (144 background vehicles): Mist + Fog 1126.6. Bars show means and 95% confidence intervals.</w:t>
+        <w:t>Figure 31. Low traffic (72 background vehicles): Mist + Fog 826.5. Bars show means and 95% confidence intervals.</w:t>
       </w:r>
     </w:p>
     <w:p>
@@ -5501,7 +7870,7 @@
         <w:drawing>
           <wp:inline xmlns:a="http://schemas.openxmlformats.org/drawingml/2006/main" xmlns:pic="http://schemas.openxmlformats.org/drawingml/2006/picture">
             <wp:extent cx="5577840" cy="3053133"/>
-            <wp:docPr id="32" name="Picture 32"/>
+            <wp:docPr id="32" name="Picture 32" descr="Fallback decision latency. Medium traffic (144 background vehicles): Mist + Fog 826.6. Bars show means and 95% confidence intervals."/>
             <wp:cNvGraphicFramePr>
               <a:graphicFrameLocks noChangeAspect="1"/>
             </wp:cNvGraphicFramePr>
@@ -5509,7 +7878,7 @@
               <a:graphicData uri="http://schemas.openxmlformats.org/drawingml/2006/picture">
                 <pic:pic>
                   <pic:nvPicPr>
-                    <pic:cNvPr id="0" name="fallback_decision_ms-high.png"/>
+                    <pic:cNvPr id="0" name="fallback_decision_ms-medium.png"/>
                     <pic:cNvPicPr/>
                   </pic:nvPicPr>
                   <pic:blipFill>
@@ -5538,20 +7907,7 @@
         <w:spacing w:after="200"/>
       </w:pPr>
       <w:r>
-        <w:t>Figure 32. High traffic (200 background vehicles): Mist + Fog 1126.6. Bars show means and 95% confidence intervals.</w:t>
-      </w:r>
-    </w:p>
-    <w:p>
-      <w:pPr>
-        <w:pStyle w:val="Heading2"/>
-      </w:pPr>
-      <w:r>
-        <w:t>Control transmissions</w:t>
-      </w:r>
-    </w:p>
-    <w:p>
-      <w:r>
-        <w:t>Mean number of control-packet transmissions per run. This is supporting communication-load evidence.</w:t>
+        <w:t>Figure 32. Medium traffic (144 background vehicles): Mist + Fog 826.6. Bars show means and 95% confidence intervals.</w:t>
       </w:r>
     </w:p>
     <w:p>
@@ -5563,7 +7919,7 @@
         <w:drawing>
           <wp:inline xmlns:a="http://schemas.openxmlformats.org/drawingml/2006/main" xmlns:pic="http://schemas.openxmlformats.org/drawingml/2006/picture">
             <wp:extent cx="5577840" cy="3053133"/>
-            <wp:docPr id="33" name="Picture 33"/>
+            <wp:docPr id="33" name="Picture 33" descr="Fallback decision latency. High traffic (200 background vehicles): Mist + Fog 826.6. Bars show means and 95% confidence intervals."/>
             <wp:cNvGraphicFramePr>
               <a:graphicFrameLocks noChangeAspect="1"/>
             </wp:cNvGraphicFramePr>
@@ -5571,7 +7927,7 @@
               <a:graphicData uri="http://schemas.openxmlformats.org/drawingml/2006/picture">
                 <pic:pic>
                   <pic:nvPicPr>
-                    <pic:cNvPr id="0" name="control_transmissions-low.png"/>
+                    <pic:cNvPr id="0" name="fallback_decision_ms-high.png"/>
                     <pic:cNvPicPr/>
                   </pic:nvPicPr>
                   <pic:blipFill>
@@ -5600,7 +7956,23 @@
         <w:spacing w:after="200"/>
       </w:pPr>
       <w:r>
-        <w:t>Figure 33. Low traffic (72 background vehicles): Fog/Cloud 22,659; Mist 22,651; Mist Dynamic 22,672; Mist + Fog 22,672. Bars show means and 95% confidence intervals.</w:t>
+        <w:t>Figure 33. High traffic (200 background vehicles): Mist + Fog 826.6. Bars show means and 95% confidence intervals.</w:t>
+      </w:r>
+    </w:p>
+    <w:p>
+      <w:pPr>
+        <w:pStyle w:val="Heading2"/>
+      </w:pPr>
+      <w:r>
+        <w:t>Control transmissions</w:t>
+      </w:r>
+    </w:p>
+    <w:p>
+      <w:pPr>
+        <w:keepNext/>
+      </w:pPr>
+      <w:r>
+        <w:t>Mean number of control-packet transmissions per run. This is supporting communication-load evidence.</w:t>
       </w:r>
     </w:p>
     <w:p>
@@ -5612,7 +7984,7 @@
         <w:drawing>
           <wp:inline xmlns:a="http://schemas.openxmlformats.org/drawingml/2006/main" xmlns:pic="http://schemas.openxmlformats.org/drawingml/2006/picture">
             <wp:extent cx="5577840" cy="3053133"/>
-            <wp:docPr id="34" name="Picture 34"/>
+            <wp:docPr id="34" name="Picture 34" descr="Control transmissions. Low traffic (72 background vehicles): Fog/Cloud 22,663; Mist 22,668; Mist Dynamic 22,662; Mist + Fog 22,658. Bars show means and 95% confidence intervals."/>
             <wp:cNvGraphicFramePr>
               <a:graphicFrameLocks noChangeAspect="1"/>
             </wp:cNvGraphicFramePr>
@@ -5620,7 +7992,7 @@
               <a:graphicData uri="http://schemas.openxmlformats.org/drawingml/2006/picture">
                 <pic:pic>
                   <pic:nvPicPr>
-                    <pic:cNvPr id="0" name="control_transmissions-medium.png"/>
+                    <pic:cNvPr id="0" name="control_transmissions-low.png"/>
                     <pic:cNvPicPr/>
                   </pic:nvPicPr>
                   <pic:blipFill>
@@ -5649,7 +8021,7 @@
         <w:spacing w:after="200"/>
       </w:pPr>
       <w:r>
-        <w:t>Figure 34. Medium traffic (144 background vehicles): Fog/Cloud 40,083; Mist 40,119; Mist Dynamic 40,120; Mist + Fog 40,139. Bars show means and 95% confidence intervals.</w:t>
+        <w:t>Figure 34. Low traffic (72 background vehicles): Fog/Cloud 22,663; Mist 22,668; Mist Dynamic 22,662; Mist + Fog 22,658. Bars show means and 95% confidence intervals.</w:t>
       </w:r>
     </w:p>
     <w:p>
@@ -5661,7 +8033,7 @@
         <w:drawing>
           <wp:inline xmlns:a="http://schemas.openxmlformats.org/drawingml/2006/main" xmlns:pic="http://schemas.openxmlformats.org/drawingml/2006/picture">
             <wp:extent cx="5577840" cy="3053133"/>
-            <wp:docPr id="35" name="Picture 35"/>
+            <wp:docPr id="35" name="Picture 35" descr="Control transmissions. Medium traffic (144 background vehicles): Fog/Cloud 39,997; Mist 39,966; Mist Dynamic 39,992; Mist + Fog 39,965. Bars show means and 95% confidence intervals."/>
             <wp:cNvGraphicFramePr>
               <a:graphicFrameLocks noChangeAspect="1"/>
             </wp:cNvGraphicFramePr>
@@ -5669,7 +8041,7 @@
               <a:graphicData uri="http://schemas.openxmlformats.org/drawingml/2006/picture">
                 <pic:pic>
                   <pic:nvPicPr>
-                    <pic:cNvPr id="0" name="control_transmissions-high.png"/>
+                    <pic:cNvPr id="0" name="control_transmissions-medium.png"/>
                     <pic:cNvPicPr/>
                   </pic:nvPicPr>
                   <pic:blipFill>
@@ -5698,20 +8070,7 @@
         <w:spacing w:after="200"/>
       </w:pPr>
       <w:r>
-        <w:t>Figure 35. High traffic (200 background vehicles): Fog/Cloud 54,440; Mist 54,393; Mist Dynamic 54,414; Mist + Fog 54,423. Bars show means and 95% confidence intervals.</w:t>
-      </w:r>
-    </w:p>
-    <w:p>
-      <w:pPr>
-        <w:pStyle w:val="Heading2"/>
-      </w:pPr>
-      <w:r>
-        <w:t>Control bytes</w:t>
-      </w:r>
-    </w:p>
-    <w:p>
-      <w:r>
-        <w:t>Mean control traffic volume in bytes per run. This is supporting communication-load evidence.</w:t>
+        <w:t>Figure 35. Medium traffic (144 background vehicles): Fog/Cloud 39,997; Mist 39,966; Mist Dynamic 39,992; Mist + Fog 39,965. Bars show means and 95% confidence intervals.</w:t>
       </w:r>
     </w:p>
     <w:p>
@@ -5723,7 +8082,7 @@
         <w:drawing>
           <wp:inline xmlns:a="http://schemas.openxmlformats.org/drawingml/2006/main" xmlns:pic="http://schemas.openxmlformats.org/drawingml/2006/picture">
             <wp:extent cx="5577840" cy="3053133"/>
-            <wp:docPr id="36" name="Picture 36"/>
+            <wp:docPr id="36" name="Picture 36" descr="Control transmissions. High traffic (200 background vehicles): Fog/Cloud 54,340; Mist 54,218; Mist Dynamic 54,171; Mist + Fog 54,218. Bars show means and 95% confidence intervals."/>
             <wp:cNvGraphicFramePr>
               <a:graphicFrameLocks noChangeAspect="1"/>
             </wp:cNvGraphicFramePr>
@@ -5731,7 +8090,7 @@
               <a:graphicData uri="http://schemas.openxmlformats.org/drawingml/2006/picture">
                 <pic:pic>
                   <pic:nvPicPr>
-                    <pic:cNvPr id="0" name="control_bytes-low.png"/>
+                    <pic:cNvPr id="0" name="control_transmissions-high.png"/>
                     <pic:cNvPicPr/>
                   </pic:nvPicPr>
                   <pic:blipFill>
@@ -5760,7 +8119,23 @@
         <w:spacing w:after="200"/>
       </w:pPr>
       <w:r>
-        <w:t>Figure 36. Low traffic (72 background vehicles): Fog/Cloud 1,812,931; Mist 1,812,194; Mist Dynamic 1,813,863; Mist + Fog 1,813,863. Bars show means and 95% confidence intervals.</w:t>
+        <w:t>Figure 36. High traffic (200 background vehicles): Fog/Cloud 54,340; Mist 54,218; Mist Dynamic 54,171; Mist + Fog 54,218. Bars show means and 95% confidence intervals.</w:t>
+      </w:r>
+    </w:p>
+    <w:p>
+      <w:pPr>
+        <w:pStyle w:val="Heading2"/>
+      </w:pPr>
+      <w:r>
+        <w:t>Control bytes</w:t>
+      </w:r>
+    </w:p>
+    <w:p>
+      <w:pPr>
+        <w:keepNext/>
+      </w:pPr>
+      <w:r>
+        <w:t>Mean control traffic volume in bytes per run. This is supporting communication-load evidence.</w:t>
       </w:r>
     </w:p>
     <w:p>
@@ -5772,7 +8147,7 @@
         <w:drawing>
           <wp:inline xmlns:a="http://schemas.openxmlformats.org/drawingml/2006/main" xmlns:pic="http://schemas.openxmlformats.org/drawingml/2006/picture">
             <wp:extent cx="5577840" cy="3053133"/>
-            <wp:docPr id="37" name="Picture 37"/>
+            <wp:docPr id="37" name="Picture 37" descr="Control bytes. Low traffic (72 background vehicles): Fog/Cloud 1,813,206; Mist 1,813,506; Mist Dynamic 1,813,002; Mist + Fog 1,812,736. Bars show means and 95% confidence intervals."/>
             <wp:cNvGraphicFramePr>
               <a:graphicFrameLocks noChangeAspect="1"/>
             </wp:cNvGraphicFramePr>
@@ -5780,7 +8155,7 @@
               <a:graphicData uri="http://schemas.openxmlformats.org/drawingml/2006/picture">
                 <pic:pic>
                   <pic:nvPicPr>
-                    <pic:cNvPr id="0" name="control_bytes-medium.png"/>
+                    <pic:cNvPr id="0" name="control_bytes-low.png"/>
                     <pic:cNvPicPr/>
                   </pic:nvPicPr>
                   <pic:blipFill>
@@ -5809,7 +8184,7 @@
         <w:spacing w:after="200"/>
       </w:pPr>
       <w:r>
-        <w:t>Figure 37. Medium traffic (144 background vehicles): Fog/Cloud 3,206,824; Mist 3,209,639; Mist Dynamic 3,209,711; Mist + Fog 3,211,360. Bars show means and 95% confidence intervals.</w:t>
+        <w:t>Figure 37. Low traffic (72 background vehicles): Fog/Cloud 1,813,206; Mist 1,813,506; Mist Dynamic 1,813,002; Mist + Fog 1,812,736. Bars show means and 95% confidence intervals.</w:t>
       </w:r>
     </w:p>
     <w:p>
@@ -5821,7 +8196,7 @@
         <w:drawing>
           <wp:inline xmlns:a="http://schemas.openxmlformats.org/drawingml/2006/main" xmlns:pic="http://schemas.openxmlformats.org/drawingml/2006/picture">
             <wp:extent cx="5577840" cy="3053133"/>
-            <wp:docPr id="38" name="Picture 38"/>
+            <wp:docPr id="38" name="Picture 38" descr="Control bytes. Medium traffic (144 background vehicles): Fog/Cloud 3,200,003; Mist 3,197,365; Mist Dynamic 3,199,463; Mist + Fog 3,197,369. Bars show means and 95% confidence intervals."/>
             <wp:cNvGraphicFramePr>
               <a:graphicFrameLocks noChangeAspect="1"/>
             </wp:cNvGraphicFramePr>
@@ -5829,7 +8204,7 @@
               <a:graphicData uri="http://schemas.openxmlformats.org/drawingml/2006/picture">
                 <pic:pic>
                   <pic:nvPicPr>
-                    <pic:cNvPr id="0" name="control_bytes-high.png"/>
+                    <pic:cNvPr id="0" name="control_bytes-medium.png"/>
                     <pic:cNvPicPr/>
                   </pic:nvPicPr>
                   <pic:blipFill>
@@ -5858,20 +8233,7 @@
         <w:spacing w:after="200"/>
       </w:pPr>
       <w:r>
-        <w:t>Figure 38. High traffic (200 background vehicles): Fog/Cloud 4,355,397; Mist 4,351,549; Mist Dynamic 4,353,224; Mist + Fog 4,354,169. Bars show means and 95% confidence intervals.</w:t>
-      </w:r>
-    </w:p>
-    <w:p>
-      <w:pPr>
-        <w:pStyle w:val="Heading2"/>
-      </w:pPr>
-      <w:r>
-        <w:t>EV corridor delay versus free flow</w:t>
-      </w:r>
-    </w:p>
-    <w:p>
-      <w:r>
-        <w:t>Extra travel time relative to the modeled free-flow corridor, in seconds.</w:t>
+        <w:t>Figure 38. Medium traffic (144 background vehicles): Fog/Cloud 3,200,003; Mist 3,197,365; Mist Dynamic 3,199,463; Mist + Fog 3,197,369. Bars show means and 95% confidence intervals.</w:t>
       </w:r>
     </w:p>
     <w:p>
@@ -5883,7 +8245,7 @@
         <w:drawing>
           <wp:inline xmlns:a="http://schemas.openxmlformats.org/drawingml/2006/main" xmlns:pic="http://schemas.openxmlformats.org/drawingml/2006/picture">
             <wp:extent cx="5577840" cy="3053133"/>
-            <wp:docPr id="39" name="Picture 39"/>
+            <wp:docPr id="39" name="Picture 39" descr="Control bytes. High traffic (200 background vehicles): Fog/Cloud 4,347,408; Mist 4,337,520; Mist Dynamic 4,333,800; Mist + Fog 4,337,589. Bars show means and 95% confidence intervals."/>
             <wp:cNvGraphicFramePr>
               <a:graphicFrameLocks noChangeAspect="1"/>
             </wp:cNvGraphicFramePr>
@@ -5891,7 +8253,7 @@
               <a:graphicData uri="http://schemas.openxmlformats.org/drawingml/2006/picture">
                 <pic:pic>
                   <pic:nvPicPr>
-                    <pic:cNvPr id="0" name="ev_delay_vs_freeflow_s-low.png"/>
+                    <pic:cNvPr id="0" name="control_bytes-high.png"/>
                     <pic:cNvPicPr/>
                   </pic:nvPicPr>
                   <pic:blipFill>
@@ -5920,7 +8282,23 @@
         <w:spacing w:after="200"/>
       </w:pPr>
       <w:r>
-        <w:t>Figure 39. Low traffic (72 background vehicles): Fog/Cloud 0.2; Mist 0.2; Mist Dynamic 0.2; Mist + Fog 0.2. Bars show means and 95% confidence intervals.</w:t>
+        <w:t>Figure 39. High traffic (200 background vehicles): Fog/Cloud 4,347,408; Mist 4,337,520; Mist Dynamic 4,333,800; Mist + Fog 4,337,589. Bars show means and 95% confidence intervals.</w:t>
+      </w:r>
+    </w:p>
+    <w:p>
+      <w:pPr>
+        <w:pStyle w:val="Heading2"/>
+      </w:pPr>
+      <w:r>
+        <w:t>EV corridor delay versus free flow</w:t>
+      </w:r>
+    </w:p>
+    <w:p>
+      <w:pPr>
+        <w:keepNext/>
+      </w:pPr>
+      <w:r>
+        <w:t>Extra travel time relative to the modeled free-flow corridor, in seconds.</w:t>
       </w:r>
     </w:p>
     <w:p>
@@ -5932,7 +8310,7 @@
         <w:drawing>
           <wp:inline xmlns:a="http://schemas.openxmlformats.org/drawingml/2006/main" xmlns:pic="http://schemas.openxmlformats.org/drawingml/2006/picture">
             <wp:extent cx="5577840" cy="3053133"/>
-            <wp:docPr id="40" name="Picture 40"/>
+            <wp:docPr id="40" name="Picture 40" descr="EV corridor delay versus free flow. Low traffic (72 background vehicles): Fog/Cloud 24.3; Mist 24.4; Mist Dynamic 23.8; Mist + Fog 23.9. Bars show means and 95% confidence intervals."/>
             <wp:cNvGraphicFramePr>
               <a:graphicFrameLocks noChangeAspect="1"/>
             </wp:cNvGraphicFramePr>
@@ -5940,7 +8318,7 @@
               <a:graphicData uri="http://schemas.openxmlformats.org/drawingml/2006/picture">
                 <pic:pic>
                   <pic:nvPicPr>
-                    <pic:cNvPr id="0" name="ev_delay_vs_freeflow_s-medium.png"/>
+                    <pic:cNvPr id="0" name="ev_delay_vs_freeflow_s-low.png"/>
                     <pic:cNvPicPr/>
                   </pic:nvPicPr>
                   <pic:blipFill>
@@ -5969,7 +8347,7 @@
         <w:spacing w:after="200"/>
       </w:pPr>
       <w:r>
-        <w:t>Figure 40. Medium traffic (144 background vehicles): Fog/Cloud 0.0; Mist 0.0; Mist Dynamic 0.2; Mist + Fog 0.2. Bars show means and 95% confidence intervals.</w:t>
+        <w:t>Figure 40. Low traffic (72 background vehicles): Fog/Cloud 24.3; Mist 24.4; Mist Dynamic 23.8; Mist + Fog 23.9. Bars show means and 95% confidence intervals.</w:t>
       </w:r>
     </w:p>
     <w:p>
@@ -5981,7 +8359,7 @@
         <w:drawing>
           <wp:inline xmlns:a="http://schemas.openxmlformats.org/drawingml/2006/main" xmlns:pic="http://schemas.openxmlformats.org/drawingml/2006/picture">
             <wp:extent cx="5577840" cy="3053133"/>
-            <wp:docPr id="41" name="Picture 41"/>
+            <wp:docPr id="41" name="Picture 41" descr="EV corridor delay versus free flow. Medium traffic (144 background vehicles): Fog/Cloud 25.6; Mist 26.7; Mist Dynamic 25.6; Mist + Fog 25.5. Bars show means and 95% confidence intervals."/>
             <wp:cNvGraphicFramePr>
               <a:graphicFrameLocks noChangeAspect="1"/>
             </wp:cNvGraphicFramePr>
@@ -5989,7 +8367,7 @@
               <a:graphicData uri="http://schemas.openxmlformats.org/drawingml/2006/picture">
                 <pic:pic>
                   <pic:nvPicPr>
-                    <pic:cNvPr id="0" name="ev_delay_vs_freeflow_s-high.png"/>
+                    <pic:cNvPr id="0" name="ev_delay_vs_freeflow_s-medium.png"/>
                     <pic:cNvPicPr/>
                   </pic:nvPicPr>
                   <pic:blipFill>
@@ -6018,20 +8396,7 @@
         <w:spacing w:after="200"/>
       </w:pPr>
       <w:r>
-        <w:t>Figure 41. High traffic (200 background vehicles): Fog/Cloud 1.0; Mist 0.9; Mist Dynamic 1.0; Mist + Fog 1.0. Bars show means and 95% confidence intervals.</w:t>
-      </w:r>
-    </w:p>
-    <w:p>
-      <w:pPr>
-        <w:pStyle w:val="Heading2"/>
-      </w:pPr>
-      <w:r>
-        <w:t>EV route distance</w:t>
-      </w:r>
-    </w:p>
-    <w:p>
-      <w:r>
-        <w:t>Distance traveled by the EV to reach the accident, in metres.</w:t>
+        <w:t>Figure 41. Medium traffic (144 background vehicles): Fog/Cloud 25.6; Mist 26.7; Mist Dynamic 25.6; Mist + Fog 25.5. Bars show means and 95% confidence intervals.</w:t>
       </w:r>
     </w:p>
     <w:p>
@@ -6043,7 +8408,7 @@
         <w:drawing>
           <wp:inline xmlns:a="http://schemas.openxmlformats.org/drawingml/2006/main" xmlns:pic="http://schemas.openxmlformats.org/drawingml/2006/picture">
             <wp:extent cx="5577840" cy="3053133"/>
-            <wp:docPr id="42" name="Picture 42"/>
+            <wp:docPr id="42" name="Picture 42" descr="EV corridor delay versus free flow. High traffic (200 background vehicles): Fog/Cloud 27.3; Mist 28.2; Mist Dynamic 25.5; Mist + Fog 25.7. Bars show means and 95% confidence intervals."/>
             <wp:cNvGraphicFramePr>
               <a:graphicFrameLocks noChangeAspect="1"/>
             </wp:cNvGraphicFramePr>
@@ -6051,7 +8416,7 @@
               <a:graphicData uri="http://schemas.openxmlformats.org/drawingml/2006/picture">
                 <pic:pic>
                   <pic:nvPicPr>
-                    <pic:cNvPr id="0" name="ev_distance_m-low.png"/>
+                    <pic:cNvPr id="0" name="ev_delay_vs_freeflow_s-high.png"/>
                     <pic:cNvPicPr/>
                   </pic:nvPicPr>
                   <pic:blipFill>
@@ -6080,7 +8445,23 @@
         <w:spacing w:after="200"/>
       </w:pPr>
       <w:r>
-        <w:t>Figure 42. Low traffic (72 background vehicles): Fog/Cloud 1776.8; Mist 1776.8; Mist Dynamic 1777.5; Mist + Fog 1777.5. Bars show means and 95% confidence intervals.</w:t>
+        <w:t>Figure 42. High traffic (200 background vehicles): Fog/Cloud 27.3; Mist 28.2; Mist Dynamic 25.5; Mist + Fog 25.7. Bars show means and 95% confidence intervals.</w:t>
+      </w:r>
+    </w:p>
+    <w:p>
+      <w:pPr>
+        <w:pStyle w:val="Heading2"/>
+      </w:pPr>
+      <w:r>
+        <w:t>EV route distance</w:t>
+      </w:r>
+    </w:p>
+    <w:p>
+      <w:pPr>
+        <w:keepNext/>
+      </w:pPr>
+      <w:r>
+        <w:t>Distance traveled by the EV to reach the accident, in metres.</w:t>
       </w:r>
     </w:p>
     <w:p>
@@ -6092,7 +8473,7 @@
         <w:drawing>
           <wp:inline xmlns:a="http://schemas.openxmlformats.org/drawingml/2006/main" xmlns:pic="http://schemas.openxmlformats.org/drawingml/2006/picture">
             <wp:extent cx="5577840" cy="3053133"/>
-            <wp:docPr id="43" name="Picture 43"/>
+            <wp:docPr id="43" name="Picture 43" descr="EV route distance. Low traffic (72 background vehicles): Fog/Cloud 1778.7; Mist 1778.1; Mist Dynamic 1778.5; Mist + Fog 1778.6. Bars show means and 95% confidence intervals."/>
             <wp:cNvGraphicFramePr>
               <a:graphicFrameLocks noChangeAspect="1"/>
             </wp:cNvGraphicFramePr>
@@ -6100,7 +8481,7 @@
               <a:graphicData uri="http://schemas.openxmlformats.org/drawingml/2006/picture">
                 <pic:pic>
                   <pic:nvPicPr>
-                    <pic:cNvPr id="0" name="ev_distance_m-medium.png"/>
+                    <pic:cNvPr id="0" name="ev_distance_m-low.png"/>
                     <pic:cNvPicPr/>
                   </pic:nvPicPr>
                   <pic:blipFill>
@@ -6129,7 +8510,7 @@
         <w:spacing w:after="200"/>
       </w:pPr>
       <w:r>
-        <w:t>Figure 43. Medium traffic (144 background vehicles): Fog/Cloud 1776.6; Mist 1776.6; Mist Dynamic 1778.3; Mist + Fog 1777.9. Bars show means and 95% confidence intervals.</w:t>
+        <w:t>Figure 43. Low traffic (72 background vehicles): Fog/Cloud 1778.7; Mist 1778.1; Mist Dynamic 1778.5; Mist + Fog 1778.6. Bars show means and 95% confidence intervals.</w:t>
       </w:r>
     </w:p>
     <w:p>
@@ -6141,7 +8522,7 @@
         <w:drawing>
           <wp:inline xmlns:a="http://schemas.openxmlformats.org/drawingml/2006/main" xmlns:pic="http://schemas.openxmlformats.org/drawingml/2006/picture">
             <wp:extent cx="5577840" cy="3053133"/>
-            <wp:docPr id="44" name="Picture 44"/>
+            <wp:docPr id="44" name="Picture 44" descr="EV route distance. Medium traffic (144 background vehicles): Fog/Cloud 1779.2; Mist 1778.7; Mist Dynamic 1779.2; Mist + Fog 1779.5. Bars show means and 95% confidence intervals."/>
             <wp:cNvGraphicFramePr>
               <a:graphicFrameLocks noChangeAspect="1"/>
             </wp:cNvGraphicFramePr>
@@ -6149,7 +8530,7 @@
               <a:graphicData uri="http://schemas.openxmlformats.org/drawingml/2006/picture">
                 <pic:pic>
                   <pic:nvPicPr>
-                    <pic:cNvPr id="0" name="ev_distance_m-high.png"/>
+                    <pic:cNvPr id="0" name="ev_distance_m-medium.png"/>
                     <pic:cNvPicPr/>
                   </pic:nvPicPr>
                   <pic:blipFill>
@@ -6178,20 +8559,7 @@
         <w:spacing w:after="200"/>
       </w:pPr>
       <w:r>
-        <w:t>Figure 44. High traffic (200 background vehicles): Fog/Cloud 1777.1; Mist 1776.8; Mist Dynamic 1778.4; Mist + Fog 1778.4. Bars show means and 95% confidence intervals.</w:t>
-      </w:r>
-    </w:p>
-    <w:p>
-      <w:pPr>
-        <w:pStyle w:val="Heading2"/>
-      </w:pPr>
-      <w:r>
-        <w:t>EV travel time</w:t>
-      </w:r>
-    </w:p>
-    <w:p>
-      <w:r>
-        <w:t>EV movement time from departure to accident arrival, in seconds.</w:t>
+        <w:t>Figure 44. Medium traffic (144 background vehicles): Fog/Cloud 1779.2; Mist 1778.7; Mist Dynamic 1779.2; Mist + Fog 1779.5. Bars show means and 95% confidence intervals.</w:t>
       </w:r>
     </w:p>
     <w:p>
@@ -6203,7 +8571,7 @@
         <w:drawing>
           <wp:inline xmlns:a="http://schemas.openxmlformats.org/drawingml/2006/main" xmlns:pic="http://schemas.openxmlformats.org/drawingml/2006/picture">
             <wp:extent cx="5577840" cy="3053133"/>
-            <wp:docPr id="45" name="Picture 45"/>
+            <wp:docPr id="45" name="Picture 45" descr="EV route distance. High traffic (200 background vehicles): Fog/Cloud 1778.9; Mist 1778.9; Mist Dynamic 1780.3; Mist + Fog 1780.1. Bars show means and 95% confidence intervals."/>
             <wp:cNvGraphicFramePr>
               <a:graphicFrameLocks noChangeAspect="1"/>
             </wp:cNvGraphicFramePr>
@@ -6211,7 +8579,7 @@
               <a:graphicData uri="http://schemas.openxmlformats.org/drawingml/2006/picture">
                 <pic:pic>
                   <pic:nvPicPr>
-                    <pic:cNvPr id="0" name="ev_travel_s-low.png"/>
+                    <pic:cNvPr id="0" name="ev_distance_m-high.png"/>
                     <pic:cNvPicPr/>
                   </pic:nvPicPr>
                   <pic:blipFill>
@@ -6240,7 +8608,23 @@
         <w:spacing w:after="200"/>
       </w:pPr>
       <w:r>
-        <w:t>Figure 45. Low traffic (72 background vehicles): Fog/Cloud 140.2; Mist 140.2; Mist Dynamic 140.2; Mist + Fog 140.2. Bars show means and 95% confidence intervals.</w:t>
+        <w:t>Figure 45. High traffic (200 background vehicles): Fog/Cloud 1778.9; Mist 1778.9; Mist Dynamic 1780.3; Mist + Fog 1780.1. Bars show means and 95% confidence intervals.</w:t>
+      </w:r>
+    </w:p>
+    <w:p>
+      <w:pPr>
+        <w:pStyle w:val="Heading2"/>
+      </w:pPr>
+      <w:r>
+        <w:t>EV travel time</w:t>
+      </w:r>
+    </w:p>
+    <w:p>
+      <w:pPr>
+        <w:keepNext/>
+      </w:pPr>
+      <w:r>
+        <w:t>EV movement time from departure to accident arrival, in seconds.</w:t>
       </w:r>
     </w:p>
     <w:p>
@@ -6252,7 +8636,7 @@
         <w:drawing>
           <wp:inline xmlns:a="http://schemas.openxmlformats.org/drawingml/2006/main" xmlns:pic="http://schemas.openxmlformats.org/drawingml/2006/picture">
             <wp:extent cx="5577840" cy="3053133"/>
-            <wp:docPr id="46" name="Picture 46"/>
+            <wp:docPr id="46" name="Picture 46" descr="EV travel time. Low traffic (72 background vehicles): Fog/Cloud 152.3; Mist 152.3; Mist Dynamic 151.7; Mist + Fog 151.9. Bars show means and 95% confidence intervals."/>
             <wp:cNvGraphicFramePr>
               <a:graphicFrameLocks noChangeAspect="1"/>
             </wp:cNvGraphicFramePr>
@@ -6260,7 +8644,7 @@
               <a:graphicData uri="http://schemas.openxmlformats.org/drawingml/2006/picture">
                 <pic:pic>
                   <pic:nvPicPr>
-                    <pic:cNvPr id="0" name="ev_travel_s-medium.png"/>
+                    <pic:cNvPr id="0" name="ev_travel_s-low.png"/>
                     <pic:cNvPicPr/>
                   </pic:nvPicPr>
                   <pic:blipFill>
@@ -6289,7 +8673,7 @@
         <w:spacing w:after="200"/>
       </w:pPr>
       <w:r>
-        <w:t>Figure 46. Medium traffic (144 background vehicles): Fog/Cloud 140.0; Mist 140.0; Mist Dynamic 140.1; Mist + Fog 140.1. Bars show means and 95% confidence intervals.</w:t>
+        <w:t>Figure 46. Low traffic (72 background vehicles): Fog/Cloud 152.3; Mist 152.3; Mist Dynamic 151.7; Mist + Fog 151.9. Bars show means and 95% confidence intervals.</w:t>
       </w:r>
     </w:p>
     <w:p>
@@ -6301,7 +8685,7 @@
         <w:drawing>
           <wp:inline xmlns:a="http://schemas.openxmlformats.org/drawingml/2006/main" xmlns:pic="http://schemas.openxmlformats.org/drawingml/2006/picture">
             <wp:extent cx="5577840" cy="3053133"/>
-            <wp:docPr id="47" name="Picture 47"/>
+            <wp:docPr id="47" name="Picture 47" descr="EV travel time. Medium traffic (144 background vehicles): Fog/Cloud 153.6; Mist 154.7; Mist Dynamic 153.6; Mist + Fog 153.5. Bars show means and 95% confidence intervals."/>
             <wp:cNvGraphicFramePr>
               <a:graphicFrameLocks noChangeAspect="1"/>
             </wp:cNvGraphicFramePr>
@@ -6309,7 +8693,7 @@
               <a:graphicData uri="http://schemas.openxmlformats.org/drawingml/2006/picture">
                 <pic:pic>
                   <pic:nvPicPr>
-                    <pic:cNvPr id="0" name="ev_travel_s-high.png"/>
+                    <pic:cNvPr id="0" name="ev_travel_s-medium.png"/>
                     <pic:cNvPicPr/>
                   </pic:nvPicPr>
                   <pic:blipFill>
@@ -6338,7 +8722,56 @@
         <w:spacing w:after="200"/>
       </w:pPr>
       <w:r>
-        <w:t>Figure 47. High traffic (200 background vehicles): Fog/Cloud 141.0; Mist 140.9; Mist Dynamic 140.9; Mist + Fog 140.8. Bars show means and 95% confidence intervals.</w:t>
+        <w:t>Figure 47. Medium traffic (144 background vehicles): Fog/Cloud 153.6; Mist 154.7; Mist Dynamic 153.6; Mist + Fog 153.5. Bars show means and 95% confidence intervals.</w:t>
+      </w:r>
+    </w:p>
+    <w:p>
+      <w:pPr>
+        <w:keepNext/>
+        <w:jc w:val="center"/>
+      </w:pPr>
+      <w:r>
+        <w:drawing>
+          <wp:inline xmlns:a="http://schemas.openxmlformats.org/drawingml/2006/main" xmlns:pic="http://schemas.openxmlformats.org/drawingml/2006/picture">
+            <wp:extent cx="5577840" cy="3053133"/>
+            <wp:docPr id="48" name="Picture 48" descr="EV travel time. High traffic (200 background vehicles): Fog/Cloud 155.3; Mist 156.2; Mist Dynamic 153.6; Mist + Fog 153.7. Bars show means and 95% confidence intervals."/>
+            <wp:cNvGraphicFramePr>
+              <a:graphicFrameLocks noChangeAspect="1"/>
+            </wp:cNvGraphicFramePr>
+            <a:graphic>
+              <a:graphicData uri="http://schemas.openxmlformats.org/drawingml/2006/picture">
+                <pic:pic>
+                  <pic:nvPicPr>
+                    <pic:cNvPr id="0" name="ev_travel_s-high.png"/>
+                    <pic:cNvPicPr/>
+                  </pic:nvPicPr>
+                  <pic:blipFill>
+                    <a:blip r:embed="rId56"/>
+                    <a:stretch>
+                      <a:fillRect/>
+                    </a:stretch>
+                  </pic:blipFill>
+                  <pic:spPr>
+                    <a:xfrm>
+                      <a:off x="0" y="0"/>
+                      <a:ext cx="5577840" cy="3053133"/>
+                    </a:xfrm>
+                    <a:prstGeom prst="rect"/>
+                  </pic:spPr>
+                </pic:pic>
+              </a:graphicData>
+            </a:graphic>
+          </wp:inline>
+        </w:drawing>
+      </w:r>
+    </w:p>
+    <w:p>
+      <w:pPr>
+        <w:keepLines/>
+        <w:spacing w:after="200"/>
+      </w:pPr>
+      <w:r>
+        <w:t>Figure 48. High traffic (200 background vehicles): Fog/Cloud 155.3; Mist 156.2; Mist Dynamic 153.6; Mist + Fog 153.7. Bars show means and 95% confidence intervals.</w:t>
       </w:r>
     </w:p>
     <w:p>

</xml_diff>

<commit_message>
Fix timing and signal safety; publish audited matched batch and complete report
</commit_message>
<xml_diff>
--- a/docs/Emergency_Vehicle_Navigation_Final_Submission.docx
+++ b/docs/Emergency_Vehicle_Navigation_Final_Submission.docx
@@ -38,7 +38,7 @@
         <w:br/>
       </w:r>
       <w:r>
-        <w:t>360 primary runs + 90 waiting controls  |  48 result graphs</w:t>
+        <w:t>360 primary runs + 90 waiting controls  |  66 result graphs</w:t>
         <w:br/>
       </w:r>
       <w:r>
@@ -982,9 +982,9 @@
               <w:rPr>
                 <w:sz w:val="16"/>
               </w:rPr>
-              <w:t>22,039</w:t>
+              <w:t>22,031</w:t>
               <w:br/>
-              <w:t>[21,725, 22,354]</w:t>
+              <w:t>[21,705, 22,356]</w:t>
               <w:br/>
               <w:t>n=24</w:t>
             </w:r>
@@ -1004,9 +1004,9 @@
               <w:rPr>
                 <w:sz w:val="16"/>
               </w:rPr>
-              <w:t>22,046</w:t>
+              <w:t>22,030</w:t>
               <w:br/>
-              <w:t>[21,727, 22,364]</w:t>
+              <w:t>[21,712, 22,348]</w:t>
               <w:br/>
               <w:t>n=24</w:t>
             </w:r>
@@ -1026,9 +1026,9 @@
               <w:rPr>
                 <w:sz w:val="16"/>
               </w:rPr>
-              <w:t>22,038</w:t>
+              <w:t>22,020</w:t>
               <w:br/>
-              <w:t>[21,722, 22,353]</w:t>
+              <w:t>[21,702, 22,337]</w:t>
               <w:br/>
               <w:t>n=24</w:t>
             </w:r>
@@ -1048,9 +1048,9 @@
               <w:rPr>
                 <w:sz w:val="16"/>
               </w:rPr>
-              <w:t>22,033</w:t>
+              <w:t>22,027</w:t>
               <w:br/>
-              <w:t>[21,717, 22,349]</w:t>
+              <w:t>[21,708, 22,347]</w:t>
               <w:br/>
               <w:t>n=24</w:t>
             </w:r>
@@ -1414,7 +1414,7 @@
               </w:rPr>
               <w:t>153.3</w:t>
               <w:br/>
-              <w:t>[152.7, 153.9]</w:t>
+              <w:t>[152.8, 153.8]</w:t>
               <w:br/>
               <w:t>n=24</w:t>
             </w:r>
@@ -1434,9 +1434,9 @@
               <w:rPr>
                 <w:sz w:val="16"/>
               </w:rPr>
-              <w:t>153.1</w:t>
+              <w:t>153.5</w:t>
               <w:br/>
-              <w:t>[152.3, 153.8]</w:t>
+              <w:t>[152.6, 154.4]</w:t>
               <w:br/>
               <w:t>n=24</w:t>
             </w:r>
@@ -1456,9 +1456,9 @@
               <w:rPr>
                 <w:sz w:val="16"/>
               </w:rPr>
-              <w:t>152.5</w:t>
+              <w:t>153.0</w:t>
               <w:br/>
-              <w:t>[151.6, 153.5]</w:t>
+              <w:t>[152.6, 153.4]</w:t>
               <w:br/>
               <w:t>n=24</w:t>
             </w:r>
@@ -1478,9 +1478,9 @@
               <w:rPr>
                 <w:sz w:val="16"/>
               </w:rPr>
-              <w:t>152.5</w:t>
+              <w:t>153.0</w:t>
               <w:br/>
-              <w:t>[151.6, 153.5]</w:t>
+              <w:t>[152.6, 153.4]</w:t>
               <w:br/>
               <w:t>n=24</w:t>
             </w:r>
@@ -1520,7 +1520,7 @@
               <w:rPr>
                 <w:sz w:val="16"/>
               </w:rPr>
-              <w:t>1.5</w:t>
+              <w:t>1.6</w:t>
               <w:br/>
               <w:t>[1.1, 2.0]</w:t>
               <w:br/>
@@ -1541,9 +1541,9 @@
               <w:rPr>
                 <w:sz w:val="16"/>
               </w:rPr>
-              <w:t>1.6</w:t>
+              <w:t>1.8</w:t>
               <w:br/>
-              <w:t>[1.1, 2.1]</w:t>
+              <w:t>[1.4, 2.3]</w:t>
               <w:br/>
               <w:t>n=24</w:t>
             </w:r>
@@ -1562,9 +1562,9 @@
               <w:rPr>
                 <w:sz w:val="16"/>
               </w:rPr>
-              <w:t>2.0</w:t>
+              <w:t>2.2</w:t>
               <w:br/>
-              <w:t>[1.5, 2.4]</w:t>
+              <w:t>[1.8, 2.6]</w:t>
               <w:br/>
               <w:t>n=24</w:t>
             </w:r>
@@ -1583,9 +1583,9 @@
               <w:rPr>
                 <w:sz w:val="16"/>
               </w:rPr>
-              <w:t>2.0</w:t>
+              <w:t>2.2</w:t>
               <w:br/>
-              <w:t>[1.5, 2.5]</w:t>
+              <w:t>[1.8, 2.6]</w:t>
               <w:br/>
               <w:t>n=24</w:t>
             </w:r>
@@ -1850,9 +1850,9 @@
               <w:rPr>
                 <w:sz w:val="16"/>
               </w:rPr>
-              <w:t>39,771</w:t>
+              <w:t>39,768</w:t>
               <w:br/>
-              <w:t>[39,368, 40,175]</w:t>
+              <w:t>[39,371, 40,166]</w:t>
               <w:br/>
               <w:t>n=29</w:t>
             </w:r>
@@ -1872,9 +1872,9 @@
               <w:rPr>
                 <w:sz w:val="16"/>
               </w:rPr>
-              <w:t>39,739</w:t>
+              <w:t>39,779</w:t>
               <w:br/>
-              <w:t>[39,340, 40,137]</w:t>
+              <w:t>[39,374, 40,184]</w:t>
               <w:br/>
               <w:t>n=29</w:t>
             </w:r>
@@ -1894,9 +1894,9 @@
               <w:rPr>
                 <w:sz w:val="16"/>
               </w:rPr>
-              <w:t>39,766</w:t>
+              <w:t>39,806</w:t>
               <w:br/>
-              <w:t>[39,377, 40,155]</w:t>
+              <w:t>[39,413, 40,199]</w:t>
               <w:br/>
               <w:t>n=29</w:t>
             </w:r>
@@ -1916,9 +1916,9 @@
               <w:rPr>
                 <w:sz w:val="16"/>
               </w:rPr>
-              <w:t>39,738</w:t>
+              <w:t>39,788</w:t>
               <w:br/>
-              <w:t>[39,354, 40,123]</w:t>
+              <w:t>[39,396, 40,180]</w:t>
               <w:br/>
               <w:t>n=29</w:t>
             </w:r>
@@ -2280,9 +2280,9 @@
               <w:rPr>
                 <w:sz w:val="16"/>
               </w:rPr>
-              <w:t>154.6</w:t>
+              <w:t>154.5</w:t>
               <w:br/>
-              <w:t>[153.4, 155.8]</w:t>
+              <w:t>[153.2, 155.9]</w:t>
               <w:br/>
               <w:t>n=29</w:t>
             </w:r>
@@ -2302,31 +2302,9 @@
               <w:rPr>
                 <w:sz w:val="16"/>
               </w:rPr>
-              <w:t>155.5</w:t>
+              <w:t>154.7</w:t>
               <w:br/>
-              <w:t>[152.6, 158.3]</w:t>
-              <w:br/>
-              <w:t>n=29</w:t>
-            </w:r>
-          </w:p>
-        </w:tc>
-        <w:tc>
-          <w:tcPr>
-            <w:tcW w:type="dxa" w:w="2074"/>
-            <w:vAlign w:val="center"/>
-            <w:shd w:fill="F2F6FA"/>
-          </w:tcPr>
-          <w:p>
-            <w:pPr>
-              <w:spacing w:after="0"/>
-            </w:pPr>
-            <w:r>
-              <w:rPr>
-                <w:sz w:val="16"/>
-              </w:rPr>
-              <w:t>154.4</w:t>
-              <w:br/>
-              <w:t>[151.4, 157.4]</w:t>
+              <w:t>[153.5, 155.9]</w:t>
               <w:br/>
               <w:t>n=29</w:t>
             </w:r>
@@ -2348,7 +2326,29 @@
               </w:rPr>
               <w:t>154.1</w:t>
               <w:br/>
-              <w:t>[151.0, 157.2]</w:t>
+              <w:t>[152.6, 155.6]</w:t>
+              <w:br/>
+              <w:t>n=29</w:t>
+            </w:r>
+          </w:p>
+        </w:tc>
+        <w:tc>
+          <w:tcPr>
+            <w:tcW w:type="dxa" w:w="2074"/>
+            <w:vAlign w:val="center"/>
+            <w:shd w:fill="F2F6FA"/>
+          </w:tcPr>
+          <w:p>
+            <w:pPr>
+              <w:spacing w:after="0"/>
+            </w:pPr>
+            <w:r>
+              <w:rPr>
+                <w:sz w:val="16"/>
+              </w:rPr>
+              <w:t>153.9</w:t>
+              <w:br/>
+              <w:t>[152.3, 155.5]</w:t>
               <w:br/>
               <w:t>n=29</w:t>
             </w:r>
@@ -2388,9 +2388,9 @@
               <w:rPr>
                 <w:sz w:val="16"/>
               </w:rPr>
-              <w:t>0.9</w:t>
+              <w:t>0.8</w:t>
               <w:br/>
-              <w:t>[0.5, 1.4]</w:t>
+              <w:t>[0.5, 1.3]</w:t>
               <w:br/>
               <w:t>n=29</w:t>
             </w:r>
@@ -2409,9 +2409,9 @@
               <w:rPr>
                 <w:sz w:val="16"/>
               </w:rPr>
-              <w:t>1.6</w:t>
+              <w:t>0.9</w:t>
               <w:br/>
-              <w:t>[0.3, 3.8]</w:t>
+              <w:t>[0.5, 1.3]</w:t>
               <w:br/>
               <w:t>n=29</w:t>
             </w:r>
@@ -2430,9 +2430,9 @@
               <w:rPr>
                 <w:sz w:val="16"/>
               </w:rPr>
-              <w:t>1.7</w:t>
+              <w:t>1.1</w:t>
               <w:br/>
-              <w:t>[0.4, 3.9]</w:t>
+              <w:t>[0.7, 1.6]</w:t>
               <w:br/>
               <w:t>n=29</w:t>
             </w:r>
@@ -2451,9 +2451,9 @@
               <w:rPr>
                 <w:sz w:val="16"/>
               </w:rPr>
-              <w:t>1.7</w:t>
+              <w:t>1.2</w:t>
               <w:br/>
-              <w:t>[0.4, 4.0]</w:t>
+              <w:t>[0.7, 1.6]</w:t>
               <w:br/>
               <w:t>n=29</w:t>
             </w:r>
@@ -2718,9 +2718,9 @@
               <w:rPr>
                 <w:sz w:val="16"/>
               </w:rPr>
-              <w:t>54,379</w:t>
+              <w:t>54,430</w:t>
               <w:br/>
-              <w:t>[53,910, 54,848]</w:t>
+              <w:t>[53,984, 54,876]</w:t>
               <w:br/>
               <w:t>n=30</w:t>
             </w:r>
@@ -2740,9 +2740,9 @@
               <w:rPr>
                 <w:sz w:val="16"/>
               </w:rPr>
-              <w:t>54,257</w:t>
+              <w:t>54,290</w:t>
               <w:br/>
-              <w:t>[53,783, 54,731]</w:t>
+              <w:t>[53,902, 54,678]</w:t>
               <w:br/>
               <w:t>n=30</w:t>
             </w:r>
@@ -2762,9 +2762,9 @@
               <w:rPr>
                 <w:sz w:val="16"/>
               </w:rPr>
-              <w:t>54,211</w:t>
+              <w:t>54,333</w:t>
               <w:br/>
-              <w:t>[53,730, 54,691]</w:t>
+              <w:t>[53,896, 54,770]</w:t>
               <w:br/>
               <w:t>n=30</w:t>
             </w:r>
@@ -2784,9 +2784,9 @@
               <w:rPr>
                 <w:sz w:val="16"/>
               </w:rPr>
-              <w:t>54,257</w:t>
+              <w:t>54,276</w:t>
               <w:br/>
-              <w:t>[53,754, 54,760]</w:t>
+              <w:t>[53,895, 54,658]</w:t>
               <w:br/>
               <w:t>n=30</w:t>
             </w:r>
@@ -3148,9 +3148,9 @@
               <w:rPr>
                 <w:sz w:val="16"/>
               </w:rPr>
-              <w:t>156.3</w:t>
+              <w:t>156.2</w:t>
               <w:br/>
-              <w:t>[154.4, 158.2]</w:t>
+              <w:t>[154.3, 158.1]</w:t>
               <w:br/>
               <w:t>n=30</w:t>
             </w:r>
@@ -3170,9 +3170,9 @@
               <w:rPr>
                 <w:sz w:val="16"/>
               </w:rPr>
-              <w:t>157.0</w:t>
+              <w:t>156.9</w:t>
               <w:br/>
-              <w:t>[154.8, 159.2]</w:t>
+              <w:t>[154.7, 159.1]</w:t>
               <w:br/>
               <w:t>n=30</w:t>
             </w:r>
@@ -3192,9 +3192,9 @@
               <w:rPr>
                 <w:sz w:val="16"/>
               </w:rPr>
-              <w:t>154.4</w:t>
+              <w:t>154.9</w:t>
               <w:br/>
-              <w:t>[152.1, 156.7]</w:t>
+              <w:t>[152.5, 157.4]</w:t>
               <w:br/>
               <w:t>n=30</w:t>
             </w:r>
@@ -3214,9 +3214,9 @@
               <w:rPr>
                 <w:sz w:val="16"/>
               </w:rPr>
-              <w:t>154.3</w:t>
+              <w:t>154.9</w:t>
               <w:br/>
-              <w:t>[152.1, 156.6]</w:t>
+              <w:t>[152.5, 157.3]</w:t>
               <w:br/>
               <w:t>n=30</w:t>
             </w:r>
@@ -3258,28 +3258,7 @@
               </w:rPr>
               <w:t>0.7</w:t>
               <w:br/>
-              <w:t>[0.3, 1.0]</w:t>
-              <w:br/>
-              <w:t>n=30</w:t>
-            </w:r>
-          </w:p>
-        </w:tc>
-        <w:tc>
-          <w:tcPr>
-            <w:tcW w:type="dxa" w:w="2074"/>
-            <w:vAlign w:val="center"/>
-          </w:tcPr>
-          <w:p>
-            <w:pPr>
-              <w:spacing w:after="0"/>
-            </w:pPr>
-            <w:r>
-              <w:rPr>
-                <w:sz w:val="16"/>
-              </w:rPr>
-              <w:t>0.6</w:t>
-              <w:br/>
-              <w:t>[0.3, 1.0]</w:t>
+              <w:t>[0.3, 1.1]</w:t>
               <w:br/>
               <w:t>n=30</w:t>
             </w:r>
@@ -3300,7 +3279,7 @@
               </w:rPr>
               <w:t>0.7</w:t>
               <w:br/>
-              <w:t>[0.3, 1.0]</w:t>
+              <w:t>[0.3, 1.1]</w:t>
               <w:br/>
               <w:t>n=30</w:t>
             </w:r>
@@ -3319,9 +3298,30 @@
               <w:rPr>
                 <w:sz w:val="16"/>
               </w:rPr>
-              <w:t>0.6</w:t>
+              <w:t>0.8</w:t>
               <w:br/>
-              <w:t>[0.3, 0.9]</w:t>
+              <w:t>[0.5, 1.2]</w:t>
+              <w:br/>
+              <w:t>n=30</w:t>
+            </w:r>
+          </w:p>
+        </w:tc>
+        <w:tc>
+          <w:tcPr>
+            <w:tcW w:type="dxa" w:w="2074"/>
+            <w:vAlign w:val="center"/>
+          </w:tcPr>
+          <w:p>
+            <w:pPr>
+              <w:spacing w:after="0"/>
+            </w:pPr>
+            <w:r>
+              <w:rPr>
+                <w:sz w:val="16"/>
+              </w:rPr>
+              <w:t>0.8</w:t>
+              <w:br/>
+              <w:t>[0.4, 1.1]</w:t>
               <w:br/>
               <w:t>n=30</w:t>
             </w:r>
@@ -3592,7 +3592,7 @@
               <w:rPr>
                 <w:sz w:val="16"/>
               </w:rPr>
-              <w:t>22,039</w:t>
+              <w:t>22,027</w:t>
             </w:r>
           </w:p>
         </w:tc>
@@ -3609,7 +3609,7 @@
               <w:rPr>
                 <w:sz w:val="16"/>
               </w:rPr>
-              <w:t>152.52</w:t>
+              <w:t>153.02</w:t>
             </w:r>
           </w:p>
         </w:tc>
@@ -3665,7 +3665,7 @@
               <w:rPr>
                 <w:sz w:val="16"/>
               </w:rPr>
-              <w:t>66.4</w:t>
+              <w:t>66.2</w:t>
             </w:r>
           </w:p>
         </w:tc>
@@ -3719,7 +3719,7 @@
               <w:rPr>
                 <w:sz w:val="16"/>
               </w:rPr>
-              <w:t>39,754</w:t>
+              <w:t>39,785</w:t>
             </w:r>
           </w:p>
         </w:tc>
@@ -3737,7 +3737,7 @@
               <w:rPr>
                 <w:sz w:val="16"/>
               </w:rPr>
-              <w:t>154.40</w:t>
+              <w:t>154.12</w:t>
             </w:r>
           </w:p>
         </w:tc>
@@ -3790,7 +3790,7 @@
               <w:rPr>
                 <w:sz w:val="16"/>
               </w:rPr>
-              <w:t>93.1</w:t>
+              <w:t>93.7</w:t>
             </w:r>
           </w:p>
         </w:tc>
@@ -3841,7 +3841,7 @@
               <w:rPr>
                 <w:sz w:val="16"/>
               </w:rPr>
-              <w:t>54,276</w:t>
+              <w:t>54,332</w:t>
             </w:r>
           </w:p>
         </w:tc>
@@ -3858,7 +3858,7 @@
               <w:rPr>
                 <w:sz w:val="16"/>
               </w:rPr>
-              <w:t>154.38</w:t>
+              <w:t>154.93</w:t>
             </w:r>
           </w:p>
         </w:tc>
@@ -4017,7 +4017,7 @@
               <w:rPr>
                 <w:sz w:val="16"/>
               </w:rPr>
-              <w:t>153.06</w:t>
+              <w:t>153.50</w:t>
             </w:r>
           </w:p>
         </w:tc>
@@ -4034,7 +4034,7 @@
               <w:rPr>
                 <w:sz w:val="16"/>
               </w:rPr>
-              <w:t>152.52</w:t>
+              <w:t>153.02</w:t>
             </w:r>
           </w:p>
         </w:tc>
@@ -4051,7 +4051,7 @@
               <w:rPr>
                 <w:sz w:val="16"/>
               </w:rPr>
-              <w:t>152.54</w:t>
+              <w:t>152.98</w:t>
             </w:r>
           </w:p>
         </w:tc>
@@ -4106,7 +4106,7 @@
               <w:rPr>
                 <w:sz w:val="16"/>
               </w:rPr>
-              <w:t>155.48</w:t>
+              <w:t>154.72</w:t>
             </w:r>
           </w:p>
         </w:tc>
@@ -4124,7 +4124,7 @@
               <w:rPr>
                 <w:sz w:val="16"/>
               </w:rPr>
-              <w:t>154.40</w:t>
+              <w:t>154.12</w:t>
             </w:r>
           </w:p>
         </w:tc>
@@ -4142,7 +4142,7 @@
               <w:rPr>
                 <w:sz w:val="16"/>
               </w:rPr>
-              <w:t>154.14</w:t>
+              <w:t>153.90</w:t>
             </w:r>
           </w:p>
         </w:tc>
@@ -4160,7 +4160,7 @@
               <w:rPr>
                 <w:sz w:val="16"/>
               </w:rPr>
-              <w:t>7</w:t>
+              <w:t>8</w:t>
             </w:r>
           </w:p>
         </w:tc>
@@ -4196,7 +4196,7 @@
               <w:rPr>
                 <w:sz w:val="16"/>
               </w:rPr>
-              <w:t>156.98</w:t>
+              <w:t>156.88</w:t>
             </w:r>
           </w:p>
         </w:tc>
@@ -4213,7 +4213,7 @@
               <w:rPr>
                 <w:sz w:val="16"/>
               </w:rPr>
-              <w:t>154.38</w:t>
+              <w:t>154.93</w:t>
             </w:r>
           </w:p>
         </w:tc>
@@ -4230,7 +4230,7 @@
               <w:rPr>
                 <w:sz w:val="16"/>
               </w:rPr>
-              <w:t>154.35</w:t>
+              <w:t>154.92</w:t>
             </w:r>
           </w:p>
         </w:tc>
@@ -4247,7 +4247,7 @@
               <w:rPr>
                 <w:sz w:val="16"/>
               </w:rPr>
-              <w:t>10</w:t>
+              <w:t>11</w:t>
             </w:r>
           </w:p>
         </w:tc>
@@ -4256,22 +4256,52 @@
     <w:p/>
     <w:p>
       <w:r>
-        <w:t>Mist A* and Dynamic Mist can have the same initial decision latency because both use the same Mist A* calculation. Dynamic Mist then reviews live road costs every five seconds; the logs show applied route changes in the table. The response-time means differ, but their confidence intervals overlap in several comparisons, so small mean differences alone do not establish that one approach is generally faster.</w:t>
+        <w:t>Mist A* and Dynamic Mist can have the same initial decision latency because both use the same Mist A* calculation. Dynamic Mist then reviews live road costs every five seconds; the logs show applied route changes in the table. The response-time means differ, but the matched-seed difference intervals include zero in several comparisons, so small mean differences alone do not establish that one approach is generally faster.</w:t>
       </w:r>
     </w:p>
     <w:p>
       <w:r>
-        <w:t>In low traffic, the four average EV response times range from 152.52 to 153.29 seconds. Read the intervals alongside these averages; a small difference alone does not prove a general advantage.</w:t>
+        <w:t>In low traffic, the four average EV response times range from 152.98 to 153.50 seconds. Read the intervals alongside these averages; a small difference alone does not prove a general advantage.</w:t>
       </w:r>
     </w:p>
     <w:p>
       <w:r>
-        <w:t>In medium traffic, the four average EV response times range from 154.14 to 155.48 seconds. Read the intervals alongside these averages; a small difference alone does not prove a general advantage.</w:t>
+        <w:t>For matched low seeds, Mist Dynamic minus Mist averages -0.48 s, with a 95% interval of -1.45 to 0.49 s. 20 of 24 matched response times are identical. The paired difference graphs show the uncertainty in these exploratory comparisons.</w:t>
       </w:r>
     </w:p>
     <w:p>
       <w:r>
-        <w:t>In high traffic, the four average EV response times range from 154.35 to 156.98 seconds. Read the intervals alongside these averages; a small difference alone does not prove a general advantage.</w:t>
+        <w:t>For matched low seeds, Mist + Fog minus Mist Dynamic averages -0.04 s, with a 95% interval of -0.10 to 0.02 s. 22 of 24 matched response times are identical. The paired difference graphs show the uncertainty in these exploratory comparisons.</w:t>
+      </w:r>
+    </w:p>
+    <w:p>
+      <w:r>
+        <w:t>In medium traffic, the four average EV response times range from 153.90 to 154.72 seconds. Read the intervals alongside these averages; a small difference alone does not prove a general advantage.</w:t>
+      </w:r>
+    </w:p>
+    <w:p>
+      <w:r>
+        <w:t>For matched medium seeds, Mist Dynamic minus Mist averages -0.60 s, with a 95% interval of -1.98 to 0.77 s. 21 of 29 matched response times are identical. The paired difference graphs show the uncertainty in these exploratory comparisons.</w:t>
+      </w:r>
+    </w:p>
+    <w:p>
+      <w:r>
+        <w:t>For matched medium seeds, Mist + Fog minus Mist Dynamic averages -0.22 s, with a 95% interval of -0.89 to 0.44 s. 24 of 29 matched response times are identical. The paired difference graphs show the uncertainty in these exploratory comparisons.</w:t>
+      </w:r>
+    </w:p>
+    <w:p>
+      <w:r>
+        <w:t>In high traffic, the four average EV response times range from 154.92 to 156.88 seconds. Read the intervals alongside these averages; a small difference alone does not prove a general advantage.</w:t>
+      </w:r>
+    </w:p>
+    <w:p>
+      <w:r>
+        <w:t>For matched high seeds, Mist Dynamic minus Mist averages -1.95 s, with a 95% interval of -3.47 to -0.43 s. 19 of 30 matched response times are identical. The paired difference graphs show the uncertainty in these exploratory comparisons.</w:t>
+      </w:r>
+    </w:p>
+    <w:p>
+      <w:r>
+        <w:t>For matched high seeds, Mist + Fog minus Mist Dynamic averages -0.02 s, with a 95% interval of -0.05 to 0.02 s. 29 of 30 matched response times are identical. The paired difference graphs show the uncertainty in these exploratory comparisons.</w:t>
       </w:r>
     </w:p>
     <w:p>
@@ -4285,6 +4315,11 @@
     <w:p>
       <w:r>
         <w:t>The main averages include 22 normal seeds and eight independently selected fault-test seeds. To show how the routing approaches behave in each condition, the next tables separate their initial decision times. All Mist approaches face the same injected stall in the selected seeds. The experiment does not estimate how often such a fault occurs on real hardware.</w:t>
+      </w:r>
+    </w:p>
+    <w:p>
+      <w:r>
+        <w:t>The initial calculations expanded 13 A* nodes. The maximum across initial calculations and later reviews was 17 nodes. The model assigns 300 ms plus 2 ms per node, giving 334 ms at that maximum, which leaves 166 ms before the watchdog. Matching expansion counts can give matching normal decision times across traffic levels. Pooled means also depend on which normal and controlled-stall runs received the alert.</w:t>
       </w:r>
     </w:p>
     <w:p>
@@ -5183,12 +5218,12 @@
         <w:pStyle w:val="Heading1"/>
       </w:pPr>
       <w:r>
-        <w:t>Traffic-light waiting with and without priority</w:t>
+        <w:t>Traffic light waiting with and without priority</w:t>
       </w:r>
     </w:p>
     <w:p>
       <w:r>
-        <w:t>The no-preemption control uses Fog/Cloud routing with priority disabled. It appears only in this waiting comparison and the three waiting graphs. The priority controller preserves a minimum current green and safe clearance before serving the EV. Some requests can finish before arrival; others require the EV to wait. Waiting is measured from movement rather than added artificially.</w:t>
+        <w:t>The no-preemption control uses Fog/Cloud routing with priority disabled. It appears only in this waiting comparison and the three waiting graphs. The priority controller rechecks the active phase, preserves its minimum green, and uses clearance before serving the EV. Some requests can finish before arrival; others require the EV to wait. Waiting is measured from movement rather than added artificially.</w:t>
       </w:r>
     </w:p>
     <w:tbl>
@@ -5347,7 +5382,7 @@
               <w:rPr>
                 <w:sz w:val="16"/>
               </w:rPr>
-              <w:t>1.54 s</w:t>
+              <w:t>1.56 s</w:t>
             </w:r>
           </w:p>
         </w:tc>
@@ -5364,7 +5399,7 @@
               <w:rPr>
                 <w:sz w:val="16"/>
               </w:rPr>
-              <w:t>1.58 s</w:t>
+              <w:t>1.83 s</w:t>
             </w:r>
           </w:p>
         </w:tc>
@@ -5381,7 +5416,7 @@
               <w:rPr>
                 <w:sz w:val="16"/>
               </w:rPr>
-              <w:t>1.96 s</w:t>
+              <w:t>2.21 s</w:t>
             </w:r>
           </w:p>
         </w:tc>
@@ -5398,7 +5433,7 @@
               <w:rPr>
                 <w:sz w:val="16"/>
               </w:rPr>
-              <w:t>2.02 s</w:t>
+              <w:t>2.25 s</w:t>
             </w:r>
           </w:p>
         </w:tc>
@@ -5453,7 +5488,7 @@
               <w:rPr>
                 <w:sz w:val="16"/>
               </w:rPr>
-              <w:t>0.95 s</w:t>
+              <w:t>0.84 s</w:t>
             </w:r>
           </w:p>
         </w:tc>
@@ -5471,7 +5506,7 @@
               <w:rPr>
                 <w:sz w:val="16"/>
               </w:rPr>
-              <w:t>1.62 s</w:t>
+              <w:t>0.91 s</w:t>
             </w:r>
           </w:p>
         </w:tc>
@@ -5489,7 +5524,7 @@
               <w:rPr>
                 <w:sz w:val="16"/>
               </w:rPr>
-              <w:t>1.71 s</w:t>
+              <w:t>1.12 s</w:t>
             </w:r>
           </w:p>
         </w:tc>
@@ -5507,7 +5542,7 @@
               <w:rPr>
                 <w:sz w:val="16"/>
               </w:rPr>
-              <w:t>1.74 s</w:t>
+              <w:t>1.16 s</w:t>
             </w:r>
           </w:p>
         </w:tc>
@@ -5578,7 +5613,7 @@
               <w:rPr>
                 <w:sz w:val="16"/>
               </w:rPr>
-              <w:t>0.62 s</w:t>
+              <w:t>0.72 s</w:t>
             </w:r>
           </w:p>
         </w:tc>
@@ -5595,7 +5630,7 @@
               <w:rPr>
                 <w:sz w:val="16"/>
               </w:rPr>
-              <w:t>0.65 s</w:t>
+              <w:t>0.82 s</w:t>
             </w:r>
           </w:p>
         </w:tc>
@@ -5612,7 +5647,7 @@
               <w:rPr>
                 <w:sz w:val="16"/>
               </w:rPr>
-              <w:t>0.60 s</w:t>
+              <w:t>0.77 s</w:t>
             </w:r>
           </w:p>
         </w:tc>
@@ -5834,7 +5869,7 @@
               <w:rPr>
                 <w:sz w:val="16"/>
               </w:rPr>
-              <w:t>657</w:t>
+              <w:t>661</w:t>
             </w:r>
           </w:p>
         </w:tc>
@@ -5868,7 +5903,7 @@
               <w:rPr>
                 <w:sz w:val="16"/>
               </w:rPr>
-              <w:t>660</w:t>
+              <w:t>661</w:t>
             </w:r>
           </w:p>
         </w:tc>
@@ -5924,42 +5959,6 @@
               <w:rPr>
                 <w:sz w:val="16"/>
               </w:rPr>
-              <w:t>7</w:t>
-            </w:r>
-          </w:p>
-        </w:tc>
-        <w:tc>
-          <w:tcPr>
-            <w:tcW w:type="dxa" w:w="1728"/>
-            <w:vAlign w:val="center"/>
-            <w:shd w:fill="F2F6FA"/>
-          </w:tcPr>
-          <w:p>
-            <w:pPr>
-              <w:spacing w:after="0"/>
-            </w:pPr>
-            <w:r>
-              <w:rPr>
-                <w:sz w:val="16"/>
-              </w:rPr>
-              <w:t>820</w:t>
-            </w:r>
-          </w:p>
-        </w:tc>
-        <w:tc>
-          <w:tcPr>
-            <w:tcW w:type="dxa" w:w="1728"/>
-            <w:vAlign w:val="center"/>
-            <w:shd w:fill="F2F6FA"/>
-          </w:tcPr>
-          <w:p>
-            <w:pPr>
-              <w:spacing w:after="0"/>
-            </w:pPr>
-            <w:r>
-              <w:rPr>
-                <w:sz w:val="16"/>
-              </w:rPr>
               <w:t>8</w:t>
             </w:r>
           </w:p>
@@ -5978,7 +5977,43 @@
               <w:rPr>
                 <w:sz w:val="16"/>
               </w:rPr>
-              <w:t>815</w:t>
+              <w:t>816</w:t>
+            </w:r>
+          </w:p>
+        </w:tc>
+        <w:tc>
+          <w:tcPr>
+            <w:tcW w:type="dxa" w:w="1728"/>
+            <w:vAlign w:val="center"/>
+            <w:shd w:fill="F2F6FA"/>
+          </w:tcPr>
+          <w:p>
+            <w:pPr>
+              <w:spacing w:after="0"/>
+            </w:pPr>
+            <w:r>
+              <w:rPr>
+                <w:sz w:val="16"/>
+              </w:rPr>
+              <w:t>9</w:t>
+            </w:r>
+          </w:p>
+        </w:tc>
+        <w:tc>
+          <w:tcPr>
+            <w:tcW w:type="dxa" w:w="1728"/>
+            <w:vAlign w:val="center"/>
+            <w:shd w:fill="F2F6FA"/>
+          </w:tcPr>
+          <w:p>
+            <w:pPr>
+              <w:spacing w:after="0"/>
+            </w:pPr>
+            <w:r>
+              <w:rPr>
+                <w:sz w:val="16"/>
+              </w:rPr>
+              <w:t>813</w:t>
             </w:r>
           </w:p>
         </w:tc>
@@ -6031,7 +6066,7 @@
               <w:rPr>
                 <w:sz w:val="16"/>
               </w:rPr>
-              <w:t>10</w:t>
+              <w:t>11</w:t>
             </w:r>
           </w:p>
         </w:tc>
@@ -6048,7 +6083,7 @@
               <w:rPr>
                 <w:sz w:val="16"/>
               </w:rPr>
-              <w:t>853</w:t>
+              <w:t>860</w:t>
             </w:r>
           </w:p>
         </w:tc>
@@ -6065,7 +6100,7 @@
               <w:rPr>
                 <w:sz w:val="16"/>
               </w:rPr>
-              <w:t>10</w:t>
+              <w:t>11</w:t>
             </w:r>
           </w:p>
         </w:tc>
@@ -6082,7 +6117,7 @@
               <w:rPr>
                 <w:sz w:val="16"/>
               </w:rPr>
-              <w:t>855</w:t>
+              <w:t>860</w:t>
             </w:r>
           </w:p>
         </w:tc>
@@ -6092,6 +6127,11 @@
     <w:p>
       <w:r>
         <w:t>Fog took over in 23 of 90 Mist with Fog runs: 7 in low, 8 in medium, and 8 in high traffic. The controlled 900 ms stall delays initial Mist work beyond the 500 ms watchdog. For example, in low traffic seed 4, Fog applied the route after 826.53 ms.</w:t>
+      </w:r>
+    </w:p>
+    <w:p>
+      <w:r>
+        <w:t>That example separates 500.00 ms of watchdog waiting, 326.00 ms of Fog computation, and 0.534 ms of network communication. Watchdog waiting is not counted as communication delay.</w:t>
       </w:r>
     </w:p>
     <w:p>
@@ -6150,7 +6190,7 @@
     </w:p>
     <w:p>
       <w:r>
-        <w:t>The following gallery contains all 48 result graphs.</w:t>
+        <w:t>The following gallery contains all 66 result graphs.</w:t>
       </w:r>
     </w:p>
     <w:p>
@@ -6354,7 +6394,7 @@
         <w:drawing>
           <wp:inline xmlns:a="http://schemas.openxmlformats.org/drawingml/2006/main" xmlns:pic="http://schemas.openxmlformats.org/drawingml/2006/picture">
             <wp:extent cx="5577840" cy="3053133"/>
-            <wp:docPr id="4" name="Picture 4" descr="Normalized routing load. Low traffic (72 background vehicles): Fog/Cloud 22,039; Mist 22,046; Mist Dynamic 22,038; Mist + Fog 22,033. Bars show means and 95% confidence intervals."/>
+            <wp:docPr id="4" name="Picture 4" descr="Normalized routing load. Low traffic (72 background vehicles): Fog/Cloud 22,031; Mist 22,030; Mist Dynamic 22,020; Mist + Fog 22,027. Bars show means and 95% confidence intervals."/>
             <wp:cNvGraphicFramePr>
               <a:graphicFrameLocks noChangeAspect="1"/>
             </wp:cNvGraphicFramePr>
@@ -6391,7 +6431,7 @@
         <w:spacing w:after="200"/>
       </w:pPr>
       <w:r>
-        <w:t>Figure 4. Low traffic (72 background vehicles): Fog/Cloud 22,039; Mist 22,046; Mist Dynamic 22,038; Mist + Fog 22,033. Bars show means and 95% confidence intervals.</w:t>
+        <w:t>Figure 4. Low traffic (72 background vehicles): Fog/Cloud 22,031; Mist 22,030; Mist Dynamic 22,020; Mist + Fog 22,027. Bars show means and 95% confidence intervals.</w:t>
       </w:r>
     </w:p>
     <w:p>
@@ -6403,7 +6443,7 @@
         <w:drawing>
           <wp:inline xmlns:a="http://schemas.openxmlformats.org/drawingml/2006/main" xmlns:pic="http://schemas.openxmlformats.org/drawingml/2006/picture">
             <wp:extent cx="5577840" cy="3053133"/>
-            <wp:docPr id="5" name="Picture 5" descr="Normalized routing load. Medium traffic (144 background vehicles): Fog/Cloud 39,771; Mist 39,739; Mist Dynamic 39,766; Mist + Fog 39,738. Bars show means and 95% confidence intervals."/>
+            <wp:docPr id="5" name="Picture 5" descr="Normalized routing load. Medium traffic (144 background vehicles): Fog/Cloud 39,768; Mist 39,779; Mist Dynamic 39,806; Mist + Fog 39,788. Bars show means and 95% confidence intervals."/>
             <wp:cNvGraphicFramePr>
               <a:graphicFrameLocks noChangeAspect="1"/>
             </wp:cNvGraphicFramePr>
@@ -6440,7 +6480,7 @@
         <w:spacing w:after="200"/>
       </w:pPr>
       <w:r>
-        <w:t>Figure 5. Medium traffic (144 background vehicles): Fog/Cloud 39,771; Mist 39,739; Mist Dynamic 39,766; Mist + Fog 39,738. Bars show means and 95% confidence intervals.</w:t>
+        <w:t>Figure 5. Medium traffic (144 background vehicles): Fog/Cloud 39,768; Mist 39,779; Mist Dynamic 39,806; Mist + Fog 39,788. Bars show means and 95% confidence intervals.</w:t>
       </w:r>
     </w:p>
     <w:p>
@@ -6452,7 +6492,7 @@
         <w:drawing>
           <wp:inline xmlns:a="http://schemas.openxmlformats.org/drawingml/2006/main" xmlns:pic="http://schemas.openxmlformats.org/drawingml/2006/picture">
             <wp:extent cx="5577840" cy="3053133"/>
-            <wp:docPr id="6" name="Picture 6" descr="Normalized routing load. High traffic (200 background vehicles): Fog/Cloud 54,379; Mist 54,257; Mist Dynamic 54,211; Mist + Fog 54,257. Bars show means and 95% confidence intervals."/>
+            <wp:docPr id="6" name="Picture 6" descr="Normalized routing load. High traffic (200 background vehicles): Fog/Cloud 54,430; Mist 54,290; Mist Dynamic 54,333; Mist + Fog 54,276. Bars show means and 95% confidence intervals."/>
             <wp:cNvGraphicFramePr>
               <a:graphicFrameLocks noChangeAspect="1"/>
             </wp:cNvGraphicFramePr>
@@ -6489,7 +6529,7 @@
         <w:spacing w:after="200"/>
       </w:pPr>
       <w:r>
-        <w:t>Figure 6. High traffic (200 background vehicles): Fog/Cloud 54,379; Mist 54,257; Mist Dynamic 54,211; Mist + Fog 54,257. Bars show means and 95% confidence intervals.</w:t>
+        <w:t>Figure 6. High traffic (200 background vehicles): Fog/Cloud 54,430; Mist 54,290; Mist Dynamic 54,333; Mist + Fog 54,276. Bars show means and 95% confidence intervals.</w:t>
       </w:r>
     </w:p>
     <w:p>
@@ -6660,7 +6700,7 @@
         <w:pStyle w:val="Heading2"/>
       </w:pPr>
       <w:r>
-        <w:t>EM end-to-end delay</w:t>
+        <w:t>EM end to end delay</w:t>
       </w:r>
     </w:p>
     <w:p>
@@ -7006,7 +7046,7 @@
         <w:drawing>
           <wp:inline xmlns:a="http://schemas.openxmlformats.org/drawingml/2006/main" xmlns:pic="http://schemas.openxmlformats.org/drawingml/2006/picture">
             <wp:extent cx="5577840" cy="3053133"/>
-            <wp:docPr id="16" name="Picture 16" descr="EV response time. Low traffic (72 background vehicles): Fog/Cloud 153.3; Mist 153.1; Mist Dynamic 152.5; Mist + Fog 152.5. Bars show means and 95% confidence intervals."/>
+            <wp:docPr id="16" name="Picture 16" descr="EV response time. Low traffic (72 background vehicles): Fog/Cloud 153.3; Mist 153.5; Mist Dynamic 153.0; Mist + Fog 153.0. Bars show means and 95% confidence intervals."/>
             <wp:cNvGraphicFramePr>
               <a:graphicFrameLocks noChangeAspect="1"/>
             </wp:cNvGraphicFramePr>
@@ -7043,7 +7083,7 @@
         <w:spacing w:after="200"/>
       </w:pPr>
       <w:r>
-        <w:t>Figure 16. Low traffic (72 background vehicles): Fog/Cloud 153.3; Mist 153.1; Mist Dynamic 152.5; Mist + Fog 152.5. Bars show means and 95% confidence intervals.</w:t>
+        <w:t>Figure 16. Low traffic (72 background vehicles): Fog/Cloud 153.3; Mist 153.5; Mist Dynamic 153.0; Mist + Fog 153.0. Bars show means and 95% confidence intervals.</w:t>
       </w:r>
     </w:p>
     <w:p>
@@ -7055,7 +7095,7 @@
         <w:drawing>
           <wp:inline xmlns:a="http://schemas.openxmlformats.org/drawingml/2006/main" xmlns:pic="http://schemas.openxmlformats.org/drawingml/2006/picture">
             <wp:extent cx="5577840" cy="3053133"/>
-            <wp:docPr id="17" name="Picture 17" descr="EV response time. Medium traffic (144 background vehicles): Fog/Cloud 154.6; Mist 155.5; Mist Dynamic 154.4; Mist + Fog 154.1. Bars show means and 95% confidence intervals."/>
+            <wp:docPr id="17" name="Picture 17" descr="EV response time. Medium traffic (144 background vehicles): Fog/Cloud 154.5; Mist 154.7; Mist Dynamic 154.1; Mist + Fog 153.9. Bars show means and 95% confidence intervals."/>
             <wp:cNvGraphicFramePr>
               <a:graphicFrameLocks noChangeAspect="1"/>
             </wp:cNvGraphicFramePr>
@@ -7092,7 +7132,7 @@
         <w:spacing w:after="200"/>
       </w:pPr>
       <w:r>
-        <w:t>Figure 17. Medium traffic (144 background vehicles): Fog/Cloud 154.6; Mist 155.5; Mist Dynamic 154.4; Mist + Fog 154.1. Bars show means and 95% confidence intervals.</w:t>
+        <w:t>Figure 17. Medium traffic (144 background vehicles): Fog/Cloud 154.5; Mist 154.7; Mist Dynamic 154.1; Mist + Fog 153.9. Bars show means and 95% confidence intervals.</w:t>
       </w:r>
     </w:p>
     <w:p>
@@ -7104,7 +7144,7 @@
         <w:drawing>
           <wp:inline xmlns:a="http://schemas.openxmlformats.org/drawingml/2006/main" xmlns:pic="http://schemas.openxmlformats.org/drawingml/2006/picture">
             <wp:extent cx="5577840" cy="3053133"/>
-            <wp:docPr id="18" name="Picture 18" descr="EV response time. High traffic (200 background vehicles): Fog/Cloud 156.3; Mist 157.0; Mist Dynamic 154.4; Mist + Fog 154.3. Bars show means and 95% confidence intervals."/>
+            <wp:docPr id="18" name="Picture 18" descr="EV response time. High traffic (200 background vehicles): Fog/Cloud 156.2; Mist 156.9; Mist Dynamic 154.9; Mist + Fog 154.9. Bars show means and 95% confidence intervals."/>
             <wp:cNvGraphicFramePr>
               <a:graphicFrameLocks noChangeAspect="1"/>
             </wp:cNvGraphicFramePr>
@@ -7141,7 +7181,7 @@
         <w:spacing w:after="200"/>
       </w:pPr>
       <w:r>
-        <w:t>Figure 18. High traffic (200 background vehicles): Fog/Cloud 156.3; Mist 157.0; Mist Dynamic 154.4; Mist + Fog 154.3. Bars show means and 95% confidence intervals.</w:t>
+        <w:t>Figure 18. High traffic (200 background vehicles): Fog/Cloud 156.2; Mist 156.9; Mist Dynamic 154.9; Mist + Fog 154.9. Bars show means and 95% confidence intervals.</w:t>
       </w:r>
     </w:p>
     <w:p>
@@ -7149,7 +7189,7 @@
         <w:pStyle w:val="Heading2"/>
       </w:pPr>
       <w:r>
-        <w:t>EV traffic-light waiting time</w:t>
+        <w:t>EV traffic light waiting time</w:t>
       </w:r>
     </w:p>
     <w:p>
@@ -7169,7 +7209,7 @@
         <w:drawing>
           <wp:inline xmlns:a="http://schemas.openxmlformats.org/drawingml/2006/main" xmlns:pic="http://schemas.openxmlformats.org/drawingml/2006/picture">
             <wp:extent cx="5577840" cy="3053133"/>
-            <wp:docPr id="19" name="Picture 19" descr="EV traffic-light waiting time. Low traffic (72 background vehicles): Fog/Cloud 1.5; Mist 1.6; Mist Dynamic 2.0; Mist + Fog 2.0; No preemption 26.3. Bars show means and 95% confidence intervals."/>
+            <wp:docPr id="19" name="Picture 19" descr="EV traffic-light waiting time. Low traffic (72 background vehicles): Fog/Cloud 1.6; Mist 1.8; Mist Dynamic 2.2; Mist + Fog 2.2; No preemption 26.3. Bars show means and 95% confidence intervals."/>
             <wp:cNvGraphicFramePr>
               <a:graphicFrameLocks noChangeAspect="1"/>
             </wp:cNvGraphicFramePr>
@@ -7206,7 +7246,7 @@
         <w:spacing w:after="200"/>
       </w:pPr>
       <w:r>
-        <w:t>Figure 19. Low traffic (72 background vehicles): Fog/Cloud 1.5; Mist 1.6; Mist Dynamic 2.0; Mist + Fog 2.0; No preemption 26.3. Bars show means and 95% confidence intervals.</w:t>
+        <w:t>Figure 19. Low traffic (72 background vehicles): Fog/Cloud 1.6; Mist 1.8; Mist Dynamic 2.2; Mist + Fog 2.2; No preemption 26.3. Bars show means and 95% confidence intervals.</w:t>
       </w:r>
     </w:p>
     <w:p>
@@ -7218,7 +7258,7 @@
         <w:drawing>
           <wp:inline xmlns:a="http://schemas.openxmlformats.org/drawingml/2006/main" xmlns:pic="http://schemas.openxmlformats.org/drawingml/2006/picture">
             <wp:extent cx="5577840" cy="3053133"/>
-            <wp:docPr id="20" name="Picture 20" descr="EV traffic-light waiting time. Medium traffic (144 background vehicles): Fog/Cloud 0.9; Mist 1.6; Mist Dynamic 1.7; Mist + Fog 1.7; No preemption 27.3. Bars show means and 95% confidence intervals."/>
+            <wp:docPr id="20" name="Picture 20" descr="EV traffic-light waiting time. Medium traffic (144 background vehicles): Fog/Cloud 0.8; Mist 0.9; Mist Dynamic 1.1; Mist + Fog 1.2; No preemption 27.3. Bars show means and 95% confidence intervals."/>
             <wp:cNvGraphicFramePr>
               <a:graphicFrameLocks noChangeAspect="1"/>
             </wp:cNvGraphicFramePr>
@@ -7255,7 +7295,7 @@
         <w:spacing w:after="200"/>
       </w:pPr>
       <w:r>
-        <w:t>Figure 20. Medium traffic (144 background vehicles): Fog/Cloud 0.9; Mist 1.6; Mist Dynamic 1.7; Mist + Fog 1.7; No preemption 27.3. Bars show means and 95% confidence intervals.</w:t>
+        <w:t>Figure 20. Medium traffic (144 background vehicles): Fog/Cloud 0.8; Mist 0.9; Mist Dynamic 1.1; Mist + Fog 1.2; No preemption 27.3. Bars show means and 95% confidence intervals.</w:t>
       </w:r>
     </w:p>
     <w:p>
@@ -7267,7 +7307,7 @@
         <w:drawing>
           <wp:inline xmlns:a="http://schemas.openxmlformats.org/drawingml/2006/main" xmlns:pic="http://schemas.openxmlformats.org/drawingml/2006/picture">
             <wp:extent cx="5577840" cy="3053133"/>
-            <wp:docPr id="21" name="Picture 21" descr="EV traffic-light waiting time. High traffic (200 background vehicles): Fog/Cloud 0.7; Mist 0.6; Mist Dynamic 0.7; Mist + Fog 0.6; No preemption 22.7. Bars show means and 95% confidence intervals."/>
+            <wp:docPr id="21" name="Picture 21" descr="EV traffic-light waiting time. High traffic (200 background vehicles): Fog/Cloud 0.7; Mist 0.7; Mist Dynamic 0.8; Mist + Fog 0.8; No preemption 22.7. Bars show means and 95% confidence intervals."/>
             <wp:cNvGraphicFramePr>
               <a:graphicFrameLocks noChangeAspect="1"/>
             </wp:cNvGraphicFramePr>
@@ -7304,7 +7344,7 @@
         <w:spacing w:after="200"/>
       </w:pPr>
       <w:r>
-        <w:t>Figure 21. High traffic (200 background vehicles): Fog/Cloud 0.7; Mist 0.6; Mist Dynamic 0.7; Mist + Fog 0.6; No preemption 22.7. Bars show means and 95% confidence intervals.</w:t>
+        <w:t>Figure 21. High traffic (200 background vehicles): Fog/Cloud 0.7; Mist 0.7; Mist Dynamic 0.8; Mist + Fog 0.8; No preemption 22.7. Bars show means and 95% confidence intervals.</w:t>
       </w:r>
     </w:p>
     <w:p>
@@ -7544,7 +7584,7 @@
         <w:drawing>
           <wp:inline xmlns:a="http://schemas.openxmlformats.org/drawingml/2006/main" xmlns:pic="http://schemas.openxmlformats.org/drawingml/2006/picture">
             <wp:extent cx="5577840" cy="3053133"/>
-            <wp:docPr id="26" name="Picture 26" descr="Applied route changes. Medium traffic (144 background vehicles): Mist Dynamic 0.23; Mist + Fog 0.27. Bars show means and 95% confidence intervals."/>
+            <wp:docPr id="26" name="Picture 26" descr="Applied route changes. Medium traffic (144 background vehicles): Mist Dynamic 0.27; Mist + Fog 0.30. Bars show means and 95% confidence intervals."/>
             <wp:cNvGraphicFramePr>
               <a:graphicFrameLocks noChangeAspect="1"/>
             </wp:cNvGraphicFramePr>
@@ -7581,7 +7621,7 @@
         <w:spacing w:after="200"/>
       </w:pPr>
       <w:r>
-        <w:t>Figure 26. Medium traffic (144 background vehicles): Mist Dynamic 0.23; Mist + Fog 0.27. Bars show means and 95% confidence intervals.</w:t>
+        <w:t>Figure 26. Medium traffic (144 background vehicles): Mist Dynamic 0.27; Mist + Fog 0.30. Bars show means and 95% confidence intervals.</w:t>
       </w:r>
     </w:p>
     <w:p>
@@ -7593,7 +7633,7 @@
         <w:drawing>
           <wp:inline xmlns:a="http://schemas.openxmlformats.org/drawingml/2006/main" xmlns:pic="http://schemas.openxmlformats.org/drawingml/2006/picture">
             <wp:extent cx="5577840" cy="3053133"/>
-            <wp:docPr id="27" name="Picture 27" descr="Applied route changes. High traffic (200 background vehicles): Mist Dynamic 0.33; Mist + Fog 0.33. Bars show means and 95% confidence intervals."/>
+            <wp:docPr id="27" name="Picture 27" descr="Applied route changes. High traffic (200 background vehicles): Mist Dynamic 0.37; Mist + Fog 0.37. Bars show means and 95% confidence intervals."/>
             <wp:cNvGraphicFramePr>
               <a:graphicFrameLocks noChangeAspect="1"/>
             </wp:cNvGraphicFramePr>
@@ -7630,7 +7670,7 @@
         <w:spacing w:after="200"/>
       </w:pPr>
       <w:r>
-        <w:t>Figure 27. High traffic (200 background vehicles): Mist Dynamic 0.33; Mist + Fog 0.33. Bars show means and 95% confidence intervals.</w:t>
+        <w:t>Figure 27. High traffic (200 background vehicles): Mist Dynamic 0.37; Mist + Fog 0.37. Bars show means and 95% confidence intervals.</w:t>
       </w:r>
     </w:p>
     <w:p>
@@ -7658,7 +7698,7 @@
         <w:drawing>
           <wp:inline xmlns:a="http://schemas.openxmlformats.org/drawingml/2006/main" xmlns:pic="http://schemas.openxmlformats.org/drawingml/2006/picture">
             <wp:extent cx="5577840" cy="3053133"/>
-            <wp:docPr id="28" name="Picture 28" descr="Route computation frequency. Low traffic (72 background vehicles): Mist Dynamic 21.90; Mist + Fog 22.00. Bars show means and 95% confidence intervals."/>
+            <wp:docPr id="28" name="Picture 28" descr="Route computation frequency. Low traffic (72 background vehicles): Mist Dynamic 22.03; Mist + Fog 22.03. Bars show means and 95% confidence intervals."/>
             <wp:cNvGraphicFramePr>
               <a:graphicFrameLocks noChangeAspect="1"/>
             </wp:cNvGraphicFramePr>
@@ -7695,7 +7735,7 @@
         <w:spacing w:after="200"/>
       </w:pPr>
       <w:r>
-        <w:t>Figure 28. Low traffic (72 background vehicles): Mist Dynamic 21.90; Mist + Fog 22.00. Bars show means and 95% confidence intervals.</w:t>
+        <w:t>Figure 28. Low traffic (72 background vehicles): Mist Dynamic 22.03; Mist + Fog 22.03. Bars show means and 95% confidence intervals.</w:t>
       </w:r>
     </w:p>
     <w:p>
@@ -7707,7 +7747,7 @@
         <w:drawing>
           <wp:inline xmlns:a="http://schemas.openxmlformats.org/drawingml/2006/main" xmlns:pic="http://schemas.openxmlformats.org/drawingml/2006/picture">
             <wp:extent cx="5577840" cy="3053133"/>
-            <wp:docPr id="29" name="Picture 29" descr="Route computation frequency. Medium traffic (144 background vehicles): Mist Dynamic 27.33; Mist + Fog 27.17. Bars show means and 95% confidence intervals."/>
+            <wp:docPr id="29" name="Picture 29" descr="Route computation frequency. Medium traffic (144 background vehicles): Mist Dynamic 27.20; Mist + Fog 27.10. Bars show means and 95% confidence intervals."/>
             <wp:cNvGraphicFramePr>
               <a:graphicFrameLocks noChangeAspect="1"/>
             </wp:cNvGraphicFramePr>
@@ -7744,7 +7784,7 @@
         <w:spacing w:after="200"/>
       </w:pPr>
       <w:r>
-        <w:t>Figure 29. Medium traffic (144 background vehicles): Mist Dynamic 27.33; Mist + Fog 27.17. Bars show means and 95% confidence intervals.</w:t>
+        <w:t>Figure 29. Medium traffic (144 background vehicles): Mist Dynamic 27.20; Mist + Fog 27.10. Bars show means and 95% confidence intervals.</w:t>
       </w:r>
     </w:p>
     <w:p>
@@ -7756,7 +7796,7 @@
         <w:drawing>
           <wp:inline xmlns:a="http://schemas.openxmlformats.org/drawingml/2006/main" xmlns:pic="http://schemas.openxmlformats.org/drawingml/2006/picture">
             <wp:extent cx="5577840" cy="3053133"/>
-            <wp:docPr id="30" name="Picture 30" descr="Route computation frequency. High traffic (200 background vehicles): Mist Dynamic 28.43; Mist + Fog 28.50. Bars show means and 95% confidence intervals."/>
+            <wp:docPr id="30" name="Picture 30" descr="Route computation frequency. High traffic (200 background vehicles): Mist Dynamic 28.67; Mist + Fog 28.67. Bars show means and 95% confidence intervals."/>
             <wp:cNvGraphicFramePr>
               <a:graphicFrameLocks noChangeAspect="1"/>
             </wp:cNvGraphicFramePr>
@@ -7793,7 +7833,7 @@
         <w:spacing w:after="200"/>
       </w:pPr>
       <w:r>
-        <w:t>Figure 30. High traffic (200 background vehicles): Mist Dynamic 28.43; Mist + Fog 28.50. Bars show means and 95% confidence intervals.</w:t>
+        <w:t>Figure 30. High traffic (200 background vehicles): Mist Dynamic 28.67; Mist + Fog 28.67. Bars show means and 95% confidence intervals.</w:t>
       </w:r>
     </w:p>
     <w:p>
@@ -7984,7 +8024,7 @@
         <w:drawing>
           <wp:inline xmlns:a="http://schemas.openxmlformats.org/drawingml/2006/main" xmlns:pic="http://schemas.openxmlformats.org/drawingml/2006/picture">
             <wp:extent cx="5577840" cy="3053133"/>
-            <wp:docPr id="34" name="Picture 34" descr="Control transmissions. Low traffic (72 background vehicles): Fog/Cloud 22,663; Mist 22,668; Mist Dynamic 22,662; Mist + Fog 22,658. Bars show means and 95% confidence intervals."/>
+            <wp:docPr id="34" name="Picture 34" descr="Control transmissions. Low traffic (72 background vehicles): Fog/Cloud 22,656; Mist 22,655; Mist Dynamic 22,647; Mist + Fog 22,653. Bars show means and 95% confidence intervals."/>
             <wp:cNvGraphicFramePr>
               <a:graphicFrameLocks noChangeAspect="1"/>
             </wp:cNvGraphicFramePr>
@@ -8021,7 +8061,7 @@
         <w:spacing w:after="200"/>
       </w:pPr>
       <w:r>
-        <w:t>Figure 34. Low traffic (72 background vehicles): Fog/Cloud 22,663; Mist 22,668; Mist Dynamic 22,662; Mist + Fog 22,658. Bars show means and 95% confidence intervals.</w:t>
+        <w:t>Figure 34. Low traffic (72 background vehicles): Fog/Cloud 22,656; Mist 22,655; Mist Dynamic 22,647; Mist + Fog 22,653. Bars show means and 95% confidence intervals.</w:t>
       </w:r>
     </w:p>
     <w:p>
@@ -8033,7 +8073,7 @@
         <w:drawing>
           <wp:inline xmlns:a="http://schemas.openxmlformats.org/drawingml/2006/main" xmlns:pic="http://schemas.openxmlformats.org/drawingml/2006/picture">
             <wp:extent cx="5577840" cy="3053133"/>
-            <wp:docPr id="35" name="Picture 35" descr="Control transmissions. Medium traffic (144 background vehicles): Fog/Cloud 39,997; Mist 39,966; Mist Dynamic 39,992; Mist + Fog 39,965. Bars show means and 95% confidence intervals."/>
+            <wp:docPr id="35" name="Picture 35" descr="Control transmissions. Medium traffic (144 background vehicles): Fog/Cloud 39,994; Mist 40,005; Mist Dynamic 40,031; Mist + Fog 40,013. Bars show means and 95% confidence intervals."/>
             <wp:cNvGraphicFramePr>
               <a:graphicFrameLocks noChangeAspect="1"/>
             </wp:cNvGraphicFramePr>
@@ -8070,7 +8110,7 @@
         <w:spacing w:after="200"/>
       </w:pPr>
       <w:r>
-        <w:t>Figure 35. Medium traffic (144 background vehicles): Fog/Cloud 39,997; Mist 39,966; Mist Dynamic 39,992; Mist + Fog 39,965. Bars show means and 95% confidence intervals.</w:t>
+        <w:t>Figure 35. Medium traffic (144 background vehicles): Fog/Cloud 39,994; Mist 40,005; Mist Dynamic 40,031; Mist + Fog 40,013. Bars show means and 95% confidence intervals.</w:t>
       </w:r>
     </w:p>
     <w:p>
@@ -8082,7 +8122,7 @@
         <w:drawing>
           <wp:inline xmlns:a="http://schemas.openxmlformats.org/drawingml/2006/main" xmlns:pic="http://schemas.openxmlformats.org/drawingml/2006/picture">
             <wp:extent cx="5577840" cy="3053133"/>
-            <wp:docPr id="36" name="Picture 36" descr="Control transmissions. High traffic (200 background vehicles): Fog/Cloud 54,340; Mist 54,218; Mist Dynamic 54,171; Mist + Fog 54,218. Bars show means and 95% confidence intervals."/>
+            <wp:docPr id="36" name="Picture 36" descr="Control transmissions. High traffic (200 background vehicles): Fog/Cloud 54,390; Mist 54,251; Mist Dynamic 54,294; Mist + Fog 54,237. Bars show means and 95% confidence intervals."/>
             <wp:cNvGraphicFramePr>
               <a:graphicFrameLocks noChangeAspect="1"/>
             </wp:cNvGraphicFramePr>
@@ -8119,7 +8159,7 @@
         <w:spacing w:after="200"/>
       </w:pPr>
       <w:r>
-        <w:t>Figure 36. High traffic (200 background vehicles): Fog/Cloud 54,340; Mist 54,218; Mist Dynamic 54,171; Mist + Fog 54,218. Bars show means and 95% confidence intervals.</w:t>
+        <w:t>Figure 36. High traffic (200 background vehicles): Fog/Cloud 54,390; Mist 54,251; Mist Dynamic 54,294; Mist + Fog 54,237. Bars show means and 95% confidence intervals.</w:t>
       </w:r>
     </w:p>
     <w:p>
@@ -8147,7 +8187,7 @@
         <w:drawing>
           <wp:inline xmlns:a="http://schemas.openxmlformats.org/drawingml/2006/main" xmlns:pic="http://schemas.openxmlformats.org/drawingml/2006/picture">
             <wp:extent cx="5577840" cy="3053133"/>
-            <wp:docPr id="37" name="Picture 37" descr="Control bytes. Low traffic (72 background vehicles): Fog/Cloud 1,813,206; Mist 1,813,506; Mist Dynamic 1,813,002; Mist + Fog 1,812,736. Bars show means and 95% confidence intervals."/>
+            <wp:docPr id="37" name="Picture 37" descr="Control bytes. Low traffic (72 background vehicles): Fog/Cloud 1,812,643; Mist 1,812,487; Mist Dynamic 1,811,834; Mist + Fog 1,812,378. Bars show means and 95% confidence intervals."/>
             <wp:cNvGraphicFramePr>
               <a:graphicFrameLocks noChangeAspect="1"/>
             </wp:cNvGraphicFramePr>
@@ -8184,7 +8224,7 @@
         <w:spacing w:after="200"/>
       </w:pPr>
       <w:r>
-        <w:t>Figure 37. Low traffic (72 background vehicles): Fog/Cloud 1,813,206; Mist 1,813,506; Mist Dynamic 1,813,002; Mist + Fog 1,812,736. Bars show means and 95% confidence intervals.</w:t>
+        <w:t>Figure 37. Low traffic (72 background vehicles): Fog/Cloud 1,812,643; Mist 1,812,487; Mist Dynamic 1,811,834; Mist + Fog 1,812,378. Bars show means and 95% confidence intervals.</w:t>
       </w:r>
     </w:p>
     <w:p>
@@ -8196,7 +8236,7 @@
         <w:drawing>
           <wp:inline xmlns:a="http://schemas.openxmlformats.org/drawingml/2006/main" xmlns:pic="http://schemas.openxmlformats.org/drawingml/2006/picture">
             <wp:extent cx="5577840" cy="3053133"/>
-            <wp:docPr id="38" name="Picture 38" descr="Control bytes. Medium traffic (144 background vehicles): Fog/Cloud 3,200,003; Mist 3,197,365; Mist Dynamic 3,199,463; Mist + Fog 3,197,369. Bars show means and 95% confidence intervals."/>
+            <wp:docPr id="38" name="Picture 38" descr="Control bytes. Medium traffic (144 background vehicles): Fog/Cloud 3,199,768; Mist 3,200,463; Mist Dynamic 3,202,549; Mist + Fog 3,201,222. Bars show means and 95% confidence intervals."/>
             <wp:cNvGraphicFramePr>
               <a:graphicFrameLocks noChangeAspect="1"/>
             </wp:cNvGraphicFramePr>
@@ -8233,7 +8273,7 @@
         <w:spacing w:after="200"/>
       </w:pPr>
       <w:r>
-        <w:t>Figure 38. Medium traffic (144 background vehicles): Fog/Cloud 3,200,003; Mist 3,197,365; Mist Dynamic 3,199,463; Mist + Fog 3,197,369. Bars show means and 95% confidence intervals.</w:t>
+        <w:t>Figure 38. Medium traffic (144 background vehicles): Fog/Cloud 3,199,768; Mist 3,200,463; Mist Dynamic 3,202,549; Mist + Fog 3,201,222. Bars show means and 95% confidence intervals.</w:t>
       </w:r>
     </w:p>
     <w:p>
@@ -8245,7 +8285,7 @@
         <w:drawing>
           <wp:inline xmlns:a="http://schemas.openxmlformats.org/drawingml/2006/main" xmlns:pic="http://schemas.openxmlformats.org/drawingml/2006/picture">
             <wp:extent cx="5577840" cy="3053133"/>
-            <wp:docPr id="39" name="Picture 39" descr="Control bytes. High traffic (200 background vehicles): Fog/Cloud 4,347,408; Mist 4,337,520; Mist Dynamic 4,333,800; Mist + Fog 4,337,589. Bars show means and 95% confidence intervals."/>
+            <wp:docPr id="39" name="Picture 39" descr="Control bytes. High traffic (200 background vehicles): Fog/Cloud 4,351,458; Mist 4,340,157; Mist Dynamic 4,343,608; Mist + Fog 4,339,125. Bars show means and 95% confidence intervals."/>
             <wp:cNvGraphicFramePr>
               <a:graphicFrameLocks noChangeAspect="1"/>
             </wp:cNvGraphicFramePr>
@@ -8282,7 +8322,7 @@
         <w:spacing w:after="200"/>
       </w:pPr>
       <w:r>
-        <w:t>Figure 39. High traffic (200 background vehicles): Fog/Cloud 4,347,408; Mist 4,337,520; Mist Dynamic 4,333,800; Mist + Fog 4,337,589. Bars show means and 95% confidence intervals.</w:t>
+        <w:t>Figure 39. High traffic (200 background vehicles): Fog/Cloud 4,351,458; Mist 4,340,157; Mist Dynamic 4,343,608; Mist + Fog 4,339,125. Bars show means and 95% confidence intervals.</w:t>
       </w:r>
     </w:p>
     <w:p>
@@ -8310,7 +8350,7 @@
         <w:drawing>
           <wp:inline xmlns:a="http://schemas.openxmlformats.org/drawingml/2006/main" xmlns:pic="http://schemas.openxmlformats.org/drawingml/2006/picture">
             <wp:extent cx="5577840" cy="3053133"/>
-            <wp:docPr id="40" name="Picture 40" descr="EV corridor delay versus free flow. Low traffic (72 background vehicles): Fog/Cloud 24.3; Mist 24.4; Mist Dynamic 23.8; Mist + Fog 23.9. Bars show means and 95% confidence intervals."/>
+            <wp:docPr id="40" name="Picture 40" descr="EV corridor delay versus free flow. Low traffic (72 background vehicles): Fog/Cloud 24.3; Mist 24.7; Mist Dynamic 24.2; Mist + Fog 24.4. Bars show means and 95% confidence intervals."/>
             <wp:cNvGraphicFramePr>
               <a:graphicFrameLocks noChangeAspect="1"/>
             </wp:cNvGraphicFramePr>
@@ -8347,7 +8387,7 @@
         <w:spacing w:after="200"/>
       </w:pPr>
       <w:r>
-        <w:t>Figure 40. Low traffic (72 background vehicles): Fog/Cloud 24.3; Mist 24.4; Mist Dynamic 23.8; Mist + Fog 23.9. Bars show means and 95% confidence intervals.</w:t>
+        <w:t>Figure 40. Low traffic (72 background vehicles): Fog/Cloud 24.3; Mist 24.7; Mist Dynamic 24.2; Mist + Fog 24.4. Bars show means and 95% confidence intervals.</w:t>
       </w:r>
     </w:p>
     <w:p>
@@ -8359,7 +8399,7 @@
         <w:drawing>
           <wp:inline xmlns:a="http://schemas.openxmlformats.org/drawingml/2006/main" xmlns:pic="http://schemas.openxmlformats.org/drawingml/2006/picture">
             <wp:extent cx="5577840" cy="3053133"/>
-            <wp:docPr id="41" name="Picture 41" descr="EV corridor delay versus free flow. Medium traffic (144 background vehicles): Fog/Cloud 25.6; Mist 26.7; Mist Dynamic 25.6; Mist + Fog 25.5. Bars show means and 95% confidence intervals."/>
+            <wp:docPr id="41" name="Picture 41" descr="EV corridor delay versus free flow. Medium traffic (144 background vehicles): Fog/Cloud 25.5; Mist 26.0; Mist Dynamic 25.3; Mist + Fog 25.2. Bars show means and 95% confidence intervals."/>
             <wp:cNvGraphicFramePr>
               <a:graphicFrameLocks noChangeAspect="1"/>
             </wp:cNvGraphicFramePr>
@@ -8396,7 +8436,7 @@
         <w:spacing w:after="200"/>
       </w:pPr>
       <w:r>
-        <w:t>Figure 41. Medium traffic (144 background vehicles): Fog/Cloud 25.6; Mist 26.7; Mist Dynamic 25.6; Mist + Fog 25.5. Bars show means and 95% confidence intervals.</w:t>
+        <w:t>Figure 41. Medium traffic (144 background vehicles): Fog/Cloud 25.5; Mist 26.0; Mist Dynamic 25.3; Mist + Fog 25.2. Bars show means and 95% confidence intervals.</w:t>
       </w:r>
     </w:p>
     <w:p>
@@ -8408,7 +8448,7 @@
         <w:drawing>
           <wp:inline xmlns:a="http://schemas.openxmlformats.org/drawingml/2006/main" xmlns:pic="http://schemas.openxmlformats.org/drawingml/2006/picture">
             <wp:extent cx="5577840" cy="3053133"/>
-            <wp:docPr id="42" name="Picture 42" descr="EV corridor delay versus free flow. High traffic (200 background vehicles): Fog/Cloud 27.3; Mist 28.2; Mist Dynamic 25.5; Mist + Fog 25.7. Bars show means and 95% confidence intervals."/>
+            <wp:docPr id="42" name="Picture 42" descr="EV corridor delay versus free flow. High traffic (200 background vehicles): Fog/Cloud 27.3; Mist 28.2; Mist Dynamic 26.1; Mist + Fog 26.2. Bars show means and 95% confidence intervals."/>
             <wp:cNvGraphicFramePr>
               <a:graphicFrameLocks noChangeAspect="1"/>
             </wp:cNvGraphicFramePr>
@@ -8445,7 +8485,7 @@
         <w:spacing w:after="200"/>
       </w:pPr>
       <w:r>
-        <w:t>Figure 42. High traffic (200 background vehicles): Fog/Cloud 27.3; Mist 28.2; Mist Dynamic 25.5; Mist + Fog 25.7. Bars show means and 95% confidence intervals.</w:t>
+        <w:t>Figure 42. High traffic (200 background vehicles): Fog/Cloud 27.3; Mist 28.2; Mist Dynamic 26.1; Mist + Fog 26.2. Bars show means and 95% confidence intervals.</w:t>
       </w:r>
     </w:p>
     <w:p>
@@ -8473,7 +8513,7 @@
         <w:drawing>
           <wp:inline xmlns:a="http://schemas.openxmlformats.org/drawingml/2006/main" xmlns:pic="http://schemas.openxmlformats.org/drawingml/2006/picture">
             <wp:extent cx="5577840" cy="3053133"/>
-            <wp:docPr id="43" name="Picture 43" descr="EV route distance. Low traffic (72 background vehicles): Fog/Cloud 1778.7; Mist 1778.1; Mist Dynamic 1778.5; Mist + Fog 1778.6. Bars show means and 95% confidence intervals."/>
+            <wp:docPr id="43" name="Picture 43" descr="EV route distance. Low traffic (72 background vehicles): Fog/Cloud 1778.9; Mist 1778.9; Mist Dynamic 1779.0; Mist + Fog 1778.6. Bars show means and 95% confidence intervals."/>
             <wp:cNvGraphicFramePr>
               <a:graphicFrameLocks noChangeAspect="1"/>
             </wp:cNvGraphicFramePr>
@@ -8510,7 +8550,7 @@
         <w:spacing w:after="200"/>
       </w:pPr>
       <w:r>
-        <w:t>Figure 43. Low traffic (72 background vehicles): Fog/Cloud 1778.7; Mist 1778.1; Mist Dynamic 1778.5; Mist + Fog 1778.6. Bars show means and 95% confidence intervals.</w:t>
+        <w:t>Figure 43. Low traffic (72 background vehicles): Fog/Cloud 1778.9; Mist 1778.9; Mist Dynamic 1779.0; Mist + Fog 1778.6. Bars show means and 95% confidence intervals.</w:t>
       </w:r>
     </w:p>
     <w:p>
@@ -8522,7 +8562,7 @@
         <w:drawing>
           <wp:inline xmlns:a="http://schemas.openxmlformats.org/drawingml/2006/main" xmlns:pic="http://schemas.openxmlformats.org/drawingml/2006/picture">
             <wp:extent cx="5577840" cy="3053133"/>
-            <wp:docPr id="44" name="Picture 44" descr="EV route distance. Medium traffic (144 background vehicles): Fog/Cloud 1779.2; Mist 1778.7; Mist Dynamic 1779.2; Mist + Fog 1779.5. Bars show means and 95% confidence intervals."/>
+            <wp:docPr id="44" name="Picture 44" descr="EV route distance. Medium traffic (144 background vehicles): Fog/Cloud 1778.9; Mist 1779.0; Mist Dynamic 1779.4; Mist + Fog 1779.6. Bars show means and 95% confidence intervals."/>
             <wp:cNvGraphicFramePr>
               <a:graphicFrameLocks noChangeAspect="1"/>
             </wp:cNvGraphicFramePr>
@@ -8559,7 +8599,7 @@
         <w:spacing w:after="200"/>
       </w:pPr>
       <w:r>
-        <w:t>Figure 44. Medium traffic (144 background vehicles): Fog/Cloud 1779.2; Mist 1778.7; Mist Dynamic 1779.2; Mist + Fog 1779.5. Bars show means and 95% confidence intervals.</w:t>
+        <w:t>Figure 44. Medium traffic (144 background vehicles): Fog/Cloud 1778.9; Mist 1779.0; Mist Dynamic 1779.4; Mist + Fog 1779.6. Bars show means and 95% confidence intervals.</w:t>
       </w:r>
     </w:p>
     <w:p>
@@ -8571,7 +8611,7 @@
         <w:drawing>
           <wp:inline xmlns:a="http://schemas.openxmlformats.org/drawingml/2006/main" xmlns:pic="http://schemas.openxmlformats.org/drawingml/2006/picture">
             <wp:extent cx="5577840" cy="3053133"/>
-            <wp:docPr id="45" name="Picture 45" descr="EV route distance. High traffic (200 background vehicles): Fog/Cloud 1778.9; Mist 1778.9; Mist Dynamic 1780.3; Mist + Fog 1780.1. Bars show means and 95% confidence intervals."/>
+            <wp:docPr id="45" name="Picture 45" descr="EV route distance. High traffic (200 background vehicles): Fog/Cloud 1778.4; Mist 1778.7; Mist Dynamic 1780.3; Mist + Fog 1780.3. Bars show means and 95% confidence intervals."/>
             <wp:cNvGraphicFramePr>
               <a:graphicFrameLocks noChangeAspect="1"/>
             </wp:cNvGraphicFramePr>
@@ -8608,7 +8648,7 @@
         <w:spacing w:after="200"/>
       </w:pPr>
       <w:r>
-        <w:t>Figure 45. High traffic (200 background vehicles): Fog/Cloud 1778.9; Mist 1778.9; Mist Dynamic 1780.3; Mist + Fog 1780.1. Bars show means and 95% confidence intervals.</w:t>
+        <w:t>Figure 45. High traffic (200 background vehicles): Fog/Cloud 1778.4; Mist 1778.7; Mist Dynamic 1780.3; Mist + Fog 1780.3. Bars show means and 95% confidence intervals.</w:t>
       </w:r>
     </w:p>
     <w:p>
@@ -8636,7 +8676,7 @@
         <w:drawing>
           <wp:inline xmlns:a="http://schemas.openxmlformats.org/drawingml/2006/main" xmlns:pic="http://schemas.openxmlformats.org/drawingml/2006/picture">
             <wp:extent cx="5577840" cy="3053133"/>
-            <wp:docPr id="46" name="Picture 46" descr="EV travel time. Low traffic (72 background vehicles): Fog/Cloud 152.3; Mist 152.3; Mist Dynamic 151.7; Mist + Fog 151.9. Bars show means and 95% confidence intervals."/>
+            <wp:docPr id="46" name="Picture 46" descr="EV travel time. Low traffic (72 background vehicles): Fog/Cloud 152.3; Mist 152.7; Mist Dynamic 152.2; Mist + Fog 152.3. Bars show means and 95% confidence intervals."/>
             <wp:cNvGraphicFramePr>
               <a:graphicFrameLocks noChangeAspect="1"/>
             </wp:cNvGraphicFramePr>
@@ -8673,7 +8713,7 @@
         <w:spacing w:after="200"/>
       </w:pPr>
       <w:r>
-        <w:t>Figure 46. Low traffic (72 background vehicles): Fog/Cloud 152.3; Mist 152.3; Mist Dynamic 151.7; Mist + Fog 151.9. Bars show means and 95% confidence intervals.</w:t>
+        <w:t>Figure 46. Low traffic (72 background vehicles): Fog/Cloud 152.3; Mist 152.7; Mist Dynamic 152.2; Mist + Fog 152.3. Bars show means and 95% confidence intervals.</w:t>
       </w:r>
     </w:p>
     <w:p>
@@ -8685,7 +8725,7 @@
         <w:drawing>
           <wp:inline xmlns:a="http://schemas.openxmlformats.org/drawingml/2006/main" xmlns:pic="http://schemas.openxmlformats.org/drawingml/2006/picture">
             <wp:extent cx="5577840" cy="3053133"/>
-            <wp:docPr id="47" name="Picture 47" descr="EV travel time. Medium traffic (144 background vehicles): Fog/Cloud 153.6; Mist 154.7; Mist Dynamic 153.6; Mist + Fog 153.5. Bars show means and 95% confidence intervals."/>
+            <wp:docPr id="47" name="Picture 47" descr="EV travel time. Medium traffic (144 background vehicles): Fog/Cloud 153.5; Mist 153.9; Mist Dynamic 153.3; Mist + Fog 153.3. Bars show means and 95% confidence intervals."/>
             <wp:cNvGraphicFramePr>
               <a:graphicFrameLocks noChangeAspect="1"/>
             </wp:cNvGraphicFramePr>
@@ -8722,7 +8762,7 @@
         <w:spacing w:after="200"/>
       </w:pPr>
       <w:r>
-        <w:t>Figure 47. Medium traffic (144 background vehicles): Fog/Cloud 153.6; Mist 154.7; Mist Dynamic 153.6; Mist + Fog 153.5. Bars show means and 95% confidence intervals.</w:t>
+        <w:t>Figure 47. Medium traffic (144 background vehicles): Fog/Cloud 153.5; Mist 153.9; Mist Dynamic 153.3; Mist + Fog 153.3. Bars show means and 95% confidence intervals.</w:t>
       </w:r>
     </w:p>
     <w:p>
@@ -8734,7 +8774,7 @@
         <w:drawing>
           <wp:inline xmlns:a="http://schemas.openxmlformats.org/drawingml/2006/main" xmlns:pic="http://schemas.openxmlformats.org/drawingml/2006/picture">
             <wp:extent cx="5577840" cy="3053133"/>
-            <wp:docPr id="48" name="Picture 48" descr="EV travel time. High traffic (200 background vehicles): Fog/Cloud 155.3; Mist 156.2; Mist Dynamic 153.6; Mist + Fog 153.7. Bars show means and 95% confidence intervals."/>
+            <wp:docPr id="48" name="Picture 48" descr="EV travel time. High traffic (200 background vehicles): Fog/Cloud 155.2; Mist 156.1; Mist Dynamic 154.2; Mist + Fog 154.3. Bars show means and 95% confidence intervals."/>
             <wp:cNvGraphicFramePr>
               <a:graphicFrameLocks noChangeAspect="1"/>
             </wp:cNvGraphicFramePr>
@@ -8771,7 +8811,985 @@
         <w:spacing w:after="200"/>
       </w:pPr>
       <w:r>
-        <w:t>Figure 48. High traffic (200 background vehicles): Fog/Cloud 155.3; Mist 156.2; Mist Dynamic 153.6; Mist + Fog 153.7. Bars show means and 95% confidence intervals.</w:t>
+        <w:t>Figure 48. High traffic (200 background vehicles): Fog/Cloud 155.2; Mist 156.1; Mist Dynamic 154.2; Mist + Fog 154.3. Bars show means and 95% confidence intervals.</w:t>
+      </w:r>
+    </w:p>
+    <w:p>
+      <w:pPr>
+        <w:pStyle w:val="Heading2"/>
+      </w:pPr>
+      <w:r>
+        <w:t>Normal operation route decision latency</w:t>
+      </w:r>
+    </w:p>
+    <w:p>
+      <w:pPr>
+        <w:keepNext/>
+      </w:pPr>
+      <w:r>
+        <w:t>These figures separate seeds without a stall from seeds assigned the controlled 900 ms Mist stall. Fog/Cloud is unaffected by that local stall.</w:t>
+      </w:r>
+    </w:p>
+    <w:p>
+      <w:pPr>
+        <w:keepNext/>
+        <w:jc w:val="center"/>
+      </w:pPr>
+      <w:r>
+        <w:drawing>
+          <wp:inline xmlns:a="http://schemas.openxmlformats.org/drawingml/2006/main" xmlns:pic="http://schemas.openxmlformats.org/drawingml/2006/picture">
+            <wp:extent cx="5577840" cy="3053133"/>
+            <wp:docPr id="49" name="Picture 49" descr="Normal operation route decision latency. Low traffic, normal operation: Fog/Cloud 626.54 ms (n=17); Mist 326.00 ms (n=17); Mist Dynamic 326.00 ms (n=17); Mist + Fog 326.00 ms (n=17). Error bars show 95% confidence intervals."/>
+            <wp:cNvGraphicFramePr>
+              <a:graphicFrameLocks noChangeAspect="1"/>
+            </wp:cNvGraphicFramePr>
+            <a:graphic>
+              <a:graphicData uri="http://schemas.openxmlformats.org/drawingml/2006/picture">
+                <pic:pic>
+                  <pic:nvPicPr>
+                    <pic:cNvPr id="0" name="route_decision_ms-normal-low.png"/>
+                    <pic:cNvPicPr/>
+                  </pic:nvPicPr>
+                  <pic:blipFill>
+                    <a:blip r:embed="rId57"/>
+                    <a:stretch>
+                      <a:fillRect/>
+                    </a:stretch>
+                  </pic:blipFill>
+                  <pic:spPr>
+                    <a:xfrm>
+                      <a:off x="0" y="0"/>
+                      <a:ext cx="5577840" cy="3053133"/>
+                    </a:xfrm>
+                    <a:prstGeom prst="rect"/>
+                  </pic:spPr>
+                </pic:pic>
+              </a:graphicData>
+            </a:graphic>
+          </wp:inline>
+        </w:drawing>
+      </w:r>
+    </w:p>
+    <w:p>
+      <w:pPr>
+        <w:keepLines/>
+        <w:spacing w:after="200"/>
+      </w:pPr>
+      <w:r>
+        <w:t>Figure 49. Low traffic, normal operation: Fog/Cloud 626.54 ms (n=17); Mist 326.00 ms (n=17); Mist Dynamic 326.00 ms (n=17); Mist + Fog 326.00 ms (n=17). Error bars show 95% confidence intervals.</w:t>
+      </w:r>
+    </w:p>
+    <w:p>
+      <w:pPr>
+        <w:keepNext/>
+        <w:jc w:val="center"/>
+      </w:pPr>
+      <w:r>
+        <w:drawing>
+          <wp:inline xmlns:a="http://schemas.openxmlformats.org/drawingml/2006/main" xmlns:pic="http://schemas.openxmlformats.org/drawingml/2006/picture">
+            <wp:extent cx="5577840" cy="3053133"/>
+            <wp:docPr id="50" name="Picture 50" descr="Normal operation route decision latency. Medium traffic, normal operation: Fog/Cloud 626.54 ms (n=21); Mist 326.00 ms (n=21); Mist Dynamic 326.00 ms (n=21); Mist + Fog 326.00 ms (n=21). Error bars show 95% confidence intervals."/>
+            <wp:cNvGraphicFramePr>
+              <a:graphicFrameLocks noChangeAspect="1"/>
+            </wp:cNvGraphicFramePr>
+            <a:graphic>
+              <a:graphicData uri="http://schemas.openxmlformats.org/drawingml/2006/picture">
+                <pic:pic>
+                  <pic:nvPicPr>
+                    <pic:cNvPr id="0" name="route_decision_ms-normal-medium.png"/>
+                    <pic:cNvPicPr/>
+                  </pic:nvPicPr>
+                  <pic:blipFill>
+                    <a:blip r:embed="rId58"/>
+                    <a:stretch>
+                      <a:fillRect/>
+                    </a:stretch>
+                  </pic:blipFill>
+                  <pic:spPr>
+                    <a:xfrm>
+                      <a:off x="0" y="0"/>
+                      <a:ext cx="5577840" cy="3053133"/>
+                    </a:xfrm>
+                    <a:prstGeom prst="rect"/>
+                  </pic:spPr>
+                </pic:pic>
+              </a:graphicData>
+            </a:graphic>
+          </wp:inline>
+        </w:drawing>
+      </w:r>
+    </w:p>
+    <w:p>
+      <w:pPr>
+        <w:keepLines/>
+        <w:spacing w:after="200"/>
+      </w:pPr>
+      <w:r>
+        <w:t>Figure 50. Medium traffic, normal operation: Fog/Cloud 626.54 ms (n=21); Mist 326.00 ms (n=21); Mist Dynamic 326.00 ms (n=21); Mist + Fog 326.00 ms (n=21). Error bars show 95% confidence intervals.</w:t>
+      </w:r>
+    </w:p>
+    <w:p>
+      <w:pPr>
+        <w:keepNext/>
+        <w:jc w:val="center"/>
+      </w:pPr>
+      <w:r>
+        <w:drawing>
+          <wp:inline xmlns:a="http://schemas.openxmlformats.org/drawingml/2006/main" xmlns:pic="http://schemas.openxmlformats.org/drawingml/2006/picture">
+            <wp:extent cx="5577840" cy="3053133"/>
+            <wp:docPr id="51" name="Picture 51" descr="Normal operation route decision latency. High traffic, normal operation: Fog/Cloud 626.54 ms (n=22); Mist 326.00 ms (n=22); Mist Dynamic 326.00 ms (n=22); Mist + Fog 326.00 ms (n=22). Error bars show 95% confidence intervals."/>
+            <wp:cNvGraphicFramePr>
+              <a:graphicFrameLocks noChangeAspect="1"/>
+            </wp:cNvGraphicFramePr>
+            <a:graphic>
+              <a:graphicData uri="http://schemas.openxmlformats.org/drawingml/2006/picture">
+                <pic:pic>
+                  <pic:nvPicPr>
+                    <pic:cNvPr id="0" name="route_decision_ms-normal-high.png"/>
+                    <pic:cNvPicPr/>
+                  </pic:nvPicPr>
+                  <pic:blipFill>
+                    <a:blip r:embed="rId59"/>
+                    <a:stretch>
+                      <a:fillRect/>
+                    </a:stretch>
+                  </pic:blipFill>
+                  <pic:spPr>
+                    <a:xfrm>
+                      <a:off x="0" y="0"/>
+                      <a:ext cx="5577840" cy="3053133"/>
+                    </a:xfrm>
+                    <a:prstGeom prst="rect"/>
+                  </pic:spPr>
+                </pic:pic>
+              </a:graphicData>
+            </a:graphic>
+          </wp:inline>
+        </w:drawing>
+      </w:r>
+    </w:p>
+    <w:p>
+      <w:pPr>
+        <w:keepLines/>
+        <w:spacing w:after="200"/>
+      </w:pPr>
+      <w:r>
+        <w:t>Figure 51. High traffic, normal operation: Fog/Cloud 626.54 ms (n=22); Mist 326.00 ms (n=22); Mist Dynamic 326.00 ms (n=22); Mist + Fog 326.00 ms (n=22). Error bars show 95% confidence intervals.</w:t>
+      </w:r>
+    </w:p>
+    <w:p>
+      <w:pPr>
+        <w:pStyle w:val="Heading2"/>
+      </w:pPr>
+      <w:r>
+        <w:t>Normal operation ev response time</w:t>
+      </w:r>
+    </w:p>
+    <w:p>
+      <w:pPr>
+        <w:keepNext/>
+      </w:pPr>
+      <w:r>
+        <w:t>These figures separate seeds without a stall from seeds assigned the controlled 900 ms Mist stall. Fog/Cloud is unaffected by that local stall.</w:t>
+      </w:r>
+    </w:p>
+    <w:p>
+      <w:pPr>
+        <w:keepNext/>
+        <w:jc w:val="center"/>
+      </w:pPr>
+      <w:r>
+        <w:drawing>
+          <wp:inline xmlns:a="http://schemas.openxmlformats.org/drawingml/2006/main" xmlns:pic="http://schemas.openxmlformats.org/drawingml/2006/picture">
+            <wp:extent cx="5577840" cy="3053133"/>
+            <wp:docPr id="52" name="Picture 52" descr="Normal operation ev response time. Low traffic, normal operation: Fog/Cloud 153.41 s (n=17); Mist 153.65 s (n=17); Mist Dynamic 152.97 s (n=17); Mist + Fog 152.97 s (n=17). Error bars show 95% confidence intervals."/>
+            <wp:cNvGraphicFramePr>
+              <a:graphicFrameLocks noChangeAspect="1"/>
+            </wp:cNvGraphicFramePr>
+            <a:graphic>
+              <a:graphicData uri="http://schemas.openxmlformats.org/drawingml/2006/picture">
+                <pic:pic>
+                  <pic:nvPicPr>
+                    <pic:cNvPr id="0" name="ev_response_s-normal-low.png"/>
+                    <pic:cNvPicPr/>
+                  </pic:nvPicPr>
+                  <pic:blipFill>
+                    <a:blip r:embed="rId60"/>
+                    <a:stretch>
+                      <a:fillRect/>
+                    </a:stretch>
+                  </pic:blipFill>
+                  <pic:spPr>
+                    <a:xfrm>
+                      <a:off x="0" y="0"/>
+                      <a:ext cx="5577840" cy="3053133"/>
+                    </a:xfrm>
+                    <a:prstGeom prst="rect"/>
+                  </pic:spPr>
+                </pic:pic>
+              </a:graphicData>
+            </a:graphic>
+          </wp:inline>
+        </w:drawing>
+      </w:r>
+    </w:p>
+    <w:p>
+      <w:pPr>
+        <w:keepLines/>
+        <w:spacing w:after="200"/>
+      </w:pPr>
+      <w:r>
+        <w:t>Figure 52. Low traffic, normal operation: Fog/Cloud 153.41 s (n=17); Mist 153.65 s (n=17); Mist Dynamic 152.97 s (n=17); Mist + Fog 152.97 s (n=17). Error bars show 95% confidence intervals.</w:t>
+      </w:r>
+    </w:p>
+    <w:p>
+      <w:pPr>
+        <w:keepNext/>
+        <w:jc w:val="center"/>
+      </w:pPr>
+      <w:r>
+        <w:drawing>
+          <wp:inline xmlns:a="http://schemas.openxmlformats.org/drawingml/2006/main" xmlns:pic="http://schemas.openxmlformats.org/drawingml/2006/picture">
+            <wp:extent cx="5577840" cy="3053133"/>
+            <wp:docPr id="53" name="Picture 53" descr="Normal operation ev response time. Medium traffic, normal operation: Fog/Cloud 154.76 s (n=21); Mist 155.05 s (n=21); Mist Dynamic 154.81 s (n=21); Mist + Fog 154.81 s (n=21). Error bars show 95% confidence intervals."/>
+            <wp:cNvGraphicFramePr>
+              <a:graphicFrameLocks noChangeAspect="1"/>
+            </wp:cNvGraphicFramePr>
+            <a:graphic>
+              <a:graphicData uri="http://schemas.openxmlformats.org/drawingml/2006/picture">
+                <pic:pic>
+                  <pic:nvPicPr>
+                    <pic:cNvPr id="0" name="ev_response_s-normal-medium.png"/>
+                    <pic:cNvPicPr/>
+                  </pic:nvPicPr>
+                  <pic:blipFill>
+                    <a:blip r:embed="rId61"/>
+                    <a:stretch>
+                      <a:fillRect/>
+                    </a:stretch>
+                  </pic:blipFill>
+                  <pic:spPr>
+                    <a:xfrm>
+                      <a:off x="0" y="0"/>
+                      <a:ext cx="5577840" cy="3053133"/>
+                    </a:xfrm>
+                    <a:prstGeom prst="rect"/>
+                  </pic:spPr>
+                </pic:pic>
+              </a:graphicData>
+            </a:graphic>
+          </wp:inline>
+        </w:drawing>
+      </w:r>
+    </w:p>
+    <w:p>
+      <w:pPr>
+        <w:keepLines/>
+        <w:spacing w:after="200"/>
+      </w:pPr>
+      <w:r>
+        <w:t>Figure 53. Medium traffic, normal operation: Fog/Cloud 154.76 s (n=21); Mist 155.05 s (n=21); Mist Dynamic 154.81 s (n=21); Mist + Fog 154.81 s (n=21). Error bars show 95% confidence intervals.</w:t>
+      </w:r>
+    </w:p>
+    <w:p>
+      <w:pPr>
+        <w:keepNext/>
+        <w:jc w:val="center"/>
+      </w:pPr>
+      <w:r>
+        <w:drawing>
+          <wp:inline xmlns:a="http://schemas.openxmlformats.org/drawingml/2006/main" xmlns:pic="http://schemas.openxmlformats.org/drawingml/2006/picture">
+            <wp:extent cx="5577840" cy="3053133"/>
+            <wp:docPr id="54" name="Picture 54" descr="Normal operation ev response time. High traffic, normal operation: Fog/Cloud 156.55 s (n=22); Mist 156.98 s (n=22); Mist Dynamic 155.02 s (n=22); Mist + Fog 155.02 s (n=22). Error bars show 95% confidence intervals."/>
+            <wp:cNvGraphicFramePr>
+              <a:graphicFrameLocks noChangeAspect="1"/>
+            </wp:cNvGraphicFramePr>
+            <a:graphic>
+              <a:graphicData uri="http://schemas.openxmlformats.org/drawingml/2006/picture">
+                <pic:pic>
+                  <pic:nvPicPr>
+                    <pic:cNvPr id="0" name="ev_response_s-normal-high.png"/>
+                    <pic:cNvPicPr/>
+                  </pic:nvPicPr>
+                  <pic:blipFill>
+                    <a:blip r:embed="rId62"/>
+                    <a:stretch>
+                      <a:fillRect/>
+                    </a:stretch>
+                  </pic:blipFill>
+                  <pic:spPr>
+                    <a:xfrm>
+                      <a:off x="0" y="0"/>
+                      <a:ext cx="5577840" cy="3053133"/>
+                    </a:xfrm>
+                    <a:prstGeom prst="rect"/>
+                  </pic:spPr>
+                </pic:pic>
+              </a:graphicData>
+            </a:graphic>
+          </wp:inline>
+        </w:drawing>
+      </w:r>
+    </w:p>
+    <w:p>
+      <w:pPr>
+        <w:keepLines/>
+        <w:spacing w:after="200"/>
+      </w:pPr>
+      <w:r>
+        <w:t>Figure 54. High traffic, normal operation: Fog/Cloud 156.55 s (n=22); Mist 156.98 s (n=22); Mist Dynamic 155.02 s (n=22); Mist + Fog 155.02 s (n=22). Error bars show 95% confidence intervals.</w:t>
+      </w:r>
+    </w:p>
+    <w:p>
+      <w:pPr>
+        <w:pStyle w:val="Heading2"/>
+      </w:pPr>
+      <w:r>
+        <w:t>Controlled Mist stalls route decision latency</w:t>
+      </w:r>
+    </w:p>
+    <w:p>
+      <w:pPr>
+        <w:keepNext/>
+      </w:pPr>
+      <w:r>
+        <w:t>These figures separate seeds without a stall from seeds assigned the controlled 900 ms Mist stall. Fog/Cloud is unaffected by that local stall.</w:t>
+      </w:r>
+    </w:p>
+    <w:p>
+      <w:pPr>
+        <w:keepNext/>
+        <w:jc w:val="center"/>
+      </w:pPr>
+      <w:r>
+        <w:drawing>
+          <wp:inline xmlns:a="http://schemas.openxmlformats.org/drawingml/2006/main" xmlns:pic="http://schemas.openxmlformats.org/drawingml/2006/picture">
+            <wp:extent cx="5577840" cy="3053133"/>
+            <wp:docPr id="55" name="Picture 55" descr="Controlled Mist stalls route decision latency. Low traffic, controlled mist stalls: Fog/Cloud 626.54 ms (n=7); Mist 1226.00 ms (n=7); Mist Dynamic 1226.00 ms (n=7); Mist + Fog 826.54 ms (n=7). Error bars show 95% confidence intervals."/>
+            <wp:cNvGraphicFramePr>
+              <a:graphicFrameLocks noChangeAspect="1"/>
+            </wp:cNvGraphicFramePr>
+            <a:graphic>
+              <a:graphicData uri="http://schemas.openxmlformats.org/drawingml/2006/picture">
+                <pic:pic>
+                  <pic:nvPicPr>
+                    <pic:cNvPr id="0" name="route_decision_ms-controlled_stall-low.png"/>
+                    <pic:cNvPicPr/>
+                  </pic:nvPicPr>
+                  <pic:blipFill>
+                    <a:blip r:embed="rId63"/>
+                    <a:stretch>
+                      <a:fillRect/>
+                    </a:stretch>
+                  </pic:blipFill>
+                  <pic:spPr>
+                    <a:xfrm>
+                      <a:off x="0" y="0"/>
+                      <a:ext cx="5577840" cy="3053133"/>
+                    </a:xfrm>
+                    <a:prstGeom prst="rect"/>
+                  </pic:spPr>
+                </pic:pic>
+              </a:graphicData>
+            </a:graphic>
+          </wp:inline>
+        </w:drawing>
+      </w:r>
+    </w:p>
+    <w:p>
+      <w:pPr>
+        <w:keepLines/>
+        <w:spacing w:after="200"/>
+      </w:pPr>
+      <w:r>
+        <w:t>Figure 55. Low traffic, controlled mist stalls: Fog/Cloud 626.54 ms (n=7); Mist 1226.00 ms (n=7); Mist Dynamic 1226.00 ms (n=7); Mist + Fog 826.54 ms (n=7). Error bars show 95% confidence intervals.</w:t>
+      </w:r>
+    </w:p>
+    <w:p>
+      <w:pPr>
+        <w:keepNext/>
+        <w:jc w:val="center"/>
+      </w:pPr>
+      <w:r>
+        <w:drawing>
+          <wp:inline xmlns:a="http://schemas.openxmlformats.org/drawingml/2006/main" xmlns:pic="http://schemas.openxmlformats.org/drawingml/2006/picture">
+            <wp:extent cx="5577840" cy="3053133"/>
+            <wp:docPr id="56" name="Picture 56" descr="Controlled Mist stalls route decision latency. Medium traffic, controlled mist stalls: Fog/Cloud 626.54 ms (n=8); Mist 1226.00 ms (n=8); Mist Dynamic 1226.00 ms (n=8); Mist + Fog 826.60 ms (n=8). Error bars show 95% confidence intervals."/>
+            <wp:cNvGraphicFramePr>
+              <a:graphicFrameLocks noChangeAspect="1"/>
+            </wp:cNvGraphicFramePr>
+            <a:graphic>
+              <a:graphicData uri="http://schemas.openxmlformats.org/drawingml/2006/picture">
+                <pic:pic>
+                  <pic:nvPicPr>
+                    <pic:cNvPr id="0" name="route_decision_ms-controlled_stall-medium.png"/>
+                    <pic:cNvPicPr/>
+                  </pic:nvPicPr>
+                  <pic:blipFill>
+                    <a:blip r:embed="rId64"/>
+                    <a:stretch>
+                      <a:fillRect/>
+                    </a:stretch>
+                  </pic:blipFill>
+                  <pic:spPr>
+                    <a:xfrm>
+                      <a:off x="0" y="0"/>
+                      <a:ext cx="5577840" cy="3053133"/>
+                    </a:xfrm>
+                    <a:prstGeom prst="rect"/>
+                  </pic:spPr>
+                </pic:pic>
+              </a:graphicData>
+            </a:graphic>
+          </wp:inline>
+        </w:drawing>
+      </w:r>
+    </w:p>
+    <w:p>
+      <w:pPr>
+        <w:keepLines/>
+        <w:spacing w:after="200"/>
+      </w:pPr>
+      <w:r>
+        <w:t>Figure 56. Medium traffic, controlled mist stalls: Fog/Cloud 626.54 ms (n=8); Mist 1226.00 ms (n=8); Mist Dynamic 1226.00 ms (n=8); Mist + Fog 826.60 ms (n=8). Error bars show 95% confidence intervals.</w:t>
+      </w:r>
+    </w:p>
+    <w:p>
+      <w:pPr>
+        <w:keepNext/>
+        <w:jc w:val="center"/>
+      </w:pPr>
+      <w:r>
+        <w:drawing>
+          <wp:inline xmlns:a="http://schemas.openxmlformats.org/drawingml/2006/main" xmlns:pic="http://schemas.openxmlformats.org/drawingml/2006/picture">
+            <wp:extent cx="5577840" cy="3053133"/>
+            <wp:docPr id="57" name="Picture 57" descr="Controlled Mist stalls route decision latency. High traffic, controlled mist stalls: Fog/Cloud 626.54 ms (n=8); Mist 1226.00 ms (n=8); Mist Dynamic 1226.00 ms (n=8); Mist + Fog 826.63 ms (n=8). Error bars show 95% confidence intervals."/>
+            <wp:cNvGraphicFramePr>
+              <a:graphicFrameLocks noChangeAspect="1"/>
+            </wp:cNvGraphicFramePr>
+            <a:graphic>
+              <a:graphicData uri="http://schemas.openxmlformats.org/drawingml/2006/picture">
+                <pic:pic>
+                  <pic:nvPicPr>
+                    <pic:cNvPr id="0" name="route_decision_ms-controlled_stall-high.png"/>
+                    <pic:cNvPicPr/>
+                  </pic:nvPicPr>
+                  <pic:blipFill>
+                    <a:blip r:embed="rId65"/>
+                    <a:stretch>
+                      <a:fillRect/>
+                    </a:stretch>
+                  </pic:blipFill>
+                  <pic:spPr>
+                    <a:xfrm>
+                      <a:off x="0" y="0"/>
+                      <a:ext cx="5577840" cy="3053133"/>
+                    </a:xfrm>
+                    <a:prstGeom prst="rect"/>
+                  </pic:spPr>
+                </pic:pic>
+              </a:graphicData>
+            </a:graphic>
+          </wp:inline>
+        </w:drawing>
+      </w:r>
+    </w:p>
+    <w:p>
+      <w:pPr>
+        <w:keepLines/>
+        <w:spacing w:after="200"/>
+      </w:pPr>
+      <w:r>
+        <w:t>Figure 57. High traffic, controlled mist stalls: Fog/Cloud 626.54 ms (n=8); Mist 1226.00 ms (n=8); Mist Dynamic 1226.00 ms (n=8); Mist + Fog 826.63 ms (n=8). Error bars show 95% confidence intervals.</w:t>
+      </w:r>
+    </w:p>
+    <w:p>
+      <w:pPr>
+        <w:pStyle w:val="Heading2"/>
+      </w:pPr>
+      <w:r>
+        <w:t>Controlled Mist stalls ev response time</w:t>
+      </w:r>
+    </w:p>
+    <w:p>
+      <w:pPr>
+        <w:keepNext/>
+      </w:pPr>
+      <w:r>
+        <w:t>These figures separate seeds without a stall from seeds assigned the controlled 900 ms Mist stall. Fog/Cloud is unaffected by that local stall.</w:t>
+      </w:r>
+    </w:p>
+    <w:p>
+      <w:pPr>
+        <w:keepNext/>
+        <w:jc w:val="center"/>
+      </w:pPr>
+      <w:r>
+        <w:drawing>
+          <wp:inline xmlns:a="http://schemas.openxmlformats.org/drawingml/2006/main" xmlns:pic="http://schemas.openxmlformats.org/drawingml/2006/picture">
+            <wp:extent cx="5577840" cy="3053133"/>
+            <wp:docPr id="58" name="Picture 58" descr="Controlled Mist stalls ev response time. Low traffic, controlled mist stalls: Fog/Cloud 153.07 s (n=7); Mist 153.14 s (n=7); Mist Dynamic 153.14 s (n=7); Mist + Fog 153.00 s (n=7). Error bars show 95% confidence intervals."/>
+            <wp:cNvGraphicFramePr>
+              <a:graphicFrameLocks noChangeAspect="1"/>
+            </wp:cNvGraphicFramePr>
+            <a:graphic>
+              <a:graphicData uri="http://schemas.openxmlformats.org/drawingml/2006/picture">
+                <pic:pic>
+                  <pic:nvPicPr>
+                    <pic:cNvPr id="0" name="ev_response_s-controlled_stall-low.png"/>
+                    <pic:cNvPicPr/>
+                  </pic:nvPicPr>
+                  <pic:blipFill>
+                    <a:blip r:embed="rId66"/>
+                    <a:stretch>
+                      <a:fillRect/>
+                    </a:stretch>
+                  </pic:blipFill>
+                  <pic:spPr>
+                    <a:xfrm>
+                      <a:off x="0" y="0"/>
+                      <a:ext cx="5577840" cy="3053133"/>
+                    </a:xfrm>
+                    <a:prstGeom prst="rect"/>
+                  </pic:spPr>
+                </pic:pic>
+              </a:graphicData>
+            </a:graphic>
+          </wp:inline>
+        </w:drawing>
+      </w:r>
+    </w:p>
+    <w:p>
+      <w:pPr>
+        <w:keepLines/>
+        <w:spacing w:after="200"/>
+      </w:pPr>
+      <w:r>
+        <w:t>Figure 58. Low traffic, controlled mist stalls: Fog/Cloud 153.07 s (n=7); Mist 153.14 s (n=7); Mist Dynamic 153.14 s (n=7); Mist + Fog 153.00 s (n=7). Error bars show 95% confidence intervals.</w:t>
+      </w:r>
+    </w:p>
+    <w:p>
+      <w:pPr>
+        <w:keepNext/>
+        <w:jc w:val="center"/>
+      </w:pPr>
+      <w:r>
+        <w:drawing>
+          <wp:inline xmlns:a="http://schemas.openxmlformats.org/drawingml/2006/main" xmlns:pic="http://schemas.openxmlformats.org/drawingml/2006/picture">
+            <wp:extent cx="5577840" cy="3053133"/>
+            <wp:docPr id="59" name="Picture 59" descr="Controlled Mist stalls ev response time. Medium traffic, controlled mist stalls: Fog/Cloud 153.88 s (n=8); Mist 153.88 s (n=8); Mist Dynamic 152.31 s (n=8); Mist + Fog 151.50 s (n=8). Error bars show 95% confidence intervals."/>
+            <wp:cNvGraphicFramePr>
+              <a:graphicFrameLocks noChangeAspect="1"/>
+            </wp:cNvGraphicFramePr>
+            <a:graphic>
+              <a:graphicData uri="http://schemas.openxmlformats.org/drawingml/2006/picture">
+                <pic:pic>
+                  <pic:nvPicPr>
+                    <pic:cNvPr id="0" name="ev_response_s-controlled_stall-medium.png"/>
+                    <pic:cNvPicPr/>
+                  </pic:nvPicPr>
+                  <pic:blipFill>
+                    <a:blip r:embed="rId67"/>
+                    <a:stretch>
+                      <a:fillRect/>
+                    </a:stretch>
+                  </pic:blipFill>
+                  <pic:spPr>
+                    <a:xfrm>
+                      <a:off x="0" y="0"/>
+                      <a:ext cx="5577840" cy="3053133"/>
+                    </a:xfrm>
+                    <a:prstGeom prst="rect"/>
+                  </pic:spPr>
+                </pic:pic>
+              </a:graphicData>
+            </a:graphic>
+          </wp:inline>
+        </w:drawing>
+      </w:r>
+    </w:p>
+    <w:p>
+      <w:pPr>
+        <w:keepLines/>
+        <w:spacing w:after="200"/>
+      </w:pPr>
+      <w:r>
+        <w:t>Figure 59. Medium traffic, controlled mist stalls: Fog/Cloud 153.88 s (n=8); Mist 153.88 s (n=8); Mist Dynamic 152.31 s (n=8); Mist + Fog 151.50 s (n=8). Error bars show 95% confidence intervals.</w:t>
+      </w:r>
+    </w:p>
+    <w:p>
+      <w:pPr>
+        <w:keepNext/>
+        <w:jc w:val="center"/>
+      </w:pPr>
+      <w:r>
+        <w:drawing>
+          <wp:inline xmlns:a="http://schemas.openxmlformats.org/drawingml/2006/main" xmlns:pic="http://schemas.openxmlformats.org/drawingml/2006/picture">
+            <wp:extent cx="5577840" cy="3053133"/>
+            <wp:docPr id="60" name="Picture 60" descr="Controlled Mist stalls ev response time. High traffic, controlled mist stalls: Fog/Cloud 155.25 s (n=8); Mist 156.62 s (n=8); Mist Dynamic 154.69 s (n=8); Mist + Fog 154.62 s (n=8). Error bars show 95% confidence intervals."/>
+            <wp:cNvGraphicFramePr>
+              <a:graphicFrameLocks noChangeAspect="1"/>
+            </wp:cNvGraphicFramePr>
+            <a:graphic>
+              <a:graphicData uri="http://schemas.openxmlformats.org/drawingml/2006/picture">
+                <pic:pic>
+                  <pic:nvPicPr>
+                    <pic:cNvPr id="0" name="ev_response_s-controlled_stall-high.png"/>
+                    <pic:cNvPicPr/>
+                  </pic:nvPicPr>
+                  <pic:blipFill>
+                    <a:blip r:embed="rId68"/>
+                    <a:stretch>
+                      <a:fillRect/>
+                    </a:stretch>
+                  </pic:blipFill>
+                  <pic:spPr>
+                    <a:xfrm>
+                      <a:off x="0" y="0"/>
+                      <a:ext cx="5577840" cy="3053133"/>
+                    </a:xfrm>
+                    <a:prstGeom prst="rect"/>
+                  </pic:spPr>
+                </pic:pic>
+              </a:graphicData>
+            </a:graphic>
+          </wp:inline>
+        </w:drawing>
+      </w:r>
+    </w:p>
+    <w:p>
+      <w:pPr>
+        <w:keepLines/>
+        <w:spacing w:after="200"/>
+      </w:pPr>
+      <w:r>
+        <w:t>Figure 60. High traffic, controlled mist stalls: Fog/Cloud 155.25 s (n=8); Mist 156.62 s (n=8); Mist Dynamic 154.69 s (n=8); Mist + Fog 154.62 s (n=8). Error bars show 95% confidence intervals.</w:t>
+      </w:r>
+    </w:p>
+    <w:p>
+      <w:pPr>
+        <w:pStyle w:val="Heading2"/>
+      </w:pPr>
+      <w:r>
+        <w:t>Matched seed differences in ev response time</w:t>
+      </w:r>
+    </w:p>
+    <w:p>
+      <w:pPr>
+        <w:keepNext/>
+      </w:pPr>
+      <w:r>
+        <w:t>Each bar subtracts configuration B from A for the same delivered seeds. Below zero means A is faster. An interval crossing zero does not establish a difference; these comparisons are exploratory and not adjusted for multiple testing.</w:t>
+      </w:r>
+    </w:p>
+    <w:p>
+      <w:pPr>
+        <w:keepNext/>
+        <w:jc w:val="center"/>
+      </w:pPr>
+      <w:r>
+        <w:drawing>
+          <wp:inline xmlns:a="http://schemas.openxmlformats.org/drawingml/2006/main" xmlns:pic="http://schemas.openxmlformats.org/drawingml/2006/picture">
+            <wp:extent cx="5577840" cy="3053133"/>
+            <wp:docPr id="61" name="Picture 61" descr="Matched seed differences in ev response time. Low traffic: Mist minus Fog/Cloud 0.19 s, 95% CI [-0.36, 0.73], n=24; Mist Dynamic minus Mist -0.48 s, 95% CI [-1.45, 0.49], n=24; Mist + Fog minus Mist Dynamic -0.04 s, 95% CI [-0.10, 0.02], n=24."/>
+            <wp:cNvGraphicFramePr>
+              <a:graphicFrameLocks noChangeAspect="1"/>
+            </wp:cNvGraphicFramePr>
+            <a:graphic>
+              <a:graphicData uri="http://schemas.openxmlformats.org/drawingml/2006/picture">
+                <pic:pic>
+                  <pic:nvPicPr>
+                    <pic:cNvPr id="0" name="paired_ev_response_s-low.png"/>
+                    <pic:cNvPicPr/>
+                  </pic:nvPicPr>
+                  <pic:blipFill>
+                    <a:blip r:embed="rId69"/>
+                    <a:stretch>
+                      <a:fillRect/>
+                    </a:stretch>
+                  </pic:blipFill>
+                  <pic:spPr>
+                    <a:xfrm>
+                      <a:off x="0" y="0"/>
+                      <a:ext cx="5577840" cy="3053133"/>
+                    </a:xfrm>
+                    <a:prstGeom prst="rect"/>
+                  </pic:spPr>
+                </pic:pic>
+              </a:graphicData>
+            </a:graphic>
+          </wp:inline>
+        </w:drawing>
+      </w:r>
+    </w:p>
+    <w:p>
+      <w:pPr>
+        <w:keepLines/>
+        <w:spacing w:after="200"/>
+      </w:pPr>
+      <w:r>
+        <w:t>Figure 61. Low traffic: Mist minus Fog/Cloud 0.19 s, 95% CI [-0.36, 0.73], n=24; Mist Dynamic minus Mist -0.48 s, 95% CI [-1.45, 0.49], n=24; Mist + Fog minus Mist Dynamic -0.04 s, 95% CI [-0.10, 0.02], n=24.</w:t>
+      </w:r>
+    </w:p>
+    <w:p>
+      <w:pPr>
+        <w:keepNext/>
+        <w:jc w:val="center"/>
+      </w:pPr>
+      <w:r>
+        <w:drawing>
+          <wp:inline xmlns:a="http://schemas.openxmlformats.org/drawingml/2006/main" xmlns:pic="http://schemas.openxmlformats.org/drawingml/2006/picture">
+            <wp:extent cx="5577840" cy="3053133"/>
+            <wp:docPr id="62" name="Picture 62" descr="Matched seed differences in ev response time. Medium traffic: Mist minus Fog/Cloud 0.21 s, 95% CI [-0.68, 1.09], n=29; Mist Dynamic minus Mist -0.60 s, 95% CI [-1.98, 0.77], n=29; Mist + Fog minus Mist Dynamic -0.22 s, 95% CI [-0.89, 0.44], n=29."/>
+            <wp:cNvGraphicFramePr>
+              <a:graphicFrameLocks noChangeAspect="1"/>
+            </wp:cNvGraphicFramePr>
+            <a:graphic>
+              <a:graphicData uri="http://schemas.openxmlformats.org/drawingml/2006/picture">
+                <pic:pic>
+                  <pic:nvPicPr>
+                    <pic:cNvPr id="0" name="paired_ev_response_s-medium.png"/>
+                    <pic:cNvPicPr/>
+                  </pic:nvPicPr>
+                  <pic:blipFill>
+                    <a:blip r:embed="rId70"/>
+                    <a:stretch>
+                      <a:fillRect/>
+                    </a:stretch>
+                  </pic:blipFill>
+                  <pic:spPr>
+                    <a:xfrm>
+                      <a:off x="0" y="0"/>
+                      <a:ext cx="5577840" cy="3053133"/>
+                    </a:xfrm>
+                    <a:prstGeom prst="rect"/>
+                  </pic:spPr>
+                </pic:pic>
+              </a:graphicData>
+            </a:graphic>
+          </wp:inline>
+        </w:drawing>
+      </w:r>
+    </w:p>
+    <w:p>
+      <w:pPr>
+        <w:keepLines/>
+        <w:spacing w:after="200"/>
+      </w:pPr>
+      <w:r>
+        <w:t>Figure 62. Medium traffic: Mist minus Fog/Cloud 0.21 s, 95% CI [-0.68, 1.09], n=29; Mist Dynamic minus Mist -0.60 s, 95% CI [-1.98, 0.77], n=29; Mist + Fog minus Mist Dynamic -0.22 s, 95% CI [-0.89, 0.44], n=29.</w:t>
+      </w:r>
+    </w:p>
+    <w:p>
+      <w:pPr>
+        <w:keepNext/>
+        <w:jc w:val="center"/>
+      </w:pPr>
+      <w:r>
+        <w:drawing>
+          <wp:inline xmlns:a="http://schemas.openxmlformats.org/drawingml/2006/main" xmlns:pic="http://schemas.openxmlformats.org/drawingml/2006/picture">
+            <wp:extent cx="5577840" cy="3053133"/>
+            <wp:docPr id="63" name="Picture 63" descr="Matched seed differences in ev response time. High traffic: Mist minus Fog/Cloud 0.68 s, 95% CI [-0.26, 1.63], n=30; Mist Dynamic minus Mist -1.95 s, 95% CI [-3.47, -0.43], n=30; Mist + Fog minus Mist Dynamic -0.02 s, 95% CI [-0.05, 0.02], n=30."/>
+            <wp:cNvGraphicFramePr>
+              <a:graphicFrameLocks noChangeAspect="1"/>
+            </wp:cNvGraphicFramePr>
+            <a:graphic>
+              <a:graphicData uri="http://schemas.openxmlformats.org/drawingml/2006/picture">
+                <pic:pic>
+                  <pic:nvPicPr>
+                    <pic:cNvPr id="0" name="paired_ev_response_s-high.png"/>
+                    <pic:cNvPicPr/>
+                  </pic:nvPicPr>
+                  <pic:blipFill>
+                    <a:blip r:embed="rId71"/>
+                    <a:stretch>
+                      <a:fillRect/>
+                    </a:stretch>
+                  </pic:blipFill>
+                  <pic:spPr>
+                    <a:xfrm>
+                      <a:off x="0" y="0"/>
+                      <a:ext cx="5577840" cy="3053133"/>
+                    </a:xfrm>
+                    <a:prstGeom prst="rect"/>
+                  </pic:spPr>
+                </pic:pic>
+              </a:graphicData>
+            </a:graphic>
+          </wp:inline>
+        </w:drawing>
+      </w:r>
+    </w:p>
+    <w:p>
+      <w:pPr>
+        <w:keepLines/>
+        <w:spacing w:after="200"/>
+      </w:pPr>
+      <w:r>
+        <w:t>Figure 63. High traffic: Mist minus Fog/Cloud 0.68 s, 95% CI [-0.26, 1.63], n=30; Mist Dynamic minus Mist -1.95 s, 95% CI [-3.47, -0.43], n=30; Mist + Fog minus Mist Dynamic -0.02 s, 95% CI [-0.05, 0.02], n=30.</w:t>
+      </w:r>
+    </w:p>
+    <w:p>
+      <w:pPr>
+        <w:pStyle w:val="Heading2"/>
+      </w:pPr>
+      <w:r>
+        <w:t>Matched seed differences in route decision latency</w:t>
+      </w:r>
+    </w:p>
+    <w:p>
+      <w:pPr>
+        <w:keepNext/>
+      </w:pPr>
+      <w:r>
+        <w:t>Each bar subtracts configuration B from A for the same delivered seeds. Below zero means A is faster. An interval crossing zero does not establish a difference; these comparisons are exploratory and not adjusted for multiple testing.</w:t>
+      </w:r>
+    </w:p>
+    <w:p>
+      <w:pPr>
+        <w:keepNext/>
+        <w:jc w:val="center"/>
+      </w:pPr>
+      <w:r>
+        <w:drawing>
+          <wp:inline xmlns:a="http://schemas.openxmlformats.org/drawingml/2006/main" xmlns:pic="http://schemas.openxmlformats.org/drawingml/2006/picture">
+            <wp:extent cx="5577840" cy="3053133"/>
+            <wp:docPr id="64" name="Picture 64" descr="Matched seed differences in route decision latency. Low traffic: Mist minus Fog/Cloud -38.04 ms, 95% CI [-214.49, 138.41], n=24; Mist + Fog minus Mist Dynamic -116.51 ms, 95% CI [-194.83, -38.19], n=24."/>
+            <wp:cNvGraphicFramePr>
+              <a:graphicFrameLocks noChangeAspect="1"/>
+            </wp:cNvGraphicFramePr>
+            <a:graphic>
+              <a:graphicData uri="http://schemas.openxmlformats.org/drawingml/2006/picture">
+                <pic:pic>
+                  <pic:nvPicPr>
+                    <pic:cNvPr id="0" name="paired_route_decision_ms-low.png"/>
+                    <pic:cNvPicPr/>
+                  </pic:nvPicPr>
+                  <pic:blipFill>
+                    <a:blip r:embed="rId72"/>
+                    <a:stretch>
+                      <a:fillRect/>
+                    </a:stretch>
+                  </pic:blipFill>
+                  <pic:spPr>
+                    <a:xfrm>
+                      <a:off x="0" y="0"/>
+                      <a:ext cx="5577840" cy="3053133"/>
+                    </a:xfrm>
+                    <a:prstGeom prst="rect"/>
+                  </pic:spPr>
+                </pic:pic>
+              </a:graphicData>
+            </a:graphic>
+          </wp:inline>
+        </w:drawing>
+      </w:r>
+    </w:p>
+    <w:p>
+      <w:pPr>
+        <w:keepLines/>
+        <w:spacing w:after="200"/>
+      </w:pPr>
+      <w:r>
+        <w:t>Figure 64. Low traffic: Mist minus Fog/Cloud -38.04 ms, 95% CI [-214.49, 138.41], n=24; Mist + Fog minus Mist Dynamic -116.51 ms, 95% CI [-194.83, -38.19], n=24.</w:t>
+      </w:r>
+    </w:p>
+    <w:p>
+      <w:pPr>
+        <w:keepNext/>
+        <w:jc w:val="center"/>
+      </w:pPr>
+      <w:r>
+        <w:drawing>
+          <wp:inline xmlns:a="http://schemas.openxmlformats.org/drawingml/2006/main" xmlns:pic="http://schemas.openxmlformats.org/drawingml/2006/picture">
+            <wp:extent cx="5577840" cy="3053133"/>
+            <wp:docPr id="65" name="Picture 65" descr="Matched seed differences in route decision latency. Medium traffic: Mist minus Fog/Cloud -52.27 ms, 95% CI [-207.98, 103.45], n=29; Mist + Fog minus Mist Dynamic -110.18 ms, 95% CI [-179.28, -41.08], n=29."/>
+            <wp:cNvGraphicFramePr>
+              <a:graphicFrameLocks noChangeAspect="1"/>
+            </wp:cNvGraphicFramePr>
+            <a:graphic>
+              <a:graphicData uri="http://schemas.openxmlformats.org/drawingml/2006/picture">
+                <pic:pic>
+                  <pic:nvPicPr>
+                    <pic:cNvPr id="0" name="paired_route_decision_ms-medium.png"/>
+                    <pic:cNvPicPr/>
+                  </pic:nvPicPr>
+                  <pic:blipFill>
+                    <a:blip r:embed="rId73"/>
+                    <a:stretch>
+                      <a:fillRect/>
+                    </a:stretch>
+                  </pic:blipFill>
+                  <pic:spPr>
+                    <a:xfrm>
+                      <a:off x="0" y="0"/>
+                      <a:ext cx="5577840" cy="3053133"/>
+                    </a:xfrm>
+                    <a:prstGeom prst="rect"/>
+                  </pic:spPr>
+                </pic:pic>
+              </a:graphicData>
+            </a:graphic>
+          </wp:inline>
+        </w:drawing>
+      </w:r>
+    </w:p>
+    <w:p>
+      <w:pPr>
+        <w:keepLines/>
+        <w:spacing w:after="200"/>
+      </w:pPr>
+      <w:r>
+        <w:t>Figure 65. Medium traffic: Mist minus Fog/Cloud -52.27 ms, 95% CI [-207.98, 103.45], n=29; Mist + Fog minus Mist Dynamic -110.18 ms, 95% CI [-179.28, -41.08], n=29.</w:t>
+      </w:r>
+    </w:p>
+    <w:p>
+      <w:pPr>
+        <w:keepNext/>
+        <w:jc w:val="center"/>
+      </w:pPr>
+      <w:r>
+        <w:drawing>
+          <wp:inline xmlns:a="http://schemas.openxmlformats.org/drawingml/2006/main" xmlns:pic="http://schemas.openxmlformats.org/drawingml/2006/picture">
+            <wp:extent cx="5577840" cy="3053133"/>
+            <wp:docPr id="66" name="Picture 66" descr="Matched seed differences in route decision latency. High traffic: Mist minus Fog/Cloud -60.54 ms, 95% CI [-211.69, 90.61], n=30; Mist + Fog minus Mist Dynamic -106.50 ms, 95% CI [-173.57, -39.42], n=30."/>
+            <wp:cNvGraphicFramePr>
+              <a:graphicFrameLocks noChangeAspect="1"/>
+            </wp:cNvGraphicFramePr>
+            <a:graphic>
+              <a:graphicData uri="http://schemas.openxmlformats.org/drawingml/2006/picture">
+                <pic:pic>
+                  <pic:nvPicPr>
+                    <pic:cNvPr id="0" name="paired_route_decision_ms-high.png"/>
+                    <pic:cNvPicPr/>
+                  </pic:nvPicPr>
+                  <pic:blipFill>
+                    <a:blip r:embed="rId74"/>
+                    <a:stretch>
+                      <a:fillRect/>
+                    </a:stretch>
+                  </pic:blipFill>
+                  <pic:spPr>
+                    <a:xfrm>
+                      <a:off x="0" y="0"/>
+                      <a:ext cx="5577840" cy="3053133"/>
+                    </a:xfrm>
+                    <a:prstGeom prst="rect"/>
+                  </pic:spPr>
+                </pic:pic>
+              </a:graphicData>
+            </a:graphic>
+          </wp:inline>
+        </w:drawing>
+      </w:r>
+    </w:p>
+    <w:p>
+      <w:pPr>
+        <w:keepLines/>
+        <w:spacing w:after="200"/>
+      </w:pPr>
+      <w:r>
+        <w:t>Figure 66. High traffic: Mist minus Fog/Cloud -60.54 ms, 95% CI [-211.69, 90.61], n=30; Mist + Fog minus Mist Dynamic -106.50 ms, 95% CI [-173.57, -39.42], n=30.</w:t>
       </w:r>
     </w:p>
     <w:p>

</xml_diff>

<commit_message>
Add supplemental route metrics and red-signal validation evidence
</commit_message>
<xml_diff>
--- a/docs/Emergency_Vehicle_Navigation_Final_Submission.docx
+++ b/docs/Emergency_Vehicle_Navigation_Final_Submission.docx
@@ -38,7 +38,11 @@
         <w:br/>
       </w:r>
       <w:r>
-        <w:t>360 primary runs + 90 waiting controls  |  66 result graphs</w:t>
+        <w:t>360 primary runs + 90 waiting controls  |  78 result graphs</w:t>
+        <w:br/>
+      </w:r>
+      <w:r>
+        <w:t>18 separate red signal validation runs</w:t>
         <w:br/>
       </w:r>
       <w:r>
@@ -6162,6 +6166,1425 @@
         <w:pStyle w:val="Heading1"/>
       </w:pPr>
       <w:r>
+        <w:t>Supplementary communication and red signal checks</w:t>
+      </w:r>
+    </w:p>
+    <w:p>
+      <w:r>
+        <w:t>The seven headline measures keep their original definitions. The additional route transaction measures count Fog requests and accepted replies after the emergency alert. Local Mist uses no wireless Fog transaction, so its wireless transaction delay and completion rate are not applicable. Equal alert delivery results can coexist with different route communication needs.</w:t>
+      </w:r>
+    </w:p>
+    <w:p>
+      <w:r>
+        <w:t>Route transaction turnaround includes processing and Cloud backhaul. The network round trip subtracts those components and excludes watchdog waiting. These values come from the original raw batch, without inventing unrecorded route-packet byte counts.</w:t>
+      </w:r>
+    </w:p>
+    <w:tbl>
+      <w:tblPr>
+        <w:tblStyle w:val="TableGrid"/>
+        <w:tblW w:type="auto" w:w="0"/>
+        <w:jc w:val="center"/>
+        <w:tblLayout w:type="autofit"/>
+        <w:tblLook w:firstColumn="1" w:firstRow="1" w:lastColumn="0" w:lastRow="0" w:noHBand="0" w:noVBand="1" w:val="04A0"/>
+        <w:tblBorders>
+          <w:top w:val="single" w:sz="4" w:color="D9D9D9"/>
+          <w:left w:val="single" w:sz="4" w:color="D9D9D9"/>
+          <w:bottom w:val="single" w:sz="4" w:color="D9D9D9"/>
+          <w:right w:val="single" w:sz="4" w:color="D9D9D9"/>
+          <w:insideH w:val="single" w:sz="4" w:color="D9D9D9"/>
+          <w:insideV w:val="single" w:sz="4" w:color="D9D9D9"/>
+        </w:tblBorders>
+      </w:tblPr>
+      <w:tblGrid>
+        <w:gridCol w:w="2074"/>
+        <w:gridCol w:w="2074"/>
+        <w:gridCol w:w="2074"/>
+        <w:gridCol w:w="2074"/>
+        <w:gridCol w:w="2074"/>
+      </w:tblGrid>
+      <w:tr>
+        <w:trPr>
+          <w:tblHeader w:val="true"/>
+        </w:trPr>
+        <w:tc>
+          <w:tcPr>
+            <w:tcW w:type="dxa" w:w="2074"/>
+            <w:shd w:fill="1F3957"/>
+          </w:tcPr>
+          <w:p>
+            <w:r>
+              <w:rPr>
+                <w:b/>
+                <w:color w:val="FFFFFF"/>
+                <w:sz w:val="16"/>
+              </w:rPr>
+              <w:t>Traffic</w:t>
+            </w:r>
+          </w:p>
+        </w:tc>
+        <w:tc>
+          <w:tcPr>
+            <w:tcW w:type="dxa" w:w="2074"/>
+            <w:shd w:fill="1F3957"/>
+          </w:tcPr>
+          <w:p>
+            <w:r>
+              <w:rPr>
+                <w:b/>
+                <w:color w:val="FFFFFF"/>
+                <w:sz w:val="16"/>
+              </w:rPr>
+              <w:t>Approach</w:t>
+            </w:r>
+          </w:p>
+        </w:tc>
+        <w:tc>
+          <w:tcPr>
+            <w:tcW w:type="dxa" w:w="2074"/>
+            <w:shd w:fill="1F3957"/>
+          </w:tcPr>
+          <w:p>
+            <w:r>
+              <w:rPr>
+                <w:b/>
+                <w:color w:val="FFFFFF"/>
+                <w:sz w:val="16"/>
+              </w:rPr>
+              <w:t>Requests</w:t>
+            </w:r>
+          </w:p>
+        </w:tc>
+        <w:tc>
+          <w:tcPr>
+            <w:tcW w:type="dxa" w:w="2074"/>
+            <w:shd w:fill="1F3957"/>
+          </w:tcPr>
+          <w:p>
+            <w:r>
+              <w:rPr>
+                <w:b/>
+                <w:color w:val="FFFFFF"/>
+                <w:sz w:val="16"/>
+              </w:rPr>
+              <w:t>Accepted replies</w:t>
+            </w:r>
+          </w:p>
+        </w:tc>
+        <w:tc>
+          <w:tcPr>
+            <w:tcW w:type="dxa" w:w="2074"/>
+            <w:shd w:fill="1F3957"/>
+          </w:tcPr>
+          <w:p>
+            <w:r>
+              <w:rPr>
+                <w:b/>
+                <w:color w:val="FFFFFF"/>
+                <w:sz w:val="16"/>
+              </w:rPr>
+              <w:t>Completion</w:t>
+            </w:r>
+          </w:p>
+        </w:tc>
+      </w:tr>
+      <w:tr>
+        <w:tc>
+          <w:tcPr>
+            <w:tcW w:type="dxa" w:w="2074"/>
+            <w:vAlign w:val="center"/>
+          </w:tcPr>
+          <w:p>
+            <w:pPr>
+              <w:spacing w:after="0"/>
+            </w:pPr>
+            <w:r>
+              <w:rPr>
+                <w:sz w:val="16"/>
+              </w:rPr>
+              <w:t>Low</w:t>
+            </w:r>
+          </w:p>
+        </w:tc>
+        <w:tc>
+          <w:tcPr>
+            <w:tcW w:type="dxa" w:w="2074"/>
+            <w:vAlign w:val="center"/>
+          </w:tcPr>
+          <w:p>
+            <w:pPr>
+              <w:spacing w:after="0"/>
+            </w:pPr>
+            <w:r>
+              <w:rPr>
+                <w:sz w:val="16"/>
+              </w:rPr>
+              <w:t>Fog/Cloud</w:t>
+            </w:r>
+          </w:p>
+        </w:tc>
+        <w:tc>
+          <w:tcPr>
+            <w:tcW w:type="dxa" w:w="2074"/>
+            <w:vAlign w:val="center"/>
+          </w:tcPr>
+          <w:p>
+            <w:pPr>
+              <w:spacing w:after="0"/>
+            </w:pPr>
+            <w:r>
+              <w:rPr>
+                <w:sz w:val="16"/>
+              </w:rPr>
+              <w:t>24</w:t>
+            </w:r>
+          </w:p>
+        </w:tc>
+        <w:tc>
+          <w:tcPr>
+            <w:tcW w:type="dxa" w:w="2074"/>
+            <w:vAlign w:val="center"/>
+          </w:tcPr>
+          <w:p>
+            <w:pPr>
+              <w:spacing w:after="0"/>
+            </w:pPr>
+            <w:r>
+              <w:rPr>
+                <w:sz w:val="16"/>
+              </w:rPr>
+              <w:t>24</w:t>
+            </w:r>
+          </w:p>
+        </w:tc>
+        <w:tc>
+          <w:tcPr>
+            <w:tcW w:type="dxa" w:w="2074"/>
+            <w:vAlign w:val="center"/>
+          </w:tcPr>
+          <w:p>
+            <w:pPr>
+              <w:spacing w:after="0"/>
+            </w:pPr>
+            <w:r>
+              <w:rPr>
+                <w:sz w:val="16"/>
+              </w:rPr>
+              <w:t>100.0%</w:t>
+            </w:r>
+          </w:p>
+        </w:tc>
+      </w:tr>
+      <w:tr>
+        <w:tc>
+          <w:tcPr>
+            <w:tcW w:type="dxa" w:w="2074"/>
+            <w:vAlign w:val="center"/>
+            <w:shd w:fill="F2F6FA"/>
+          </w:tcPr>
+          <w:p>
+            <w:pPr>
+              <w:spacing w:after="0"/>
+            </w:pPr>
+            <w:r>
+              <w:rPr>
+                <w:sz w:val="16"/>
+              </w:rPr>
+              <w:t>Low</w:t>
+            </w:r>
+          </w:p>
+        </w:tc>
+        <w:tc>
+          <w:tcPr>
+            <w:tcW w:type="dxa" w:w="2074"/>
+            <w:vAlign w:val="center"/>
+            <w:shd w:fill="F2F6FA"/>
+          </w:tcPr>
+          <w:p>
+            <w:pPr>
+              <w:spacing w:after="0"/>
+            </w:pPr>
+            <w:r>
+              <w:rPr>
+                <w:sz w:val="16"/>
+              </w:rPr>
+              <w:t>Mist + Fog</w:t>
+            </w:r>
+          </w:p>
+        </w:tc>
+        <w:tc>
+          <w:tcPr>
+            <w:tcW w:type="dxa" w:w="2074"/>
+            <w:vAlign w:val="center"/>
+            <w:shd w:fill="F2F6FA"/>
+          </w:tcPr>
+          <w:p>
+            <w:pPr>
+              <w:spacing w:after="0"/>
+            </w:pPr>
+            <w:r>
+              <w:rPr>
+                <w:sz w:val="16"/>
+              </w:rPr>
+              <w:t>7</w:t>
+            </w:r>
+          </w:p>
+        </w:tc>
+        <w:tc>
+          <w:tcPr>
+            <w:tcW w:type="dxa" w:w="2074"/>
+            <w:vAlign w:val="center"/>
+            <w:shd w:fill="F2F6FA"/>
+          </w:tcPr>
+          <w:p>
+            <w:pPr>
+              <w:spacing w:after="0"/>
+            </w:pPr>
+            <w:r>
+              <w:rPr>
+                <w:sz w:val="16"/>
+              </w:rPr>
+              <w:t>7</w:t>
+            </w:r>
+          </w:p>
+        </w:tc>
+        <w:tc>
+          <w:tcPr>
+            <w:tcW w:type="dxa" w:w="2074"/>
+            <w:vAlign w:val="center"/>
+            <w:shd w:fill="F2F6FA"/>
+          </w:tcPr>
+          <w:p>
+            <w:pPr>
+              <w:spacing w:after="0"/>
+            </w:pPr>
+            <w:r>
+              <w:rPr>
+                <w:sz w:val="16"/>
+              </w:rPr>
+              <w:t>100.0%</w:t>
+            </w:r>
+          </w:p>
+        </w:tc>
+      </w:tr>
+      <w:tr>
+        <w:tc>
+          <w:tcPr>
+            <w:tcW w:type="dxa" w:w="2074"/>
+            <w:vAlign w:val="center"/>
+          </w:tcPr>
+          <w:p>
+            <w:pPr>
+              <w:spacing w:after="0"/>
+            </w:pPr>
+            <w:r>
+              <w:rPr>
+                <w:sz w:val="16"/>
+              </w:rPr>
+              <w:t>Medium</w:t>
+            </w:r>
+          </w:p>
+        </w:tc>
+        <w:tc>
+          <w:tcPr>
+            <w:tcW w:type="dxa" w:w="2074"/>
+            <w:vAlign w:val="center"/>
+          </w:tcPr>
+          <w:p>
+            <w:pPr>
+              <w:spacing w:after="0"/>
+            </w:pPr>
+            <w:r>
+              <w:rPr>
+                <w:sz w:val="16"/>
+              </w:rPr>
+              <w:t>Fog/Cloud</w:t>
+            </w:r>
+          </w:p>
+        </w:tc>
+        <w:tc>
+          <w:tcPr>
+            <w:tcW w:type="dxa" w:w="2074"/>
+            <w:vAlign w:val="center"/>
+          </w:tcPr>
+          <w:p>
+            <w:pPr>
+              <w:spacing w:after="0"/>
+            </w:pPr>
+            <w:r>
+              <w:rPr>
+                <w:sz w:val="16"/>
+              </w:rPr>
+              <w:t>29</w:t>
+            </w:r>
+          </w:p>
+        </w:tc>
+        <w:tc>
+          <w:tcPr>
+            <w:tcW w:type="dxa" w:w="2074"/>
+            <w:vAlign w:val="center"/>
+          </w:tcPr>
+          <w:p>
+            <w:pPr>
+              <w:spacing w:after="0"/>
+            </w:pPr>
+            <w:r>
+              <w:rPr>
+                <w:sz w:val="16"/>
+              </w:rPr>
+              <w:t>29</w:t>
+            </w:r>
+          </w:p>
+        </w:tc>
+        <w:tc>
+          <w:tcPr>
+            <w:tcW w:type="dxa" w:w="2074"/>
+            <w:vAlign w:val="center"/>
+          </w:tcPr>
+          <w:p>
+            <w:pPr>
+              <w:spacing w:after="0"/>
+            </w:pPr>
+            <w:r>
+              <w:rPr>
+                <w:sz w:val="16"/>
+              </w:rPr>
+              <w:t>100.0%</w:t>
+            </w:r>
+          </w:p>
+        </w:tc>
+      </w:tr>
+      <w:tr>
+        <w:tc>
+          <w:tcPr>
+            <w:tcW w:type="dxa" w:w="2074"/>
+            <w:vAlign w:val="center"/>
+            <w:shd w:fill="F2F6FA"/>
+          </w:tcPr>
+          <w:p>
+            <w:pPr>
+              <w:spacing w:after="0"/>
+            </w:pPr>
+            <w:r>
+              <w:rPr>
+                <w:sz w:val="16"/>
+              </w:rPr>
+              <w:t>Medium</w:t>
+            </w:r>
+          </w:p>
+        </w:tc>
+        <w:tc>
+          <w:tcPr>
+            <w:tcW w:type="dxa" w:w="2074"/>
+            <w:vAlign w:val="center"/>
+            <w:shd w:fill="F2F6FA"/>
+          </w:tcPr>
+          <w:p>
+            <w:pPr>
+              <w:spacing w:after="0"/>
+            </w:pPr>
+            <w:r>
+              <w:rPr>
+                <w:sz w:val="16"/>
+              </w:rPr>
+              <w:t>Mist + Fog</w:t>
+            </w:r>
+          </w:p>
+        </w:tc>
+        <w:tc>
+          <w:tcPr>
+            <w:tcW w:type="dxa" w:w="2074"/>
+            <w:vAlign w:val="center"/>
+            <w:shd w:fill="F2F6FA"/>
+          </w:tcPr>
+          <w:p>
+            <w:pPr>
+              <w:spacing w:after="0"/>
+            </w:pPr>
+            <w:r>
+              <w:rPr>
+                <w:sz w:val="16"/>
+              </w:rPr>
+              <w:t>8</w:t>
+            </w:r>
+          </w:p>
+        </w:tc>
+        <w:tc>
+          <w:tcPr>
+            <w:tcW w:type="dxa" w:w="2074"/>
+            <w:vAlign w:val="center"/>
+            <w:shd w:fill="F2F6FA"/>
+          </w:tcPr>
+          <w:p>
+            <w:pPr>
+              <w:spacing w:after="0"/>
+            </w:pPr>
+            <w:r>
+              <w:rPr>
+                <w:sz w:val="16"/>
+              </w:rPr>
+              <w:t>8</w:t>
+            </w:r>
+          </w:p>
+        </w:tc>
+        <w:tc>
+          <w:tcPr>
+            <w:tcW w:type="dxa" w:w="2074"/>
+            <w:vAlign w:val="center"/>
+            <w:shd w:fill="F2F6FA"/>
+          </w:tcPr>
+          <w:p>
+            <w:pPr>
+              <w:spacing w:after="0"/>
+            </w:pPr>
+            <w:r>
+              <w:rPr>
+                <w:sz w:val="16"/>
+              </w:rPr>
+              <w:t>100.0%</w:t>
+            </w:r>
+          </w:p>
+        </w:tc>
+      </w:tr>
+      <w:tr>
+        <w:tc>
+          <w:tcPr>
+            <w:tcW w:type="dxa" w:w="2074"/>
+            <w:vAlign w:val="center"/>
+          </w:tcPr>
+          <w:p>
+            <w:pPr>
+              <w:spacing w:after="0"/>
+            </w:pPr>
+            <w:r>
+              <w:rPr>
+                <w:sz w:val="16"/>
+              </w:rPr>
+              <w:t>High</w:t>
+            </w:r>
+          </w:p>
+        </w:tc>
+        <w:tc>
+          <w:tcPr>
+            <w:tcW w:type="dxa" w:w="2074"/>
+            <w:vAlign w:val="center"/>
+          </w:tcPr>
+          <w:p>
+            <w:pPr>
+              <w:spacing w:after="0"/>
+            </w:pPr>
+            <w:r>
+              <w:rPr>
+                <w:sz w:val="16"/>
+              </w:rPr>
+              <w:t>Fog/Cloud</w:t>
+            </w:r>
+          </w:p>
+        </w:tc>
+        <w:tc>
+          <w:tcPr>
+            <w:tcW w:type="dxa" w:w="2074"/>
+            <w:vAlign w:val="center"/>
+          </w:tcPr>
+          <w:p>
+            <w:pPr>
+              <w:spacing w:after="0"/>
+            </w:pPr>
+            <w:r>
+              <w:rPr>
+                <w:sz w:val="16"/>
+              </w:rPr>
+              <w:t>30</w:t>
+            </w:r>
+          </w:p>
+        </w:tc>
+        <w:tc>
+          <w:tcPr>
+            <w:tcW w:type="dxa" w:w="2074"/>
+            <w:vAlign w:val="center"/>
+          </w:tcPr>
+          <w:p>
+            <w:pPr>
+              <w:spacing w:after="0"/>
+            </w:pPr>
+            <w:r>
+              <w:rPr>
+                <w:sz w:val="16"/>
+              </w:rPr>
+              <w:t>30</w:t>
+            </w:r>
+          </w:p>
+        </w:tc>
+        <w:tc>
+          <w:tcPr>
+            <w:tcW w:type="dxa" w:w="2074"/>
+            <w:vAlign w:val="center"/>
+          </w:tcPr>
+          <w:p>
+            <w:pPr>
+              <w:spacing w:after="0"/>
+            </w:pPr>
+            <w:r>
+              <w:rPr>
+                <w:sz w:val="16"/>
+              </w:rPr>
+              <w:t>100.0%</w:t>
+            </w:r>
+          </w:p>
+        </w:tc>
+      </w:tr>
+      <w:tr>
+        <w:tc>
+          <w:tcPr>
+            <w:tcW w:type="dxa" w:w="2074"/>
+            <w:vAlign w:val="center"/>
+            <w:shd w:fill="F2F6FA"/>
+          </w:tcPr>
+          <w:p>
+            <w:pPr>
+              <w:spacing w:after="0"/>
+            </w:pPr>
+            <w:r>
+              <w:rPr>
+                <w:sz w:val="16"/>
+              </w:rPr>
+              <w:t>High</w:t>
+            </w:r>
+          </w:p>
+        </w:tc>
+        <w:tc>
+          <w:tcPr>
+            <w:tcW w:type="dxa" w:w="2074"/>
+            <w:vAlign w:val="center"/>
+            <w:shd w:fill="F2F6FA"/>
+          </w:tcPr>
+          <w:p>
+            <w:pPr>
+              <w:spacing w:after="0"/>
+            </w:pPr>
+            <w:r>
+              <w:rPr>
+                <w:sz w:val="16"/>
+              </w:rPr>
+              <w:t>Mist + Fog</w:t>
+            </w:r>
+          </w:p>
+        </w:tc>
+        <w:tc>
+          <w:tcPr>
+            <w:tcW w:type="dxa" w:w="2074"/>
+            <w:vAlign w:val="center"/>
+            <w:shd w:fill="F2F6FA"/>
+          </w:tcPr>
+          <w:p>
+            <w:pPr>
+              <w:spacing w:after="0"/>
+            </w:pPr>
+            <w:r>
+              <w:rPr>
+                <w:sz w:val="16"/>
+              </w:rPr>
+              <w:t>8</w:t>
+            </w:r>
+          </w:p>
+        </w:tc>
+        <w:tc>
+          <w:tcPr>
+            <w:tcW w:type="dxa" w:w="2074"/>
+            <w:vAlign w:val="center"/>
+            <w:shd w:fill="F2F6FA"/>
+          </w:tcPr>
+          <w:p>
+            <w:pPr>
+              <w:spacing w:after="0"/>
+            </w:pPr>
+            <w:r>
+              <w:rPr>
+                <w:sz w:val="16"/>
+              </w:rPr>
+              <w:t>8</w:t>
+            </w:r>
+          </w:p>
+        </w:tc>
+        <w:tc>
+          <w:tcPr>
+            <w:tcW w:type="dxa" w:w="2074"/>
+            <w:vAlign w:val="center"/>
+            <w:shd w:fill="F2F6FA"/>
+          </w:tcPr>
+          <w:p>
+            <w:pPr>
+              <w:spacing w:after="0"/>
+            </w:pPr>
+            <w:r>
+              <w:rPr>
+                <w:sz w:val="16"/>
+              </w:rPr>
+              <w:t>100.0%</w:t>
+            </w:r>
+          </w:p>
+        </w:tc>
+      </w:tr>
+    </w:tbl>
+    <w:p/>
+    <w:p>
+      <w:r>
+        <w:t>Completion is conditional on sending a Fog request; it is not EM PDR and does not mean every scheduled run received the emergency alert.</w:t>
+      </w:r>
+    </w:p>
+    <w:p>
+      <w:r>
+        <w:t>Eighteen separate signal tests reuse the existing binary and matched trips. Junction A1 starts with a protected conflicting phase for 150 seconds. Its permissive green is removed in the validation input, keeping both ambulance movements from A0A1 red. Priority requests are deliberately late, within 10 metres or half a second. Fog/Cloud, Mist with Fog, and no-preemption are compared at all three densities with seeds 1 and 4 over 400 seconds. These controlled cases test a short-notice boundary condition; they are not the default priority algorithm and are not added to the main comparison.</w:t>
+      </w:r>
+    </w:p>
+    <w:tbl>
+      <w:tblPr>
+        <w:tblStyle w:val="TableGrid"/>
+        <w:tblW w:type="auto" w:w="0"/>
+        <w:jc w:val="center"/>
+        <w:tblLayout w:type="autofit"/>
+        <w:tblLook w:firstColumn="1" w:firstRow="1" w:lastColumn="0" w:lastRow="0" w:noHBand="0" w:noVBand="1" w:val="04A0"/>
+        <w:tblBorders>
+          <w:top w:val="single" w:sz="4" w:color="D9D9D9"/>
+          <w:left w:val="single" w:sz="4" w:color="D9D9D9"/>
+          <w:bottom w:val="single" w:sz="4" w:color="D9D9D9"/>
+          <w:right w:val="single" w:sz="4" w:color="D9D9D9"/>
+          <w:insideH w:val="single" w:sz="4" w:color="D9D9D9"/>
+          <w:insideV w:val="single" w:sz="4" w:color="D9D9D9"/>
+        </w:tblBorders>
+      </w:tblPr>
+      <w:tblGrid>
+        <w:gridCol w:w="2592"/>
+        <w:gridCol w:w="2592"/>
+        <w:gridCol w:w="2592"/>
+        <w:gridCol w:w="2592"/>
+      </w:tblGrid>
+      <w:tr>
+        <w:trPr>
+          <w:tblHeader w:val="true"/>
+        </w:trPr>
+        <w:tc>
+          <w:tcPr>
+            <w:tcW w:type="dxa" w:w="2592"/>
+            <w:shd w:fill="1F3957"/>
+          </w:tcPr>
+          <w:p>
+            <w:r>
+              <w:rPr>
+                <w:b/>
+                <w:color w:val="FFFFFF"/>
+                <w:sz w:val="16"/>
+              </w:rPr>
+              <w:t>Traffic</w:t>
+            </w:r>
+          </w:p>
+        </w:tc>
+        <w:tc>
+          <w:tcPr>
+            <w:tcW w:type="dxa" w:w="2592"/>
+            <w:shd w:fill="1F3957"/>
+          </w:tcPr>
+          <w:p>
+            <w:r>
+              <w:rPr>
+                <w:b/>
+                <w:color w:val="FFFFFF"/>
+                <w:sz w:val="16"/>
+              </w:rPr>
+              <w:t>Approach</w:t>
+            </w:r>
+          </w:p>
+        </w:tc>
+        <w:tc>
+          <w:tcPr>
+            <w:tcW w:type="dxa" w:w="2592"/>
+            <w:shd w:fill="1F3957"/>
+          </w:tcPr>
+          <w:p>
+            <w:r>
+              <w:rPr>
+                <w:b/>
+                <w:color w:val="FFFFFF"/>
+                <w:sz w:val="16"/>
+              </w:rPr>
+              <w:t>Runs</w:t>
+            </w:r>
+          </w:p>
+        </w:tc>
+        <w:tc>
+          <w:tcPr>
+            <w:tcW w:type="dxa" w:w="2592"/>
+            <w:shd w:fill="1F3957"/>
+          </w:tcPr>
+          <w:p>
+            <w:r>
+              <w:rPr>
+                <w:b/>
+                <w:color w:val="FFFFFF"/>
+                <w:sz w:val="16"/>
+              </w:rPr>
+              <w:t>Mean waiting s</w:t>
+            </w:r>
+          </w:p>
+        </w:tc>
+      </w:tr>
+      <w:tr>
+        <w:tc>
+          <w:tcPr>
+            <w:tcW w:type="dxa" w:w="2592"/>
+            <w:vAlign w:val="center"/>
+          </w:tcPr>
+          <w:p>
+            <w:pPr>
+              <w:spacing w:after="0"/>
+            </w:pPr>
+            <w:r>
+              <w:rPr>
+                <w:sz w:val="16"/>
+              </w:rPr>
+              <w:t>Low</w:t>
+            </w:r>
+          </w:p>
+        </w:tc>
+        <w:tc>
+          <w:tcPr>
+            <w:tcW w:type="dxa" w:w="2592"/>
+            <w:vAlign w:val="center"/>
+          </w:tcPr>
+          <w:p>
+            <w:pPr>
+              <w:spacing w:after="0"/>
+            </w:pPr>
+            <w:r>
+              <w:rPr>
+                <w:sz w:val="16"/>
+              </w:rPr>
+              <w:t>Fog/Cloud</w:t>
+            </w:r>
+          </w:p>
+        </w:tc>
+        <w:tc>
+          <w:tcPr>
+            <w:tcW w:type="dxa" w:w="2592"/>
+            <w:vAlign w:val="center"/>
+          </w:tcPr>
+          <w:p>
+            <w:pPr>
+              <w:spacing w:after="0"/>
+            </w:pPr>
+            <w:r>
+              <w:rPr>
+                <w:sz w:val="16"/>
+              </w:rPr>
+              <w:t>2</w:t>
+            </w:r>
+          </w:p>
+        </w:tc>
+        <w:tc>
+          <w:tcPr>
+            <w:tcW w:type="dxa" w:w="2592"/>
+            <w:vAlign w:val="center"/>
+          </w:tcPr>
+          <w:p>
+            <w:pPr>
+              <w:spacing w:after="0"/>
+            </w:pPr>
+            <w:r>
+              <w:rPr>
+                <w:sz w:val="16"/>
+              </w:rPr>
+              <w:t>10.500</w:t>
+            </w:r>
+          </w:p>
+        </w:tc>
+      </w:tr>
+      <w:tr>
+        <w:tc>
+          <w:tcPr>
+            <w:tcW w:type="dxa" w:w="2592"/>
+            <w:vAlign w:val="center"/>
+            <w:shd w:fill="F2F6FA"/>
+          </w:tcPr>
+          <w:p>
+            <w:pPr>
+              <w:spacing w:after="0"/>
+            </w:pPr>
+            <w:r>
+              <w:rPr>
+                <w:sz w:val="16"/>
+              </w:rPr>
+              <w:t>Medium</w:t>
+            </w:r>
+          </w:p>
+        </w:tc>
+        <w:tc>
+          <w:tcPr>
+            <w:tcW w:type="dxa" w:w="2592"/>
+            <w:vAlign w:val="center"/>
+            <w:shd w:fill="F2F6FA"/>
+          </w:tcPr>
+          <w:p>
+            <w:pPr>
+              <w:spacing w:after="0"/>
+            </w:pPr>
+            <w:r>
+              <w:rPr>
+                <w:sz w:val="16"/>
+              </w:rPr>
+              <w:t>Fog/Cloud</w:t>
+            </w:r>
+          </w:p>
+        </w:tc>
+        <w:tc>
+          <w:tcPr>
+            <w:tcW w:type="dxa" w:w="2592"/>
+            <w:vAlign w:val="center"/>
+            <w:shd w:fill="F2F6FA"/>
+          </w:tcPr>
+          <w:p>
+            <w:pPr>
+              <w:spacing w:after="0"/>
+            </w:pPr>
+            <w:r>
+              <w:rPr>
+                <w:sz w:val="16"/>
+              </w:rPr>
+              <w:t>2</w:t>
+            </w:r>
+          </w:p>
+        </w:tc>
+        <w:tc>
+          <w:tcPr>
+            <w:tcW w:type="dxa" w:w="2592"/>
+            <w:vAlign w:val="center"/>
+            <w:shd w:fill="F2F6FA"/>
+          </w:tcPr>
+          <w:p>
+            <w:pPr>
+              <w:spacing w:after="0"/>
+            </w:pPr>
+            <w:r>
+              <w:rPr>
+                <w:sz w:val="16"/>
+              </w:rPr>
+              <w:t>12.000</w:t>
+            </w:r>
+          </w:p>
+        </w:tc>
+      </w:tr>
+      <w:tr>
+        <w:tc>
+          <w:tcPr>
+            <w:tcW w:type="dxa" w:w="2592"/>
+            <w:vAlign w:val="center"/>
+          </w:tcPr>
+          <w:p>
+            <w:pPr>
+              <w:spacing w:after="0"/>
+            </w:pPr>
+            <w:r>
+              <w:rPr>
+                <w:sz w:val="16"/>
+              </w:rPr>
+              <w:t>High</w:t>
+            </w:r>
+          </w:p>
+        </w:tc>
+        <w:tc>
+          <w:tcPr>
+            <w:tcW w:type="dxa" w:w="2592"/>
+            <w:vAlign w:val="center"/>
+          </w:tcPr>
+          <w:p>
+            <w:pPr>
+              <w:spacing w:after="0"/>
+            </w:pPr>
+            <w:r>
+              <w:rPr>
+                <w:sz w:val="16"/>
+              </w:rPr>
+              <w:t>Fog/Cloud</w:t>
+            </w:r>
+          </w:p>
+        </w:tc>
+        <w:tc>
+          <w:tcPr>
+            <w:tcW w:type="dxa" w:w="2592"/>
+            <w:vAlign w:val="center"/>
+          </w:tcPr>
+          <w:p>
+            <w:pPr>
+              <w:spacing w:after="0"/>
+            </w:pPr>
+            <w:r>
+              <w:rPr>
+                <w:sz w:val="16"/>
+              </w:rPr>
+              <w:t>2</w:t>
+            </w:r>
+          </w:p>
+        </w:tc>
+        <w:tc>
+          <w:tcPr>
+            <w:tcW w:type="dxa" w:w="2592"/>
+            <w:vAlign w:val="center"/>
+          </w:tcPr>
+          <w:p>
+            <w:pPr>
+              <w:spacing w:after="0"/>
+            </w:pPr>
+            <w:r>
+              <w:rPr>
+                <w:sz w:val="16"/>
+              </w:rPr>
+              <w:t>5.000</w:t>
+            </w:r>
+          </w:p>
+        </w:tc>
+      </w:tr>
+      <w:tr>
+        <w:tc>
+          <w:tcPr>
+            <w:tcW w:type="dxa" w:w="2592"/>
+            <w:vAlign w:val="center"/>
+            <w:shd w:fill="F2F6FA"/>
+          </w:tcPr>
+          <w:p>
+            <w:pPr>
+              <w:spacing w:after="0"/>
+            </w:pPr>
+            <w:r>
+              <w:rPr>
+                <w:sz w:val="16"/>
+              </w:rPr>
+              <w:t>Low</w:t>
+            </w:r>
+          </w:p>
+        </w:tc>
+        <w:tc>
+          <w:tcPr>
+            <w:tcW w:type="dxa" w:w="2592"/>
+            <w:vAlign w:val="center"/>
+            <w:shd w:fill="F2F6FA"/>
+          </w:tcPr>
+          <w:p>
+            <w:pPr>
+              <w:spacing w:after="0"/>
+            </w:pPr>
+            <w:r>
+              <w:rPr>
+                <w:sz w:val="16"/>
+              </w:rPr>
+              <w:t>Mist + Fog</w:t>
+            </w:r>
+          </w:p>
+        </w:tc>
+        <w:tc>
+          <w:tcPr>
+            <w:tcW w:type="dxa" w:w="2592"/>
+            <w:vAlign w:val="center"/>
+            <w:shd w:fill="F2F6FA"/>
+          </w:tcPr>
+          <w:p>
+            <w:pPr>
+              <w:spacing w:after="0"/>
+            </w:pPr>
+            <w:r>
+              <w:rPr>
+                <w:sz w:val="16"/>
+              </w:rPr>
+              <w:t>2</w:t>
+            </w:r>
+          </w:p>
+        </w:tc>
+        <w:tc>
+          <w:tcPr>
+            <w:tcW w:type="dxa" w:w="2592"/>
+            <w:vAlign w:val="center"/>
+            <w:shd w:fill="F2F6FA"/>
+          </w:tcPr>
+          <w:p>
+            <w:pPr>
+              <w:spacing w:after="0"/>
+            </w:pPr>
+            <w:r>
+              <w:rPr>
+                <w:sz w:val="16"/>
+              </w:rPr>
+              <w:t>11.500</w:t>
+            </w:r>
+          </w:p>
+        </w:tc>
+      </w:tr>
+      <w:tr>
+        <w:tc>
+          <w:tcPr>
+            <w:tcW w:type="dxa" w:w="2592"/>
+            <w:vAlign w:val="center"/>
+          </w:tcPr>
+          <w:p>
+            <w:pPr>
+              <w:spacing w:after="0"/>
+            </w:pPr>
+            <w:r>
+              <w:rPr>
+                <w:sz w:val="16"/>
+              </w:rPr>
+              <w:t>Medium</w:t>
+            </w:r>
+          </w:p>
+        </w:tc>
+        <w:tc>
+          <w:tcPr>
+            <w:tcW w:type="dxa" w:w="2592"/>
+            <w:vAlign w:val="center"/>
+          </w:tcPr>
+          <w:p>
+            <w:pPr>
+              <w:spacing w:after="0"/>
+            </w:pPr>
+            <w:r>
+              <w:rPr>
+                <w:sz w:val="16"/>
+              </w:rPr>
+              <w:t>Mist + Fog</w:t>
+            </w:r>
+          </w:p>
+        </w:tc>
+        <w:tc>
+          <w:tcPr>
+            <w:tcW w:type="dxa" w:w="2592"/>
+            <w:vAlign w:val="center"/>
+          </w:tcPr>
+          <w:p>
+            <w:pPr>
+              <w:spacing w:after="0"/>
+            </w:pPr>
+            <w:r>
+              <w:rPr>
+                <w:sz w:val="16"/>
+              </w:rPr>
+              <w:t>2</w:t>
+            </w:r>
+          </w:p>
+        </w:tc>
+        <w:tc>
+          <w:tcPr>
+            <w:tcW w:type="dxa" w:w="2592"/>
+            <w:vAlign w:val="center"/>
+          </w:tcPr>
+          <w:p>
+            <w:pPr>
+              <w:spacing w:after="0"/>
+            </w:pPr>
+            <w:r>
+              <w:rPr>
+                <w:sz w:val="16"/>
+              </w:rPr>
+              <w:t>12.750</w:t>
+            </w:r>
+          </w:p>
+        </w:tc>
+      </w:tr>
+      <w:tr>
+        <w:tc>
+          <w:tcPr>
+            <w:tcW w:type="dxa" w:w="2592"/>
+            <w:vAlign w:val="center"/>
+            <w:shd w:fill="F2F6FA"/>
+          </w:tcPr>
+          <w:p>
+            <w:pPr>
+              <w:spacing w:after="0"/>
+            </w:pPr>
+            <w:r>
+              <w:rPr>
+                <w:sz w:val="16"/>
+              </w:rPr>
+              <w:t>High</w:t>
+            </w:r>
+          </w:p>
+        </w:tc>
+        <w:tc>
+          <w:tcPr>
+            <w:tcW w:type="dxa" w:w="2592"/>
+            <w:vAlign w:val="center"/>
+            <w:shd w:fill="F2F6FA"/>
+          </w:tcPr>
+          <w:p>
+            <w:pPr>
+              <w:spacing w:after="0"/>
+            </w:pPr>
+            <w:r>
+              <w:rPr>
+                <w:sz w:val="16"/>
+              </w:rPr>
+              <w:t>Mist + Fog</w:t>
+            </w:r>
+          </w:p>
+        </w:tc>
+        <w:tc>
+          <w:tcPr>
+            <w:tcW w:type="dxa" w:w="2592"/>
+            <w:vAlign w:val="center"/>
+            <w:shd w:fill="F2F6FA"/>
+          </w:tcPr>
+          <w:p>
+            <w:pPr>
+              <w:spacing w:after="0"/>
+            </w:pPr>
+            <w:r>
+              <w:rPr>
+                <w:sz w:val="16"/>
+              </w:rPr>
+              <w:t>2</w:t>
+            </w:r>
+          </w:p>
+        </w:tc>
+        <w:tc>
+          <w:tcPr>
+            <w:tcW w:type="dxa" w:w="2592"/>
+            <w:vAlign w:val="center"/>
+            <w:shd w:fill="F2F6FA"/>
+          </w:tcPr>
+          <w:p>
+            <w:pPr>
+              <w:spacing w:after="0"/>
+            </w:pPr>
+            <w:r>
+              <w:rPr>
+                <w:sz w:val="16"/>
+              </w:rPr>
+              <w:t>6.250</w:t>
+            </w:r>
+          </w:p>
+        </w:tc>
+      </w:tr>
+      <w:tr>
+        <w:tc>
+          <w:tcPr>
+            <w:tcW w:type="dxa" w:w="2592"/>
+            <w:vAlign w:val="center"/>
+          </w:tcPr>
+          <w:p>
+            <w:pPr>
+              <w:spacing w:after="0"/>
+            </w:pPr>
+            <w:r>
+              <w:rPr>
+                <w:sz w:val="16"/>
+              </w:rPr>
+              <w:t>Low</w:t>
+            </w:r>
+          </w:p>
+        </w:tc>
+        <w:tc>
+          <w:tcPr>
+            <w:tcW w:type="dxa" w:w="2592"/>
+            <w:vAlign w:val="center"/>
+          </w:tcPr>
+          <w:p>
+            <w:pPr>
+              <w:spacing w:after="0"/>
+            </w:pPr>
+            <w:r>
+              <w:rPr>
+                <w:sz w:val="16"/>
+              </w:rPr>
+              <w:t>No preemption</w:t>
+            </w:r>
+          </w:p>
+        </w:tc>
+        <w:tc>
+          <w:tcPr>
+            <w:tcW w:type="dxa" w:w="2592"/>
+            <w:vAlign w:val="center"/>
+          </w:tcPr>
+          <w:p>
+            <w:pPr>
+              <w:spacing w:after="0"/>
+            </w:pPr>
+            <w:r>
+              <w:rPr>
+                <w:sz w:val="16"/>
+              </w:rPr>
+              <w:t>2</w:t>
+            </w:r>
+          </w:p>
+        </w:tc>
+        <w:tc>
+          <w:tcPr>
+            <w:tcW w:type="dxa" w:w="2592"/>
+            <w:vAlign w:val="center"/>
+          </w:tcPr>
+          <w:p>
+            <w:pPr>
+              <w:spacing w:after="0"/>
+            </w:pPr>
+            <w:r>
+              <w:rPr>
+                <w:sz w:val="16"/>
+              </w:rPr>
+              <w:t>111.750</w:t>
+            </w:r>
+          </w:p>
+        </w:tc>
+      </w:tr>
+      <w:tr>
+        <w:tc>
+          <w:tcPr>
+            <w:tcW w:type="dxa" w:w="2592"/>
+            <w:vAlign w:val="center"/>
+            <w:shd w:fill="F2F6FA"/>
+          </w:tcPr>
+          <w:p>
+            <w:pPr>
+              <w:spacing w:after="0"/>
+            </w:pPr>
+            <w:r>
+              <w:rPr>
+                <w:sz w:val="16"/>
+              </w:rPr>
+              <w:t>Medium</w:t>
+            </w:r>
+          </w:p>
+        </w:tc>
+        <w:tc>
+          <w:tcPr>
+            <w:tcW w:type="dxa" w:w="2592"/>
+            <w:vAlign w:val="center"/>
+            <w:shd w:fill="F2F6FA"/>
+          </w:tcPr>
+          <w:p>
+            <w:pPr>
+              <w:spacing w:after="0"/>
+            </w:pPr>
+            <w:r>
+              <w:rPr>
+                <w:sz w:val="16"/>
+              </w:rPr>
+              <w:t>No preemption</w:t>
+            </w:r>
+          </w:p>
+        </w:tc>
+        <w:tc>
+          <w:tcPr>
+            <w:tcW w:type="dxa" w:w="2592"/>
+            <w:vAlign w:val="center"/>
+            <w:shd w:fill="F2F6FA"/>
+          </w:tcPr>
+          <w:p>
+            <w:pPr>
+              <w:spacing w:after="0"/>
+            </w:pPr>
+            <w:r>
+              <w:rPr>
+                <w:sz w:val="16"/>
+              </w:rPr>
+              <w:t>2</w:t>
+            </w:r>
+          </w:p>
+        </w:tc>
+        <w:tc>
+          <w:tcPr>
+            <w:tcW w:type="dxa" w:w="2592"/>
+            <w:vAlign w:val="center"/>
+            <w:shd w:fill="F2F6FA"/>
+          </w:tcPr>
+          <w:p>
+            <w:pPr>
+              <w:spacing w:after="0"/>
+            </w:pPr>
+            <w:r>
+              <w:rPr>
+                <w:sz w:val="16"/>
+              </w:rPr>
+              <w:t>110.500</w:t>
+            </w:r>
+          </w:p>
+        </w:tc>
+      </w:tr>
+      <w:tr>
+        <w:tc>
+          <w:tcPr>
+            <w:tcW w:type="dxa" w:w="2592"/>
+            <w:vAlign w:val="center"/>
+          </w:tcPr>
+          <w:p>
+            <w:pPr>
+              <w:spacing w:after="0"/>
+            </w:pPr>
+            <w:r>
+              <w:rPr>
+                <w:sz w:val="16"/>
+              </w:rPr>
+              <w:t>High</w:t>
+            </w:r>
+          </w:p>
+        </w:tc>
+        <w:tc>
+          <w:tcPr>
+            <w:tcW w:type="dxa" w:w="2592"/>
+            <w:vAlign w:val="center"/>
+          </w:tcPr>
+          <w:p>
+            <w:pPr>
+              <w:spacing w:after="0"/>
+            </w:pPr>
+            <w:r>
+              <w:rPr>
+                <w:sz w:val="16"/>
+              </w:rPr>
+              <w:t>No preemption</w:t>
+            </w:r>
+          </w:p>
+        </w:tc>
+        <w:tc>
+          <w:tcPr>
+            <w:tcW w:type="dxa" w:w="2592"/>
+            <w:vAlign w:val="center"/>
+          </w:tcPr>
+          <w:p>
+            <w:pPr>
+              <w:spacing w:after="0"/>
+            </w:pPr>
+            <w:r>
+              <w:rPr>
+                <w:sz w:val="16"/>
+              </w:rPr>
+              <w:t>2</w:t>
+            </w:r>
+          </w:p>
+        </w:tc>
+        <w:tc>
+          <w:tcPr>
+            <w:tcW w:type="dxa" w:w="2592"/>
+            <w:vAlign w:val="center"/>
+          </w:tcPr>
+          <w:p>
+            <w:pPr>
+              <w:spacing w:after="0"/>
+            </w:pPr>
+            <w:r>
+              <w:rPr>
+                <w:sz w:val="16"/>
+              </w:rPr>
+              <w:t>97.250</w:t>
+            </w:r>
+          </w:p>
+        </w:tc>
+      </w:tr>
+    </w:tbl>
+    <w:p/>
+    <w:p>
+      <w:r>
+        <w:t>Every tested priority case has an observed red approach, positive measured waiting, confirmed arrival, and less waiting than its matched no-preemption case. Yellow, all-red, and minimum-green timing are checked from the event logs. Two seeds per density are mechanism validation; wide confidence intervals are retained. Ordinary green-arrival cases may still have zero waiting.</w:t>
+      </w:r>
+    </w:p>
+    <w:p>
+      <w:pPr>
+        <w:pStyle w:val="Heading1"/>
+      </w:pPr>
+      <w:r>
         <w:t>Conclusion and limits</w:t>
       </w:r>
     </w:p>
@@ -6190,7 +7613,7 @@
     </w:p>
     <w:p>
       <w:r>
-        <w:t>The following gallery contains all 66 result graphs.</w:t>
+        <w:t>The following gallery contains all 78 result graphs.</w:t>
       </w:r>
     </w:p>
     <w:p>
@@ -9790,6 +11213,658 @@
       </w:pPr>
       <w:r>
         <w:t>Figure 66. High traffic: Mist minus Fog/Cloud -60.54 ms, 95% CI [-211.69, 90.61], n=30; Mist + Fog minus Mist Dynamic -106.50 ms, 95% CI [-173.57, -39.42], n=30.</w:t>
+      </w:r>
+    </w:p>
+    <w:p>
+      <w:pPr>
+        <w:pStyle w:val="Heading2"/>
+      </w:pPr>
+      <w:r>
+        <w:t>Fog route requests</w:t>
+      </w:r>
+    </w:p>
+    <w:p>
+      <w:pPr>
+        <w:keepNext/>
+      </w:pPr>
+      <w:r>
+        <w:t>Mean wireless Fog route requests per scheduled run. Local Mist needs no Fog request. These counts are separate from the emergency alert.</w:t>
+      </w:r>
+    </w:p>
+    <w:p>
+      <w:pPr>
+        <w:keepNext/>
+        <w:jc w:val="center"/>
+      </w:pPr>
+      <w:r>
+        <w:drawing>
+          <wp:inline xmlns:a="http://schemas.openxmlformats.org/drawingml/2006/main" xmlns:pic="http://schemas.openxmlformats.org/drawingml/2006/picture">
+            <wp:extent cx="5577840" cy="3053133"/>
+            <wp:docPr id="67" name="Picture 67" descr="Fog route requests. Low traffic: Fog/Cloud 0.800 requests/run (n=30); Mist 0.000 requests/run (n=30); Mist Dynamic 0.000 requests/run (n=30); Mist + Fog 0.233 requests/run (n=30). Error bars show 95% confidence intervals."/>
+            <wp:cNvGraphicFramePr>
+              <a:graphicFrameLocks noChangeAspect="1"/>
+            </wp:cNvGraphicFramePr>
+            <a:graphic>
+              <a:graphicData uri="http://schemas.openxmlformats.org/drawingml/2006/picture">
+                <pic:pic>
+                  <pic:nvPicPr>
+                    <pic:cNvPr id="0" name="route_requests_per_run-low.png"/>
+                    <pic:cNvPicPr/>
+                  </pic:nvPicPr>
+                  <pic:blipFill>
+                    <a:blip r:embed="rId75"/>
+                    <a:stretch>
+                      <a:fillRect/>
+                    </a:stretch>
+                  </pic:blipFill>
+                  <pic:spPr>
+                    <a:xfrm>
+                      <a:off x="0" y="0"/>
+                      <a:ext cx="5577840" cy="3053133"/>
+                    </a:xfrm>
+                    <a:prstGeom prst="rect"/>
+                  </pic:spPr>
+                </pic:pic>
+              </a:graphicData>
+            </a:graphic>
+          </wp:inline>
+        </w:drawing>
+      </w:r>
+    </w:p>
+    <w:p>
+      <w:pPr>
+        <w:keepLines/>
+        <w:spacing w:after="200"/>
+      </w:pPr>
+      <w:r>
+        <w:t>Figure 67. Low traffic: Fog/Cloud 0.800 requests/run (n=30); Mist 0.000 requests/run (n=30); Mist Dynamic 0.000 requests/run (n=30); Mist + Fog 0.233 requests/run (n=30). Error bars show 95% confidence intervals.</w:t>
+      </w:r>
+    </w:p>
+    <w:p>
+      <w:pPr>
+        <w:keepNext/>
+        <w:jc w:val="center"/>
+      </w:pPr>
+      <w:r>
+        <w:drawing>
+          <wp:inline xmlns:a="http://schemas.openxmlformats.org/drawingml/2006/main" xmlns:pic="http://schemas.openxmlformats.org/drawingml/2006/picture">
+            <wp:extent cx="5577840" cy="3053133"/>
+            <wp:docPr id="68" name="Picture 68" descr="Fog route requests. Medium traffic: Fog/Cloud 0.967 requests/run (n=30); Mist 0.000 requests/run (n=30); Mist Dynamic 0.000 requests/run (n=30); Mist + Fog 0.267 requests/run (n=30). Error bars show 95% confidence intervals."/>
+            <wp:cNvGraphicFramePr>
+              <a:graphicFrameLocks noChangeAspect="1"/>
+            </wp:cNvGraphicFramePr>
+            <a:graphic>
+              <a:graphicData uri="http://schemas.openxmlformats.org/drawingml/2006/picture">
+                <pic:pic>
+                  <pic:nvPicPr>
+                    <pic:cNvPr id="0" name="route_requests_per_run-medium.png"/>
+                    <pic:cNvPicPr/>
+                  </pic:nvPicPr>
+                  <pic:blipFill>
+                    <a:blip r:embed="rId76"/>
+                    <a:stretch>
+                      <a:fillRect/>
+                    </a:stretch>
+                  </pic:blipFill>
+                  <pic:spPr>
+                    <a:xfrm>
+                      <a:off x="0" y="0"/>
+                      <a:ext cx="5577840" cy="3053133"/>
+                    </a:xfrm>
+                    <a:prstGeom prst="rect"/>
+                  </pic:spPr>
+                </pic:pic>
+              </a:graphicData>
+            </a:graphic>
+          </wp:inline>
+        </w:drawing>
+      </w:r>
+    </w:p>
+    <w:p>
+      <w:pPr>
+        <w:keepLines/>
+        <w:spacing w:after="200"/>
+      </w:pPr>
+      <w:r>
+        <w:t>Figure 68. Medium traffic: Fog/Cloud 0.967 requests/run (n=30); Mist 0.000 requests/run (n=30); Mist Dynamic 0.000 requests/run (n=30); Mist + Fog 0.267 requests/run (n=30). Error bars show 95% confidence intervals.</w:t>
+      </w:r>
+    </w:p>
+    <w:p>
+      <w:pPr>
+        <w:keepNext/>
+        <w:jc w:val="center"/>
+      </w:pPr>
+      <w:r>
+        <w:drawing>
+          <wp:inline xmlns:a="http://schemas.openxmlformats.org/drawingml/2006/main" xmlns:pic="http://schemas.openxmlformats.org/drawingml/2006/picture">
+            <wp:extent cx="5577840" cy="3053133"/>
+            <wp:docPr id="69" name="Picture 69" descr="Fog route requests. High traffic: Fog/Cloud 1.000 requests/run (n=30); Mist 0.000 requests/run (n=30); Mist Dynamic 0.000 requests/run (n=30); Mist + Fog 0.267 requests/run (n=30). Error bars show 95% confidence intervals."/>
+            <wp:cNvGraphicFramePr>
+              <a:graphicFrameLocks noChangeAspect="1"/>
+            </wp:cNvGraphicFramePr>
+            <a:graphic>
+              <a:graphicData uri="http://schemas.openxmlformats.org/drawingml/2006/picture">
+                <pic:pic>
+                  <pic:nvPicPr>
+                    <pic:cNvPr id="0" name="route_requests_per_run-high.png"/>
+                    <pic:cNvPicPr/>
+                  </pic:nvPicPr>
+                  <pic:blipFill>
+                    <a:blip r:embed="rId77"/>
+                    <a:stretch>
+                      <a:fillRect/>
+                    </a:stretch>
+                  </pic:blipFill>
+                  <pic:spPr>
+                    <a:xfrm>
+                      <a:off x="0" y="0"/>
+                      <a:ext cx="5577840" cy="3053133"/>
+                    </a:xfrm>
+                    <a:prstGeom prst="rect"/>
+                  </pic:spPr>
+                </pic:pic>
+              </a:graphicData>
+            </a:graphic>
+          </wp:inline>
+        </w:drawing>
+      </w:r>
+    </w:p>
+    <w:p>
+      <w:pPr>
+        <w:keepLines/>
+        <w:spacing w:after="200"/>
+      </w:pPr>
+      <w:r>
+        <w:t>Figure 69. High traffic: Fog/Cloud 1.000 requests/run (n=30); Mist 0.000 requests/run (n=30); Mist Dynamic 0.000 requests/run (n=30); Mist + Fog 0.267 requests/run (n=30). Error bars show 95% confidence intervals.</w:t>
+      </w:r>
+    </w:p>
+    <w:p>
+      <w:pPr>
+        <w:pStyle w:val="Heading2"/>
+      </w:pPr>
+      <w:r>
+        <w:t>Fog route transaction turnaround</w:t>
+      </w:r>
+    </w:p>
+    <w:p>
+      <w:pPr>
+        <w:keepNext/>
+      </w:pPr>
+      <w:r>
+        <w:t>Time from sending a Fog request to accepting its route reply. Processing and Cloud backhaul are included; watchdog waiting is excluded. Local-only Mist has no wireless transaction.</w:t>
+      </w:r>
+    </w:p>
+    <w:p>
+      <w:pPr>
+        <w:keepNext/>
+        <w:jc w:val="center"/>
+      </w:pPr>
+      <w:r>
+        <w:drawing>
+          <wp:inline xmlns:a="http://schemas.openxmlformats.org/drawingml/2006/main" xmlns:pic="http://schemas.openxmlformats.org/drawingml/2006/picture">
+            <wp:extent cx="5577840" cy="3053133"/>
+            <wp:docPr id="70" name="Picture 70" descr="Fog route transaction turnaround. Low traffic: Fog/Cloud 626.539 ms (n=24); Mist + Fog 326.539 ms (n=7). Error bars show 95% confidence intervals."/>
+            <wp:cNvGraphicFramePr>
+              <a:graphicFrameLocks noChangeAspect="1"/>
+            </wp:cNvGraphicFramePr>
+            <a:graphic>
+              <a:graphicData uri="http://schemas.openxmlformats.org/drawingml/2006/picture">
+                <pic:pic>
+                  <pic:nvPicPr>
+                    <pic:cNvPr id="0" name="route_transaction_ms-low.png"/>
+                    <pic:cNvPicPr/>
+                  </pic:nvPicPr>
+                  <pic:blipFill>
+                    <a:blip r:embed="rId78"/>
+                    <a:stretch>
+                      <a:fillRect/>
+                    </a:stretch>
+                  </pic:blipFill>
+                  <pic:spPr>
+                    <a:xfrm>
+                      <a:off x="0" y="0"/>
+                      <a:ext cx="5577840" cy="3053133"/>
+                    </a:xfrm>
+                    <a:prstGeom prst="rect"/>
+                  </pic:spPr>
+                </pic:pic>
+              </a:graphicData>
+            </a:graphic>
+          </wp:inline>
+        </w:drawing>
+      </w:r>
+    </w:p>
+    <w:p>
+      <w:pPr>
+        <w:keepLines/>
+        <w:spacing w:after="200"/>
+      </w:pPr>
+      <w:r>
+        <w:t>Figure 70. Low traffic: Fog/Cloud 626.539 ms (n=24); Mist + Fog 326.539 ms (n=7). Error bars show 95% confidence intervals.</w:t>
+      </w:r>
+    </w:p>
+    <w:p>
+      <w:pPr>
+        <w:keepNext/>
+        <w:jc w:val="center"/>
+      </w:pPr>
+      <w:r>
+        <w:drawing>
+          <wp:inline xmlns:a="http://schemas.openxmlformats.org/drawingml/2006/main" xmlns:pic="http://schemas.openxmlformats.org/drawingml/2006/picture">
+            <wp:extent cx="5577840" cy="3053133"/>
+            <wp:docPr id="71" name="Picture 71" descr="Fog route transaction turnaround. Medium traffic: Fog/Cloud 626.543 ms (n=29); Mist + Fog 326.598 ms (n=8). Error bars show 95% confidence intervals."/>
+            <wp:cNvGraphicFramePr>
+              <a:graphicFrameLocks noChangeAspect="1"/>
+            </wp:cNvGraphicFramePr>
+            <a:graphic>
+              <a:graphicData uri="http://schemas.openxmlformats.org/drawingml/2006/picture">
+                <pic:pic>
+                  <pic:nvPicPr>
+                    <pic:cNvPr id="0" name="route_transaction_ms-medium.png"/>
+                    <pic:cNvPicPr/>
+                  </pic:nvPicPr>
+                  <pic:blipFill>
+                    <a:blip r:embed="rId79"/>
+                    <a:stretch>
+                      <a:fillRect/>
+                    </a:stretch>
+                  </pic:blipFill>
+                  <pic:spPr>
+                    <a:xfrm>
+                      <a:off x="0" y="0"/>
+                      <a:ext cx="5577840" cy="3053133"/>
+                    </a:xfrm>
+                    <a:prstGeom prst="rect"/>
+                  </pic:spPr>
+                </pic:pic>
+              </a:graphicData>
+            </a:graphic>
+          </wp:inline>
+        </w:drawing>
+      </w:r>
+    </w:p>
+    <w:p>
+      <w:pPr>
+        <w:keepLines/>
+        <w:spacing w:after="200"/>
+      </w:pPr>
+      <w:r>
+        <w:t>Figure 71. Medium traffic: Fog/Cloud 626.543 ms (n=29); Mist + Fog 326.598 ms (n=8). Error bars show 95% confidence intervals.</w:t>
+      </w:r>
+    </w:p>
+    <w:p>
+      <w:pPr>
+        <w:keepNext/>
+        <w:jc w:val="center"/>
+      </w:pPr>
+      <w:r>
+        <w:drawing>
+          <wp:inline xmlns:a="http://schemas.openxmlformats.org/drawingml/2006/main" xmlns:pic="http://schemas.openxmlformats.org/drawingml/2006/picture">
+            <wp:extent cx="5577840" cy="3053133"/>
+            <wp:docPr id="72" name="Picture 72" descr="Fog route transaction turnaround. High traffic: Fog/Cloud 626.539 ms (n=30); Mist + Fog 326.630 ms (n=8). Error bars show 95% confidence intervals."/>
+            <wp:cNvGraphicFramePr>
+              <a:graphicFrameLocks noChangeAspect="1"/>
+            </wp:cNvGraphicFramePr>
+            <a:graphic>
+              <a:graphicData uri="http://schemas.openxmlformats.org/drawingml/2006/picture">
+                <pic:pic>
+                  <pic:nvPicPr>
+                    <pic:cNvPr id="0" name="route_transaction_ms-high.png"/>
+                    <pic:cNvPicPr/>
+                  </pic:nvPicPr>
+                  <pic:blipFill>
+                    <a:blip r:embed="rId80"/>
+                    <a:stretch>
+                      <a:fillRect/>
+                    </a:stretch>
+                  </pic:blipFill>
+                  <pic:spPr>
+                    <a:xfrm>
+                      <a:off x="0" y="0"/>
+                      <a:ext cx="5577840" cy="3053133"/>
+                    </a:xfrm>
+                    <a:prstGeom prst="rect"/>
+                  </pic:spPr>
+                </pic:pic>
+              </a:graphicData>
+            </a:graphic>
+          </wp:inline>
+        </w:drawing>
+      </w:r>
+    </w:p>
+    <w:p>
+      <w:pPr>
+        <w:keepLines/>
+        <w:spacing w:after="200"/>
+      </w:pPr>
+      <w:r>
+        <w:t>Figure 72. High traffic: Fog/Cloud 626.539 ms (n=30); Mist + Fog 326.630 ms (n=8). Error bars show 95% confidence intervals.</w:t>
+      </w:r>
+    </w:p>
+    <w:p>
+      <w:pPr>
+        <w:pStyle w:val="Heading2"/>
+      </w:pPr>
+      <w:r>
+        <w:t>Fog route network round trip</w:t>
+      </w:r>
+    </w:p>
+    <w:p>
+      <w:pPr>
+        <w:keepNext/>
+      </w:pPr>
+      <w:r>
+        <w:t>Request and reply network time after subtracting processing and Cloud backhaul. The 500 ms watchdog wait is also excluded.</w:t>
+      </w:r>
+    </w:p>
+    <w:p>
+      <w:pPr>
+        <w:keepNext/>
+        <w:jc w:val="center"/>
+      </w:pPr>
+      <w:r>
+        <w:drawing>
+          <wp:inline xmlns:a="http://schemas.openxmlformats.org/drawingml/2006/main" xmlns:pic="http://schemas.openxmlformats.org/drawingml/2006/picture">
+            <wp:extent cx="5577840" cy="3053133"/>
+            <wp:docPr id="73" name="Picture 73" descr="Fog route network round trip. Low traffic: Fog/Cloud 0.539 ms (n=24); Mist + Fog 0.539 ms (n=7). Error bars show 95% confidence intervals."/>
+            <wp:cNvGraphicFramePr>
+              <a:graphicFrameLocks noChangeAspect="1"/>
+            </wp:cNvGraphicFramePr>
+            <a:graphic>
+              <a:graphicData uri="http://schemas.openxmlformats.org/drawingml/2006/picture">
+                <pic:pic>
+                  <pic:nvPicPr>
+                    <pic:cNvPr id="0" name="route_network_roundtrip_ms-low.png"/>
+                    <pic:cNvPicPr/>
+                  </pic:nvPicPr>
+                  <pic:blipFill>
+                    <a:blip r:embed="rId81"/>
+                    <a:stretch>
+                      <a:fillRect/>
+                    </a:stretch>
+                  </pic:blipFill>
+                  <pic:spPr>
+                    <a:xfrm>
+                      <a:off x="0" y="0"/>
+                      <a:ext cx="5577840" cy="3053133"/>
+                    </a:xfrm>
+                    <a:prstGeom prst="rect"/>
+                  </pic:spPr>
+                </pic:pic>
+              </a:graphicData>
+            </a:graphic>
+          </wp:inline>
+        </w:drawing>
+      </w:r>
+    </w:p>
+    <w:p>
+      <w:pPr>
+        <w:keepLines/>
+        <w:spacing w:after="200"/>
+      </w:pPr>
+      <w:r>
+        <w:t>Figure 73. Low traffic: Fog/Cloud 0.539 ms (n=24); Mist + Fog 0.539 ms (n=7). Error bars show 95% confidence intervals.</w:t>
+      </w:r>
+    </w:p>
+    <w:p>
+      <w:pPr>
+        <w:keepNext/>
+        <w:jc w:val="center"/>
+      </w:pPr>
+      <w:r>
+        <w:drawing>
+          <wp:inline xmlns:a="http://schemas.openxmlformats.org/drawingml/2006/main" xmlns:pic="http://schemas.openxmlformats.org/drawingml/2006/picture">
+            <wp:extent cx="5577840" cy="3053133"/>
+            <wp:docPr id="74" name="Picture 74" descr="Fog route network round trip. Medium traffic: Fog/Cloud 0.543 ms (n=29); Mist + Fog 0.598 ms (n=8). Error bars show 95% confidence intervals."/>
+            <wp:cNvGraphicFramePr>
+              <a:graphicFrameLocks noChangeAspect="1"/>
+            </wp:cNvGraphicFramePr>
+            <a:graphic>
+              <a:graphicData uri="http://schemas.openxmlformats.org/drawingml/2006/picture">
+                <pic:pic>
+                  <pic:nvPicPr>
+                    <pic:cNvPr id="0" name="route_network_roundtrip_ms-medium.png"/>
+                    <pic:cNvPicPr/>
+                  </pic:nvPicPr>
+                  <pic:blipFill>
+                    <a:blip r:embed="rId82"/>
+                    <a:stretch>
+                      <a:fillRect/>
+                    </a:stretch>
+                  </pic:blipFill>
+                  <pic:spPr>
+                    <a:xfrm>
+                      <a:off x="0" y="0"/>
+                      <a:ext cx="5577840" cy="3053133"/>
+                    </a:xfrm>
+                    <a:prstGeom prst="rect"/>
+                  </pic:spPr>
+                </pic:pic>
+              </a:graphicData>
+            </a:graphic>
+          </wp:inline>
+        </w:drawing>
+      </w:r>
+    </w:p>
+    <w:p>
+      <w:pPr>
+        <w:keepLines/>
+        <w:spacing w:after="200"/>
+      </w:pPr>
+      <w:r>
+        <w:t>Figure 74. Medium traffic: Fog/Cloud 0.543 ms (n=29); Mist + Fog 0.598 ms (n=8). Error bars show 95% confidence intervals.</w:t>
+      </w:r>
+    </w:p>
+    <w:p>
+      <w:pPr>
+        <w:keepNext/>
+        <w:jc w:val="center"/>
+      </w:pPr>
+      <w:r>
+        <w:drawing>
+          <wp:inline xmlns:a="http://schemas.openxmlformats.org/drawingml/2006/main" xmlns:pic="http://schemas.openxmlformats.org/drawingml/2006/picture">
+            <wp:extent cx="5577840" cy="3053133"/>
+            <wp:docPr id="75" name="Picture 75" descr="Fog route network round trip. High traffic: Fog/Cloud 0.539 ms (n=30); Mist + Fog 0.630 ms (n=8). Error bars show 95% confidence intervals."/>
+            <wp:cNvGraphicFramePr>
+              <a:graphicFrameLocks noChangeAspect="1"/>
+            </wp:cNvGraphicFramePr>
+            <a:graphic>
+              <a:graphicData uri="http://schemas.openxmlformats.org/drawingml/2006/picture">
+                <pic:pic>
+                  <pic:nvPicPr>
+                    <pic:cNvPr id="0" name="route_network_roundtrip_ms-high.png"/>
+                    <pic:cNvPicPr/>
+                  </pic:nvPicPr>
+                  <pic:blipFill>
+                    <a:blip r:embed="rId83"/>
+                    <a:stretch>
+                      <a:fillRect/>
+                    </a:stretch>
+                  </pic:blipFill>
+                  <pic:spPr>
+                    <a:xfrm>
+                      <a:off x="0" y="0"/>
+                      <a:ext cx="5577840" cy="3053133"/>
+                    </a:xfrm>
+                    <a:prstGeom prst="rect"/>
+                  </pic:spPr>
+                </pic:pic>
+              </a:graphicData>
+            </a:graphic>
+          </wp:inline>
+        </w:drawing>
+      </w:r>
+    </w:p>
+    <w:p>
+      <w:pPr>
+        <w:keepLines/>
+        <w:spacing w:after="200"/>
+      </w:pPr>
+      <w:r>
+        <w:t>Figure 75. High traffic: Fog/Cloud 0.539 ms (n=30); Mist + Fog 0.630 ms (n=8). Error bars show 95% confidence intervals.</w:t>
+      </w:r>
+    </w:p>
+    <w:p>
+      <w:pPr>
+        <w:pStyle w:val="Heading2"/>
+      </w:pPr>
+      <w:r>
+        <w:t>Short notice red signal validation</w:t>
+      </w:r>
+    </w:p>
+    <w:p>
+      <w:pPr>
+        <w:keepNext/>
+      </w:pPr>
+      <w:r>
+        <w:t>Isolated red-signal scenarios use two matched seeds per density. Priority is deliberately requested late, within 10 metres or half a second. These stress tests are separate from the main comparison.</w:t>
+      </w:r>
+    </w:p>
+    <w:p>
+      <w:pPr>
+        <w:keepNext/>
+        <w:jc w:val="center"/>
+      </w:pPr>
+      <w:r>
+        <w:drawing>
+          <wp:inline xmlns:a="http://schemas.openxmlformats.org/drawingml/2006/main" xmlns:pic="http://schemas.openxmlformats.org/drawingml/2006/picture">
+            <wp:extent cx="5577840" cy="3053133"/>
+            <wp:docPr id="76" name="Picture 76" descr="Short notice red signal validation. Low traffic: Fog/Cloud 10.500 s (n=2); Mist + Fog 11.500 s (n=2); No preemption 111.750 s (n=2). Error bars show 95% confidence intervals."/>
+            <wp:cNvGraphicFramePr>
+              <a:graphicFrameLocks noChangeAspect="1"/>
+            </wp:cNvGraphicFramePr>
+            <a:graphic>
+              <a:graphicData uri="http://schemas.openxmlformats.org/drawingml/2006/picture">
+                <pic:pic>
+                  <pic:nvPicPr>
+                    <pic:cNvPr id="0" name="red_signal_wait_s-low.png"/>
+                    <pic:cNvPicPr/>
+                  </pic:nvPicPr>
+                  <pic:blipFill>
+                    <a:blip r:embed="rId84"/>
+                    <a:stretch>
+                      <a:fillRect/>
+                    </a:stretch>
+                  </pic:blipFill>
+                  <pic:spPr>
+                    <a:xfrm>
+                      <a:off x="0" y="0"/>
+                      <a:ext cx="5577840" cy="3053133"/>
+                    </a:xfrm>
+                    <a:prstGeom prst="rect"/>
+                  </pic:spPr>
+                </pic:pic>
+              </a:graphicData>
+            </a:graphic>
+          </wp:inline>
+        </w:drawing>
+      </w:r>
+    </w:p>
+    <w:p>
+      <w:pPr>
+        <w:keepLines/>
+        <w:spacing w:after="200"/>
+      </w:pPr>
+      <w:r>
+        <w:t>Figure 76. Low traffic: Fog/Cloud 10.500 s (n=2); Mist + Fog 11.500 s (n=2); No preemption 111.750 s (n=2). Error bars show 95% confidence intervals.</w:t>
+      </w:r>
+    </w:p>
+    <w:p>
+      <w:pPr>
+        <w:keepNext/>
+        <w:jc w:val="center"/>
+      </w:pPr>
+      <w:r>
+        <w:drawing>
+          <wp:inline xmlns:a="http://schemas.openxmlformats.org/drawingml/2006/main" xmlns:pic="http://schemas.openxmlformats.org/drawingml/2006/picture">
+            <wp:extent cx="5577840" cy="3053133"/>
+            <wp:docPr id="77" name="Picture 77" descr="Short notice red signal validation. Medium traffic: Fog/Cloud 12.000 s (n=2); Mist + Fog 12.750 s (n=2); No preemption 110.500 s (n=2). Error bars show 95% confidence intervals."/>
+            <wp:cNvGraphicFramePr>
+              <a:graphicFrameLocks noChangeAspect="1"/>
+            </wp:cNvGraphicFramePr>
+            <a:graphic>
+              <a:graphicData uri="http://schemas.openxmlformats.org/drawingml/2006/picture">
+                <pic:pic>
+                  <pic:nvPicPr>
+                    <pic:cNvPr id="0" name="red_signal_wait_s-medium.png"/>
+                    <pic:cNvPicPr/>
+                  </pic:nvPicPr>
+                  <pic:blipFill>
+                    <a:blip r:embed="rId85"/>
+                    <a:stretch>
+                      <a:fillRect/>
+                    </a:stretch>
+                  </pic:blipFill>
+                  <pic:spPr>
+                    <a:xfrm>
+                      <a:off x="0" y="0"/>
+                      <a:ext cx="5577840" cy="3053133"/>
+                    </a:xfrm>
+                    <a:prstGeom prst="rect"/>
+                  </pic:spPr>
+                </pic:pic>
+              </a:graphicData>
+            </a:graphic>
+          </wp:inline>
+        </w:drawing>
+      </w:r>
+    </w:p>
+    <w:p>
+      <w:pPr>
+        <w:keepLines/>
+        <w:spacing w:after="200"/>
+      </w:pPr>
+      <w:r>
+        <w:t>Figure 77. Medium traffic: Fog/Cloud 12.000 s (n=2); Mist + Fog 12.750 s (n=2); No preemption 110.500 s (n=2). Error bars show 95% confidence intervals.</w:t>
+      </w:r>
+    </w:p>
+    <w:p>
+      <w:pPr>
+        <w:keepNext/>
+        <w:jc w:val="center"/>
+      </w:pPr>
+      <w:r>
+        <w:drawing>
+          <wp:inline xmlns:a="http://schemas.openxmlformats.org/drawingml/2006/main" xmlns:pic="http://schemas.openxmlformats.org/drawingml/2006/picture">
+            <wp:extent cx="5577840" cy="3053133"/>
+            <wp:docPr id="78" name="Picture 78" descr="Short notice red signal validation. High traffic: Fog/Cloud 5.000 s (n=2); Mist + Fog 6.250 s (n=2); No preemption 97.250 s (n=2). Error bars show 95% confidence intervals."/>
+            <wp:cNvGraphicFramePr>
+              <a:graphicFrameLocks noChangeAspect="1"/>
+            </wp:cNvGraphicFramePr>
+            <a:graphic>
+              <a:graphicData uri="http://schemas.openxmlformats.org/drawingml/2006/picture">
+                <pic:pic>
+                  <pic:nvPicPr>
+                    <pic:cNvPr id="0" name="red_signal_wait_s-high.png"/>
+                    <pic:cNvPicPr/>
+                  </pic:nvPicPr>
+                  <pic:blipFill>
+                    <a:blip r:embed="rId86"/>
+                    <a:stretch>
+                      <a:fillRect/>
+                    </a:stretch>
+                  </pic:blipFill>
+                  <pic:spPr>
+                    <a:xfrm>
+                      <a:off x="0" y="0"/>
+                      <a:ext cx="5577840" cy="3053133"/>
+                    </a:xfrm>
+                    <a:prstGeom prst="rect"/>
+                  </pic:spPr>
+                </pic:pic>
+              </a:graphicData>
+            </a:graphic>
+          </wp:inline>
+        </w:drawing>
+      </w:r>
+    </w:p>
+    <w:p>
+      <w:pPr>
+        <w:keepLines/>
+        <w:spacing w:after="200"/>
+      </w:pPr>
+      <w:r>
+        <w:t>Figure 78. High traffic: Fog/Cloud 5.000 s (n=2); Mist + Fog 6.250 s (n=2); No preemption 97.250 s (n=2). Error bars show 95% confidence intervals.</w:t>
       </w:r>
     </w:p>
     <w:p>

</xml_diff>